<commit_message>
fix spelling and formatting
</commit_message>
<xml_diff>
--- a/medicalcoder-manuscript.docx
+++ b/medicalcoder-manuscript.docx
@@ -1130,7 +1130,7 @@
         <w:t xml:space="preserve"> </w:t>
       </w:r>
       <w:r>
-        <w:t xml:space="preserve">Web (ICD-9 based as denotd in</w:t>
+        <w:t xml:space="preserve">Web (ICD-9 based as denoted in</w:t>
       </w:r>
       <w:r>
         <w:t xml:space="preserve"> </w:t>
@@ -1762,18 +1762,60 @@
         <w:rPr>
           <w:rStyle w:val="NormalTok"/>
         </w:rPr>
+        <w:t xml:space="preserve"> </w:t>
+      </w:r>
+      <w:r>
+        <w:rPr>
+          <w:rStyle w:val="CommentTok"/>
+        </w:rPr>
+        <w:t xml:space="preserve"># Optional inputs controlling grouping and code attributes:</w:t>
+      </w:r>
+      <w:r>
+        <w:br/>
+      </w:r>
+      <w:r>
+        <w:rPr>
+          <w:rStyle w:val="NormalTok"/>
+        </w:rPr>
         <w:t xml:space="preserve">  </w:t>
       </w:r>
       <w:r>
         <w:rPr>
+          <w:rStyle w:val="AttributeTok"/>
+        </w:rPr>
+        <w:t xml:space="preserve">id.vars   =</w:t>
+      </w:r>
+      <w:r>
+        <w:rPr>
+          <w:rStyle w:val="NormalTok"/>
+        </w:rPr>
+        <w:t xml:space="preserve"> </w:t>
+      </w:r>
+      <w:r>
+        <w:rPr>
+          <w:rStyle w:val="ConstantTok"/>
+        </w:rPr>
+        <w:t xml:space="preserve">NULL</w:t>
+      </w:r>
+      <w:r>
+        <w:rPr>
+          <w:rStyle w:val="NormalTok"/>
+        </w:rPr>
+        <w:t xml:space="preserve">,  </w:t>
+      </w:r>
+      <w:r>
+        <w:rPr>
           <w:rStyle w:val="CommentTok"/>
         </w:rPr>
-        <w:t xml:space="preserve"># Optional inputs controlling grouping and code attributes:</w:t>
+        <w:t xml:space="preserve"># character; encounter identifiers (see text below)</w:t>
       </w:r>
       <w:r>
         <w:br/>
       </w:r>
       <w:r>
+        <w:br/>
+      </w:r>
+      <w:r>
         <w:rPr>
           <w:rStyle w:val="NormalTok"/>
         </w:rPr>
@@ -1783,7 +1825,7 @@
         <w:rPr>
           <w:rStyle w:val="AttributeTok"/>
         </w:rPr>
-        <w:t xml:space="preserve">id.vars   =</w:t>
+        <w:t xml:space="preserve">icdv.var  =</w:t>
       </w:r>
       <w:r>
         <w:rPr>
@@ -1807,15 +1849,54 @@
         <w:rPr>
           <w:rStyle w:val="CommentTok"/>
         </w:rPr>
-        <w:t xml:space="preserve"># character; encounter identifiers (see text below)</w:t>
+        <w:t xml:space="preserve"># character; column name for ICD version (9 or 10)</w:t>
       </w:r>
       <w:r>
         <w:br/>
       </w:r>
       <w:r>
+        <w:rPr>
+          <w:rStyle w:val="NormalTok"/>
+        </w:rPr>
+        <w:t xml:space="preserve">  </w:t>
+      </w:r>
+      <w:r>
+        <w:rPr>
+          <w:rStyle w:val="AttributeTok"/>
+        </w:rPr>
+        <w:t xml:space="preserve">icdv      =</w:t>
+      </w:r>
+      <w:r>
+        <w:rPr>
+          <w:rStyle w:val="NormalTok"/>
+        </w:rPr>
+        <w:t xml:space="preserve"> </w:t>
+      </w:r>
+      <w:r>
+        <w:rPr>
+          <w:rStyle w:val="ConstantTok"/>
+        </w:rPr>
+        <w:t xml:space="preserve">NULL</w:t>
+      </w:r>
+      <w:r>
+        <w:rPr>
+          <w:rStyle w:val="NormalTok"/>
+        </w:rPr>
+        <w:t xml:space="preserve">,  </w:t>
+      </w:r>
+      <w:r>
+        <w:rPr>
+          <w:rStyle w:val="CommentTok"/>
+        </w:rPr>
+        <w:t xml:space="preserve"># integer; constant ICD version for all rows</w:t>
+      </w:r>
+      <w:r>
         <w:br/>
       </w:r>
       <w:r>
+        <w:br/>
+      </w:r>
+      <w:r>
         <w:rPr>
           <w:rStyle w:val="NormalTok"/>
         </w:rPr>
@@ -1825,7 +1906,7 @@
         <w:rPr>
           <w:rStyle w:val="AttributeTok"/>
         </w:rPr>
-        <w:t xml:space="preserve">icdv.var  =</w:t>
+        <w:t xml:space="preserve">dx.var    =</w:t>
       </w:r>
       <w:r>
         <w:rPr>
@@ -1849,7 +1930,7 @@
         <w:rPr>
           <w:rStyle w:val="CommentTok"/>
         </w:rPr>
-        <w:t xml:space="preserve"># character; column name for ICD version (9 or 10)</w:t>
+        <w:t xml:space="preserve"># character; column name indicating</w:t>
       </w:r>
       <w:r>
         <w:br/>
@@ -1858,13 +1939,28 @@
         <w:rPr>
           <w:rStyle w:val="NormalTok"/>
         </w:rPr>
+        <w:t xml:space="preserve">                     </w:t>
+      </w:r>
+      <w:r>
+        <w:rPr>
+          <w:rStyle w:val="CommentTok"/>
+        </w:rPr>
+        <w:t xml:space="preserve">#   diagnosis (1) or procedure (0)</w:t>
+      </w:r>
+      <w:r>
+        <w:br/>
+      </w:r>
+      <w:r>
+        <w:rPr>
+          <w:rStyle w:val="NormalTok"/>
+        </w:rPr>
         <w:t xml:space="preserve">  </w:t>
       </w:r>
       <w:r>
         <w:rPr>
           <w:rStyle w:val="AttributeTok"/>
         </w:rPr>
-        <w:t xml:space="preserve">icdv      =</w:t>
+        <w:t xml:space="preserve">dx        =</w:t>
       </w:r>
       <w:r>
         <w:rPr>
@@ -1888,7 +1984,7 @@
         <w:rPr>
           <w:rStyle w:val="CommentTok"/>
         </w:rPr>
-        <w:t xml:space="preserve"># integer; constant ICD version for all rows</w:t>
+        <w:t xml:space="preserve"># integer; constant dx indicator for all rows</w:t>
       </w:r>
       <w:r>
         <w:br/>
@@ -1906,7 +2002,7 @@
         <w:rPr>
           <w:rStyle w:val="AttributeTok"/>
         </w:rPr>
-        <w:t xml:space="preserve">dx.var    =</w:t>
+        <w:t xml:space="preserve">poa.var   =</w:t>
       </w:r>
       <w:r>
         <w:rPr>
@@ -1930,7 +2026,7 @@
         <w:rPr>
           <w:rStyle w:val="CommentTok"/>
         </w:rPr>
-        <w:t xml:space="preserve"># character; column name indicating</w:t>
+        <w:t xml:space="preserve"># character; column name for present-on-admission indicator</w:t>
       </w:r>
       <w:r>
         <w:br/>
@@ -1939,18 +2035,45 @@
         <w:rPr>
           <w:rStyle w:val="NormalTok"/>
         </w:rPr>
-        <w:t xml:space="preserve">                     </w:t>
+        <w:t xml:space="preserve">  </w:t>
+      </w:r>
+      <w:r>
+        <w:rPr>
+          <w:rStyle w:val="AttributeTok"/>
+        </w:rPr>
+        <w:t xml:space="preserve">poa       =</w:t>
+      </w:r>
+      <w:r>
+        <w:rPr>
+          <w:rStyle w:val="NormalTok"/>
+        </w:rPr>
+        <w:t xml:space="preserve"> </w:t>
+      </w:r>
+      <w:r>
+        <w:rPr>
+          <w:rStyle w:val="ConstantTok"/>
+        </w:rPr>
+        <w:t xml:space="preserve">NULL</w:t>
+      </w:r>
+      <w:r>
+        <w:rPr>
+          <w:rStyle w:val="NormalTok"/>
+        </w:rPr>
+        <w:t xml:space="preserve">,  </w:t>
       </w:r>
       <w:r>
         <w:rPr>
           <w:rStyle w:val="CommentTok"/>
         </w:rPr>
-        <w:t xml:space="preserve">#   diagnosis (1) or procedure (0)</w:t>
+        <w:t xml:space="preserve"># integer; constant POA indicator for all rows</w:t>
       </w:r>
       <w:r>
         <w:br/>
       </w:r>
       <w:r>
+        <w:br/>
+      </w:r>
+      <w:r>
         <w:rPr>
           <w:rStyle w:val="NormalTok"/>
         </w:rPr>
@@ -1960,7 +2083,7 @@
         <w:rPr>
           <w:rStyle w:val="AttributeTok"/>
         </w:rPr>
-        <w:t xml:space="preserve">dx        =</w:t>
+        <w:t xml:space="preserve">age.var   =</w:t>
       </w:r>
       <w:r>
         <w:rPr>
@@ -1984,7 +2107,7 @@
         <w:rPr>
           <w:rStyle w:val="CommentTok"/>
         </w:rPr>
-        <w:t xml:space="preserve"># integer; constant dx indicator for all rows</w:t>
+        <w:t xml:space="preserve"># character; column name for age in years (Charlson only)</w:t>
       </w:r>
       <w:r>
         <w:br/>
@@ -2002,7 +2125,7 @@
         <w:rPr>
           <w:rStyle w:val="AttributeTok"/>
         </w:rPr>
-        <w:t xml:space="preserve">poa.var   =</w:t>
+        <w:t xml:space="preserve">primarydx.var =</w:t>
       </w:r>
       <w:r>
         <w:rPr>
@@ -2020,13 +2143,13 @@
         <w:rPr>
           <w:rStyle w:val="NormalTok"/>
         </w:rPr>
-        <w:t xml:space="preserve">,  </w:t>
+        <w:t xml:space="preserve">, </w:t>
       </w:r>
       <w:r>
         <w:rPr>
           <w:rStyle w:val="CommentTok"/>
         </w:rPr>
-        <w:t xml:space="preserve"># character; column name for present-on-admission indicator</w:t>
+        <w:t xml:space="preserve"># character; column name indicating primary diagnosis</w:t>
       </w:r>
       <w:r>
         <w:br/>
@@ -2041,7 +2164,7 @@
         <w:rPr>
           <w:rStyle w:val="AttributeTok"/>
         </w:rPr>
-        <w:t xml:space="preserve">poa       =</w:t>
+        <w:t xml:space="preserve">primarydx     =</w:t>
       </w:r>
       <w:r>
         <w:rPr>
@@ -2059,13 +2182,13 @@
         <w:rPr>
           <w:rStyle w:val="NormalTok"/>
         </w:rPr>
-        <w:t xml:space="preserve">,  </w:t>
+        <w:t xml:space="preserve">, </w:t>
       </w:r>
       <w:r>
         <w:rPr>
           <w:rStyle w:val="CommentTok"/>
         </w:rPr>
-        <w:t xml:space="preserve"># integer; constant POA indicator for all rows</w:t>
+        <w:t xml:space="preserve"># integer; constant primary dx indicator</w:t>
       </w:r>
       <w:r>
         <w:br/>
@@ -2077,130 +2200,7 @@
         <w:rPr>
           <w:rStyle w:val="NormalTok"/>
         </w:rPr>
-        <w:t xml:space="preserve">  </w:t>
-      </w:r>
-      <w:r>
-        <w:rPr>
-          <w:rStyle w:val="AttributeTok"/>
-        </w:rPr>
-        <w:t xml:space="preserve">age.var   =</w:t>
-      </w:r>
-      <w:r>
-        <w:rPr>
-          <w:rStyle w:val="NormalTok"/>
-        </w:rPr>
-        <w:t xml:space="preserve"> </w:t>
-      </w:r>
-      <w:r>
-        <w:rPr>
-          <w:rStyle w:val="ConstantTok"/>
-        </w:rPr>
-        <w:t xml:space="preserve">NULL</w:t>
-      </w:r>
-      <w:r>
-        <w:rPr>
-          <w:rStyle w:val="NormalTok"/>
-        </w:rPr>
-        <w:t xml:space="preserve">,  </w:t>
-      </w:r>
-      <w:r>
-        <w:rPr>
-          <w:rStyle w:val="CommentTok"/>
-        </w:rPr>
-        <w:t xml:space="preserve"># character; column name for age in years (Charlson only)</w:t>
-      </w:r>
-      <w:r>
-        <w:br/>
-      </w:r>
-      <w:r>
-        <w:br/>
-      </w:r>
-      <w:r>
-        <w:rPr>
-          <w:rStyle w:val="NormalTok"/>
-        </w:rPr>
-        <w:t xml:space="preserve">  </w:t>
-      </w:r>
-      <w:r>
-        <w:rPr>
-          <w:rStyle w:val="AttributeTok"/>
-        </w:rPr>
-        <w:t xml:space="preserve">primarydx.var =</w:t>
-      </w:r>
-      <w:r>
-        <w:rPr>
-          <w:rStyle w:val="NormalTok"/>
-        </w:rPr>
-        <w:t xml:space="preserve"> </w:t>
-      </w:r>
-      <w:r>
-        <w:rPr>
-          <w:rStyle w:val="ConstantTok"/>
-        </w:rPr>
-        <w:t xml:space="preserve">NULL</w:t>
-      </w:r>
-      <w:r>
-        <w:rPr>
-          <w:rStyle w:val="NormalTok"/>
-        </w:rPr>
-        <w:t xml:space="preserve">, </w:t>
-      </w:r>
-      <w:r>
-        <w:rPr>
-          <w:rStyle w:val="CommentTok"/>
-        </w:rPr>
-        <w:t xml:space="preserve"># character; column name indicating primary diagnosis</w:t>
-      </w:r>
-      <w:r>
-        <w:br/>
-      </w:r>
-      <w:r>
-        <w:rPr>
-          <w:rStyle w:val="NormalTok"/>
-        </w:rPr>
-        <w:t xml:space="preserve">  </w:t>
-      </w:r>
-      <w:r>
-        <w:rPr>
-          <w:rStyle w:val="AttributeTok"/>
-        </w:rPr>
-        <w:t xml:space="preserve">primarydx     =</w:t>
-      </w:r>
-      <w:r>
-        <w:rPr>
-          <w:rStyle w:val="NormalTok"/>
-        </w:rPr>
-        <w:t xml:space="preserve"> </w:t>
-      </w:r>
-      <w:r>
-        <w:rPr>
-          <w:rStyle w:val="ConstantTok"/>
-        </w:rPr>
-        <w:t xml:space="preserve">NULL</w:t>
-      </w:r>
-      <w:r>
-        <w:rPr>
-          <w:rStyle w:val="NormalTok"/>
-        </w:rPr>
-        <w:t xml:space="preserve">, </w:t>
-      </w:r>
-      <w:r>
-        <w:rPr>
-          <w:rStyle w:val="CommentTok"/>
-        </w:rPr>
-        <w:t xml:space="preserve"># integer; constant primary dx indicator</w:t>
-      </w:r>
-      <w:r>
-        <w:br/>
-      </w:r>
-      <w:r>
-        <w:br/>
-      </w:r>
-      <w:r>
-        <w:rPr>
-          <w:rStyle w:val="NormalTok"/>
-        </w:rPr>
-        <w:t xml:space="preserve">  </w:t>
+        <w:t xml:space="preserve"> </w:t>
       </w:r>
       <w:r>
         <w:rPr>

</xml_diff>

<commit_message>
Move code snippet to a figure; add refactor where figures are made; extend captions and alt text
</commit_message>
<xml_diff>
--- a/medicalcoder-manuscript.docx
+++ b/medicalcoder-manuscript.docx
@@ -1589,7 +1589,7 @@
         <w:t xml:space="preserve">medicalcoder</w:t>
       </w:r>
       <w:r>
-        <w:t xml:space="preserve">. The input data are expected</w:t>
+        <w:t xml:space="preserve">, see Figure 1. The input data are expected</w:t>
       </w:r>
       <w:r>
         <w:t xml:space="preserve"> </w:t>
@@ -1630,798 +1630,7 @@
     </w:p>
     <w:p>
       <w:pPr>
-        <w:pStyle w:val="SourceCode"/>
-      </w:pPr>
-      <w:r>
-        <w:rPr>
-          <w:rStyle w:val="NormalTok"/>
-        </w:rPr>
-        <w:t xml:space="preserve">medicalcoder</w:t>
-      </w:r>
-      <w:r>
-        <w:rPr>
-          <w:rStyle w:val="SpecialCharTok"/>
-        </w:rPr>
-        <w:t xml:space="preserve">::</w:t>
-      </w:r>
-      <w:r>
-        <w:rPr>
-          <w:rStyle w:val="FunctionTok"/>
-        </w:rPr>
-        <w:t xml:space="preserve">comorbidities</w:t>
-      </w:r>
-      <w:r>
-        <w:rPr>
-          <w:rStyle w:val="NormalTok"/>
-        </w:rPr>
-        <w:t xml:space="preserve">(</w:t>
-      </w:r>
-      <w:r>
-        <w:br/>
-      </w:r>
-      <w:r>
-        <w:rPr>
-          <w:rStyle w:val="NormalTok"/>
-        </w:rPr>
-        <w:t xml:space="preserve"> </w:t>
-      </w:r>
-      <w:r>
-        <w:rPr>
-          <w:rStyle w:val="CommentTok"/>
-        </w:rPr>
-        <w:t xml:space="preserve"># Required inputs:</w:t>
-      </w:r>
-      <w:r>
-        <w:br/>
-      </w:r>
-      <w:r>
-        <w:rPr>
-          <w:rStyle w:val="NormalTok"/>
-        </w:rPr>
-        <w:t xml:space="preserve">  </w:t>
-      </w:r>
-      <w:r>
-        <w:rPr>
-          <w:rStyle w:val="AttributeTok"/>
-        </w:rPr>
-        <w:t xml:space="preserve">data      =</w:t>
-      </w:r>
-      <w:r>
-        <w:rPr>
-          <w:rStyle w:val="NormalTok"/>
-        </w:rPr>
-        <w:t xml:space="preserve"> ,   </w:t>
-      </w:r>
-      <w:r>
-        <w:rPr>
-          <w:rStyle w:val="CommentTok"/>
-        </w:rPr>
-        <w:t xml:space="preserve"># object inheriting data.frame; one ICD code per row</w:t>
-      </w:r>
-      <w:r>
-        <w:br/>
-      </w:r>
-      <w:r>
-        <w:rPr>
-          <w:rStyle w:val="NormalTok"/>
-        </w:rPr>
-        <w:t xml:space="preserve">  </w:t>
-      </w:r>
-      <w:r>
-        <w:rPr>
-          <w:rStyle w:val="AttributeTok"/>
-        </w:rPr>
-        <w:t xml:space="preserve">icd.codes =</w:t>
-      </w:r>
-      <w:r>
-        <w:rPr>
-          <w:rStyle w:val="NormalTok"/>
-        </w:rPr>
-        <w:t xml:space="preserve"> ,   </w:t>
-      </w:r>
-      <w:r>
-        <w:rPr>
-          <w:rStyle w:val="CommentTok"/>
-        </w:rPr>
-        <w:t xml:space="preserve"># character; name of column in data containing ICD codes</w:t>
-      </w:r>
-      <w:r>
-        <w:br/>
-      </w:r>
-      <w:r>
-        <w:rPr>
-          <w:rStyle w:val="NormalTok"/>
-        </w:rPr>
-        <w:t xml:space="preserve">  </w:t>
-      </w:r>
-      <w:r>
-        <w:rPr>
-          <w:rStyle w:val="AttributeTok"/>
-        </w:rPr>
-        <w:t xml:space="preserve">method    =</w:t>
-      </w:r>
-      <w:r>
-        <w:rPr>
-          <w:rStyle w:val="NormalTok"/>
-        </w:rPr>
-        <w:t xml:space="preserve"> ,   </w:t>
-      </w:r>
-      <w:r>
-        <w:rPr>
-          <w:rStyle w:val="CommentTok"/>
-        </w:rPr>
-        <w:t xml:space="preserve"># &lt;family&gt;_&lt;variant&gt;, e.g., "charlson_quan2005"</w:t>
-      </w:r>
-      <w:r>
-        <w:br/>
-      </w:r>
-      <w:r>
-        <w:br/>
-      </w:r>
-      <w:r>
-        <w:rPr>
-          <w:rStyle w:val="NormalTok"/>
-        </w:rPr>
-        <w:t xml:space="preserve"> </w:t>
-      </w:r>
-      <w:r>
-        <w:rPr>
-          <w:rStyle w:val="CommentTok"/>
-        </w:rPr>
-        <w:t xml:space="preserve"># Optional inputs controlling grouping and code attributes:</w:t>
-      </w:r>
-      <w:r>
-        <w:br/>
-      </w:r>
-      <w:r>
-        <w:rPr>
-          <w:rStyle w:val="NormalTok"/>
-        </w:rPr>
-        <w:t xml:space="preserve">  </w:t>
-      </w:r>
-      <w:r>
-        <w:rPr>
-          <w:rStyle w:val="AttributeTok"/>
-        </w:rPr>
-        <w:t xml:space="preserve">id.vars   =</w:t>
-      </w:r>
-      <w:r>
-        <w:rPr>
-          <w:rStyle w:val="NormalTok"/>
-        </w:rPr>
-        <w:t xml:space="preserve"> </w:t>
-      </w:r>
-      <w:r>
-        <w:rPr>
-          <w:rStyle w:val="ConstantTok"/>
-        </w:rPr>
-        <w:t xml:space="preserve">NULL</w:t>
-      </w:r>
-      <w:r>
-        <w:rPr>
-          <w:rStyle w:val="NormalTok"/>
-        </w:rPr>
-        <w:t xml:space="preserve">,  </w:t>
-      </w:r>
-      <w:r>
-        <w:rPr>
-          <w:rStyle w:val="CommentTok"/>
-        </w:rPr>
-        <w:t xml:space="preserve"># character; encounter identifiers (see text below)</w:t>
-      </w:r>
-      <w:r>
-        <w:br/>
-      </w:r>
-      <w:r>
-        <w:br/>
-      </w:r>
-      <w:r>
-        <w:rPr>
-          <w:rStyle w:val="NormalTok"/>
-        </w:rPr>
-        <w:t xml:space="preserve">  </w:t>
-      </w:r>
-      <w:r>
-        <w:rPr>
-          <w:rStyle w:val="AttributeTok"/>
-        </w:rPr>
-        <w:t xml:space="preserve">icdv.var  =</w:t>
-      </w:r>
-      <w:r>
-        <w:rPr>
-          <w:rStyle w:val="NormalTok"/>
-        </w:rPr>
-        <w:t xml:space="preserve"> </w:t>
-      </w:r>
-      <w:r>
-        <w:rPr>
-          <w:rStyle w:val="ConstantTok"/>
-        </w:rPr>
-        <w:t xml:space="preserve">NULL</w:t>
-      </w:r>
-      <w:r>
-        <w:rPr>
-          <w:rStyle w:val="NormalTok"/>
-        </w:rPr>
-        <w:t xml:space="preserve">,  </w:t>
-      </w:r>
-      <w:r>
-        <w:rPr>
-          <w:rStyle w:val="CommentTok"/>
-        </w:rPr>
-        <w:t xml:space="preserve"># character; column name for ICD version (9 or 10)</w:t>
-      </w:r>
-      <w:r>
-        <w:br/>
-      </w:r>
-      <w:r>
-        <w:rPr>
-          <w:rStyle w:val="NormalTok"/>
-        </w:rPr>
-        <w:t xml:space="preserve">  </w:t>
-      </w:r>
-      <w:r>
-        <w:rPr>
-          <w:rStyle w:val="AttributeTok"/>
-        </w:rPr>
-        <w:t xml:space="preserve">icdv      =</w:t>
-      </w:r>
-      <w:r>
-        <w:rPr>
-          <w:rStyle w:val="NormalTok"/>
-        </w:rPr>
-        <w:t xml:space="preserve"> </w:t>
-      </w:r>
-      <w:r>
-        <w:rPr>
-          <w:rStyle w:val="ConstantTok"/>
-        </w:rPr>
-        <w:t xml:space="preserve">NULL</w:t>
-      </w:r>
-      <w:r>
-        <w:rPr>
-          <w:rStyle w:val="NormalTok"/>
-        </w:rPr>
-        <w:t xml:space="preserve">,  </w:t>
-      </w:r>
-      <w:r>
-        <w:rPr>
-          <w:rStyle w:val="CommentTok"/>
-        </w:rPr>
-        <w:t xml:space="preserve"># integer; constant ICD version for all rows</w:t>
-      </w:r>
-      <w:r>
-        <w:br/>
-      </w:r>
-      <w:r>
-        <w:br/>
-      </w:r>
-      <w:r>
-        <w:rPr>
-          <w:rStyle w:val="NormalTok"/>
-        </w:rPr>
-        <w:t xml:space="preserve">  </w:t>
-      </w:r>
-      <w:r>
-        <w:rPr>
-          <w:rStyle w:val="AttributeTok"/>
-        </w:rPr>
-        <w:t xml:space="preserve">dx.var    =</w:t>
-      </w:r>
-      <w:r>
-        <w:rPr>
-          <w:rStyle w:val="NormalTok"/>
-        </w:rPr>
-        <w:t xml:space="preserve"> </w:t>
-      </w:r>
-      <w:r>
-        <w:rPr>
-          <w:rStyle w:val="ConstantTok"/>
-        </w:rPr>
-        <w:t xml:space="preserve">NULL</w:t>
-      </w:r>
-      <w:r>
-        <w:rPr>
-          <w:rStyle w:val="NormalTok"/>
-        </w:rPr>
-        <w:t xml:space="preserve">,  </w:t>
-      </w:r>
-      <w:r>
-        <w:rPr>
-          <w:rStyle w:val="CommentTok"/>
-        </w:rPr>
-        <w:t xml:space="preserve"># character; column name indicating</w:t>
-      </w:r>
-      <w:r>
-        <w:br/>
-      </w:r>
-      <w:r>
-        <w:rPr>
-          <w:rStyle w:val="NormalTok"/>
-        </w:rPr>
-        <w:t xml:space="preserve">                     </w:t>
-      </w:r>
-      <w:r>
-        <w:rPr>
-          <w:rStyle w:val="CommentTok"/>
-        </w:rPr>
-        <w:t xml:space="preserve">#   diagnosis (1) or procedure (0)</w:t>
-      </w:r>
-      <w:r>
-        <w:br/>
-      </w:r>
-      <w:r>
-        <w:rPr>
-          <w:rStyle w:val="NormalTok"/>
-        </w:rPr>
-        <w:t xml:space="preserve">  </w:t>
-      </w:r>
-      <w:r>
-        <w:rPr>
-          <w:rStyle w:val="AttributeTok"/>
-        </w:rPr>
-        <w:t xml:space="preserve">dx        =</w:t>
-      </w:r>
-      <w:r>
-        <w:rPr>
-          <w:rStyle w:val="NormalTok"/>
-        </w:rPr>
-        <w:t xml:space="preserve"> </w:t>
-      </w:r>
-      <w:r>
-        <w:rPr>
-          <w:rStyle w:val="ConstantTok"/>
-        </w:rPr>
-        <w:t xml:space="preserve">NULL</w:t>
-      </w:r>
-      <w:r>
-        <w:rPr>
-          <w:rStyle w:val="NormalTok"/>
-        </w:rPr>
-        <w:t xml:space="preserve">,  </w:t>
-      </w:r>
-      <w:r>
-        <w:rPr>
-          <w:rStyle w:val="CommentTok"/>
-        </w:rPr>
-        <w:t xml:space="preserve"># integer; constant dx indicator for all rows</w:t>
-      </w:r>
-      <w:r>
-        <w:br/>
-      </w:r>
-      <w:r>
-        <w:br/>
-      </w:r>
-      <w:r>
-        <w:rPr>
-          <w:rStyle w:val="NormalTok"/>
-        </w:rPr>
-        <w:t xml:space="preserve">  </w:t>
-      </w:r>
-      <w:r>
-        <w:rPr>
-          <w:rStyle w:val="AttributeTok"/>
-        </w:rPr>
-        <w:t xml:space="preserve">poa.var   =</w:t>
-      </w:r>
-      <w:r>
-        <w:rPr>
-          <w:rStyle w:val="NormalTok"/>
-        </w:rPr>
-        <w:t xml:space="preserve"> </w:t>
-      </w:r>
-      <w:r>
-        <w:rPr>
-          <w:rStyle w:val="ConstantTok"/>
-        </w:rPr>
-        <w:t xml:space="preserve">NULL</w:t>
-      </w:r>
-      <w:r>
-        <w:rPr>
-          <w:rStyle w:val="NormalTok"/>
-        </w:rPr>
-        <w:t xml:space="preserve">,  </w:t>
-      </w:r>
-      <w:r>
-        <w:rPr>
-          <w:rStyle w:val="CommentTok"/>
-        </w:rPr>
-        <w:t xml:space="preserve"># character; column name for present-on-admission indicator</w:t>
-      </w:r>
-      <w:r>
-        <w:br/>
-      </w:r>
-      <w:r>
-        <w:rPr>
-          <w:rStyle w:val="NormalTok"/>
-        </w:rPr>
-        <w:t xml:space="preserve">  </w:t>
-      </w:r>
-      <w:r>
-        <w:rPr>
-          <w:rStyle w:val="AttributeTok"/>
-        </w:rPr>
-        <w:t xml:space="preserve">poa       =</w:t>
-      </w:r>
-      <w:r>
-        <w:rPr>
-          <w:rStyle w:val="NormalTok"/>
-        </w:rPr>
-        <w:t xml:space="preserve"> </w:t>
-      </w:r>
-      <w:r>
-        <w:rPr>
-          <w:rStyle w:val="ConstantTok"/>
-        </w:rPr>
-        <w:t xml:space="preserve">NULL</w:t>
-      </w:r>
-      <w:r>
-        <w:rPr>
-          <w:rStyle w:val="NormalTok"/>
-        </w:rPr>
-        <w:t xml:space="preserve">,  </w:t>
-      </w:r>
-      <w:r>
-        <w:rPr>
-          <w:rStyle w:val="CommentTok"/>
-        </w:rPr>
-        <w:t xml:space="preserve"># integer; constant POA indicator for all rows</w:t>
-      </w:r>
-      <w:r>
-        <w:br/>
-      </w:r>
-      <w:r>
-        <w:br/>
-      </w:r>
-      <w:r>
-        <w:rPr>
-          <w:rStyle w:val="NormalTok"/>
-        </w:rPr>
-        <w:t xml:space="preserve">  </w:t>
-      </w:r>
-      <w:r>
-        <w:rPr>
-          <w:rStyle w:val="AttributeTok"/>
-        </w:rPr>
-        <w:t xml:space="preserve">age.var   =</w:t>
-      </w:r>
-      <w:r>
-        <w:rPr>
-          <w:rStyle w:val="NormalTok"/>
-        </w:rPr>
-        <w:t xml:space="preserve"> </w:t>
-      </w:r>
-      <w:r>
-        <w:rPr>
-          <w:rStyle w:val="ConstantTok"/>
-        </w:rPr>
-        <w:t xml:space="preserve">NULL</w:t>
-      </w:r>
-      <w:r>
-        <w:rPr>
-          <w:rStyle w:val="NormalTok"/>
-        </w:rPr>
-        <w:t xml:space="preserve">,  </w:t>
-      </w:r>
-      <w:r>
-        <w:rPr>
-          <w:rStyle w:val="CommentTok"/>
-        </w:rPr>
-        <w:t xml:space="preserve"># character; column name for age in years (Charlson only)</w:t>
-      </w:r>
-      <w:r>
-        <w:br/>
-      </w:r>
-      <w:r>
-        <w:br/>
-      </w:r>
-      <w:r>
-        <w:rPr>
-          <w:rStyle w:val="NormalTok"/>
-        </w:rPr>
-        <w:t xml:space="preserve">  </w:t>
-      </w:r>
-      <w:r>
-        <w:rPr>
-          <w:rStyle w:val="AttributeTok"/>
-        </w:rPr>
-        <w:t xml:space="preserve">primarydx.var =</w:t>
-      </w:r>
-      <w:r>
-        <w:rPr>
-          <w:rStyle w:val="NormalTok"/>
-        </w:rPr>
-        <w:t xml:space="preserve"> </w:t>
-      </w:r>
-      <w:r>
-        <w:rPr>
-          <w:rStyle w:val="ConstantTok"/>
-        </w:rPr>
-        <w:t xml:space="preserve">NULL</w:t>
-      </w:r>
-      <w:r>
-        <w:rPr>
-          <w:rStyle w:val="NormalTok"/>
-        </w:rPr>
-        <w:t xml:space="preserve">, </w:t>
-      </w:r>
-      <w:r>
-        <w:rPr>
-          <w:rStyle w:val="CommentTok"/>
-        </w:rPr>
-        <w:t xml:space="preserve"># character; column name indicating primary diagnosis</w:t>
-      </w:r>
-      <w:r>
-        <w:br/>
-      </w:r>
-      <w:r>
-        <w:rPr>
-          <w:rStyle w:val="NormalTok"/>
-        </w:rPr>
-        <w:t xml:space="preserve">  </w:t>
-      </w:r>
-      <w:r>
-        <w:rPr>
-          <w:rStyle w:val="AttributeTok"/>
-        </w:rPr>
-        <w:t xml:space="preserve">primarydx     =</w:t>
-      </w:r>
-      <w:r>
-        <w:rPr>
-          <w:rStyle w:val="NormalTok"/>
-        </w:rPr>
-        <w:t xml:space="preserve"> </w:t>
-      </w:r>
-      <w:r>
-        <w:rPr>
-          <w:rStyle w:val="ConstantTok"/>
-        </w:rPr>
-        <w:t xml:space="preserve">NULL</w:t>
-      </w:r>
-      <w:r>
-        <w:rPr>
-          <w:rStyle w:val="NormalTok"/>
-        </w:rPr>
-        <w:t xml:space="preserve">, </w:t>
-      </w:r>
-      <w:r>
-        <w:rPr>
-          <w:rStyle w:val="CommentTok"/>
-        </w:rPr>
-        <w:t xml:space="preserve"># integer; constant primary dx indicator</w:t>
-      </w:r>
-      <w:r>
-        <w:br/>
-      </w:r>
-      <w:r>
-        <w:br/>
-      </w:r>
-      <w:r>
-        <w:rPr>
-          <w:rStyle w:val="NormalTok"/>
-        </w:rPr>
-        <w:t xml:space="preserve"> </w:t>
-      </w:r>
-      <w:r>
-        <w:rPr>
-          <w:rStyle w:val="CommentTok"/>
-        </w:rPr>
-        <w:t xml:space="preserve"># Defaults:</w:t>
-      </w:r>
-      <w:r>
-        <w:br/>
-      </w:r>
-      <w:r>
-        <w:rPr>
-          <w:rStyle w:val="NormalTok"/>
-        </w:rPr>
-        <w:t xml:space="preserve">  </w:t>
-      </w:r>
-      <w:r>
-        <w:rPr>
-          <w:rStyle w:val="AttributeTok"/>
-        </w:rPr>
-        <w:t xml:space="preserve">flag.method   =</w:t>
-      </w:r>
-      <w:r>
-        <w:rPr>
-          <w:rStyle w:val="NormalTok"/>
-        </w:rPr>
-        <w:t xml:space="preserve"> </w:t>
-      </w:r>
-      <w:r>
-        <w:rPr>
-          <w:rStyle w:val="StringTok"/>
-        </w:rPr>
-        <w:t xml:space="preserve">"current"</w:t>
-      </w:r>
-      <w:r>
-        <w:rPr>
-          <w:rStyle w:val="NormalTok"/>
-        </w:rPr>
-        <w:t xml:space="preserve">, </w:t>
-      </w:r>
-      <w:r>
-        <w:rPr>
-          <w:rStyle w:val="CommentTok"/>
-        </w:rPr>
-        <w:t xml:space="preserve"># "current" (encounter-level) or</w:t>
-      </w:r>
-      <w:r>
-        <w:br/>
-      </w:r>
-      <w:r>
-        <w:rPr>
-          <w:rStyle w:val="NormalTok"/>
-        </w:rPr>
-        <w:t xml:space="preserve">                             </w:t>
-      </w:r>
-      <w:r>
-        <w:rPr>
-          <w:rStyle w:val="CommentTok"/>
-        </w:rPr>
-        <w:t xml:space="preserve"># "cumulative" (longitudinal)</w:t>
-      </w:r>
-      <w:r>
-        <w:br/>
-      </w:r>
-      <w:r>
-        <w:rPr>
-          <w:rStyle w:val="NormalTok"/>
-        </w:rPr>
-        <w:t xml:space="preserve">  </w:t>
-      </w:r>
-      <w:r>
-        <w:rPr>
-          <w:rStyle w:val="AttributeTok"/>
-        </w:rPr>
-        <w:t xml:space="preserve">full.codes    =</w:t>
-      </w:r>
-      <w:r>
-        <w:rPr>
-          <w:rStyle w:val="NormalTok"/>
-        </w:rPr>
-        <w:t xml:space="preserve"> </w:t>
-      </w:r>
-      <w:r>
-        <w:rPr>
-          <w:rStyle w:val="ConstantTok"/>
-        </w:rPr>
-        <w:t xml:space="preserve">TRUE</w:t>
-      </w:r>
-      <w:r>
-        <w:rPr>
-          <w:rStyle w:val="NormalTok"/>
-        </w:rPr>
-        <w:t xml:space="preserve">, </w:t>
-      </w:r>
-      <w:r>
-        <w:rPr>
-          <w:rStyle w:val="CommentTok"/>
-        </w:rPr>
-        <w:t xml:space="preserve"># reference data[[icd.codes]] against</w:t>
-      </w:r>
-      <w:r>
-        <w:br/>
-      </w:r>
-      <w:r>
-        <w:rPr>
-          <w:rStyle w:val="NormalTok"/>
-        </w:rPr>
-        <w:t xml:space="preserve">                        </w:t>
-      </w:r>
-      <w:r>
-        <w:rPr>
-          <w:rStyle w:val="CommentTok"/>
-        </w:rPr>
-        <w:t xml:space="preserve">#   full ICD codes, e.g., C4A.111</w:t>
-      </w:r>
-      <w:r>
-        <w:br/>
-      </w:r>
-      <w:r>
-        <w:rPr>
-          <w:rStyle w:val="NormalTok"/>
-        </w:rPr>
-        <w:t xml:space="preserve">  </w:t>
-      </w:r>
-      <w:r>
-        <w:rPr>
-          <w:rStyle w:val="AttributeTok"/>
-        </w:rPr>
-        <w:t xml:space="preserve">compact.codes =</w:t>
-      </w:r>
-      <w:r>
-        <w:rPr>
-          <w:rStyle w:val="NormalTok"/>
-        </w:rPr>
-        <w:t xml:space="preserve"> </w:t>
-      </w:r>
-      <w:r>
-        <w:rPr>
-          <w:rStyle w:val="ConstantTok"/>
-        </w:rPr>
-        <w:t xml:space="preserve">TRUE</w:t>
-      </w:r>
-      <w:r>
-        <w:rPr>
-          <w:rStyle w:val="NormalTok"/>
-        </w:rPr>
-        <w:t xml:space="preserve">, </w:t>
-      </w:r>
-      <w:r>
-        <w:rPr>
-          <w:rStyle w:val="CommentTok"/>
-        </w:rPr>
-        <w:t xml:space="preserve"># reference data[[icd.codes]] against</w:t>
-      </w:r>
-      <w:r>
-        <w:br/>
-      </w:r>
-      <w:r>
-        <w:rPr>
-          <w:rStyle w:val="NormalTok"/>
-        </w:rPr>
-        <w:t xml:space="preserve">                        </w:t>
-      </w:r>
-      <w:r>
-        <w:rPr>
-          <w:rStyle w:val="CommentTok"/>
-        </w:rPr>
-        <w:t xml:space="preserve">#   compact ICD codes, e.g., C4A111</w:t>
-      </w:r>
-      <w:r>
-        <w:br/>
-      </w:r>
-      <w:r>
-        <w:rPr>
-          <w:rStyle w:val="NormalTok"/>
-        </w:rPr>
-        <w:t xml:space="preserve">  </w:t>
-      </w:r>
-      <w:r>
-        <w:rPr>
-          <w:rStyle w:val="AttributeTok"/>
-        </w:rPr>
-        <w:t xml:space="preserve">subconditions =</w:t>
-      </w:r>
-      <w:r>
-        <w:rPr>
-          <w:rStyle w:val="NormalTok"/>
-        </w:rPr>
-        <w:t xml:space="preserve"> </w:t>
-      </w:r>
-      <w:r>
-        <w:rPr>
-          <w:rStyle w:val="ConstantTok"/>
-        </w:rPr>
-        <w:t xml:space="preserve">FALSE</w:t>
-      </w:r>
-      <w:r>
-        <w:rPr>
-          <w:rStyle w:val="NormalTok"/>
-        </w:rPr>
-        <w:t xml:space="preserve"> </w:t>
-      </w:r>
-      <w:r>
-        <w:rPr>
-          <w:rStyle w:val="CommentTok"/>
-        </w:rPr>
-        <w:t xml:space="preserve"># PCCC only: return subcondition flags when available</w:t>
-      </w:r>
-      <w:r>
-        <w:br/>
-      </w:r>
-      <w:r>
-        <w:rPr>
-          <w:rStyle w:val="NormalTok"/>
-        </w:rPr>
-        <w:t xml:space="preserve">)</w:t>
-      </w:r>
-    </w:p>
-    <w:p>
-      <w:pPr>
-        <w:pStyle w:val="FirstParagraph"/>
+        <w:pStyle w:val="BodyText"/>
       </w:pPr>
       <w:r>
         <w:t xml:space="preserve">Several arguments are provided in paired forms (e.g.,</w:t>
@@ -9436,7 +8645,7 @@
         <w:t xml:space="preserve"> </w:t>
       </w:r>
       <w:r>
-        <w:t xml:space="preserve">computational expense, Figure 1. The package GitHub has details on benchmarking</w:t>
+        <w:t xml:space="preserve">computational expense, Figure 2. The package GitHub has details on benchmarking</w:t>
       </w:r>
       <w:r>
         <w:t xml:space="preserve"> </w:t>
@@ -9870,19 +9079,6 @@
     <w:p>
       <w:r>
         <w:br w:type="page"/>
-      </w:r>
-    </w:p>
-    <w:p>
-      <w:pPr>
-        <w:pStyle w:val="BodyText"/>
-      </w:pPr>
-      <w:r>
-        <w:rPr>
-          <w:b/>
-          <w:bCs/>
-          <w:u w:val="single"/>
-        </w:rPr>
-        <w:t xml:space="preserve">Funding Statement:</w:t>
       </w:r>
     </w:p>
     <w:p>
@@ -11094,6 +10290,237 @@
         <w:t xml:space="preserve"> </w:t>
       </w:r>
       <w:r>
+        <w:t xml:space="preserve">Interface for the</w:t>
+      </w:r>
+      <w:r>
+        <w:t xml:space="preserve"> </w:t>
+      </w:r>
+      <w:r>
+        <w:rPr>
+          <w:rStyle w:val="VerbatimChar"/>
+        </w:rPr>
+        <w:t xml:space="preserve">medicalcoder::comorbidities()</w:t>
+      </w:r>
+      <w:r>
+        <w:t xml:space="preserve"> </w:t>
+      </w:r>
+      <w:r>
+        <w:t xml:space="preserve">function. The</w:t>
+      </w:r>
+      <w:r>
+        <w:t xml:space="preserve"> </w:t>
+      </w:r>
+      <w:r>
+        <w:t xml:space="preserve">function requires a data object containing one ICD code per row, the column</w:t>
+      </w:r>
+      <w:r>
+        <w:t xml:space="preserve"> </w:t>
+      </w:r>
+      <w:r>
+        <w:t xml:space="preserve">containing ICD codes, and the comorbidity algorithm specification (e.g.,</w:t>
+      </w:r>
+      <w:r>
+        <w:t xml:space="preserve"> </w:t>
+      </w:r>
+      <w:r>
+        <w:t xml:space="preserve">Charlson or Elixhauser variants). Optional arguments allow users to specify</w:t>
+      </w:r>
+      <w:r>
+        <w:t xml:space="preserve"> </w:t>
+      </w:r>
+      <w:r>
+        <w:t xml:space="preserve">encounter identifiers, ICD version, diagnosis type, present-on-admission</w:t>
+      </w:r>
+      <w:r>
+        <w:t xml:space="preserve"> </w:t>
+      </w:r>
+      <w:r>
+        <w:t xml:space="preserve">indicators, patient age, and primary diagnosis flags. Defaults control how</w:t>
+      </w:r>
+      <w:r>
+        <w:t xml:space="preserve"> </w:t>
+      </w:r>
+      <w:r>
+        <w:t xml:space="preserve">comorbidities are identified, including encounter-level (</w:t>
+      </w:r>
+      <w:r>
+        <w:rPr>
+          <w:rStyle w:val="VerbatimChar"/>
+        </w:rPr>
+        <w:t xml:space="preserve">flag.method = "current"</w:t>
+      </w:r>
+      <w:r>
+        <w:t xml:space="preserve">) or longitudinal (</w:t>
+      </w:r>
+      <w:r>
+        <w:rPr>
+          <w:rStyle w:val="VerbatimChar"/>
+        </w:rPr>
+        <w:t xml:space="preserve">flag.method = "cumulative"</w:t>
+      </w:r>
+      <w:r>
+        <w:t xml:space="preserve">) evaluation and how ICD</w:t>
+      </w:r>
+      <w:r>
+        <w:t xml:space="preserve"> </w:t>
+      </w:r>
+      <w:r>
+        <w:t xml:space="preserve">codes are matched.</w:t>
+      </w:r>
+    </w:p>
+    <w:p>
+      <w:pPr>
+        <w:pStyle w:val="BodyText"/>
+      </w:pPr>
+      <w:r>
+        <w:rPr>
+          <w:b/>
+          <w:bCs/>
+        </w:rPr>
+        <w:t xml:space="preserve">Figure 1 ALT TEXT:</w:t>
+      </w:r>
+      <w:r>
+        <w:t xml:space="preserve"> </w:t>
+      </w:r>
+      <w:r>
+        <w:t xml:space="preserve">Diagram showing the argument structure of the R function</w:t>
+      </w:r>
+      <w:r>
+        <w:t xml:space="preserve"> </w:t>
+      </w:r>
+      <w:r>
+        <w:rPr>
+          <w:rStyle w:val="VerbatimChar"/>
+        </w:rPr>
+        <w:t xml:space="preserve">medicalcoder::comorbidities()</w:t>
+      </w:r>
+      <w:r>
+        <w:t xml:space="preserve">. The figure lists three required inputs: a data</w:t>
+      </w:r>
+      <w:r>
+        <w:t xml:space="preserve"> </w:t>
+      </w:r>
+      <w:r>
+        <w:t xml:space="preserve">frame containing one ICD code per row (data), the column name containing ICD</w:t>
+      </w:r>
+      <w:r>
+        <w:t xml:space="preserve"> </w:t>
+      </w:r>
+      <w:r>
+        <w:t xml:space="preserve">codes (</w:t>
+      </w:r>
+      <w:r>
+        <w:rPr>
+          <w:rStyle w:val="VerbatimChar"/>
+        </w:rPr>
+        <w:t xml:space="preserve">icd.codes</w:t>
+      </w:r>
+      <w:r>
+        <w:t xml:space="preserve">), and the comorbidity method specification (</w:t>
+      </w:r>
+      <w:r>
+        <w:rPr>
+          <w:rStyle w:val="VerbatimChar"/>
+        </w:rPr>
+        <w:t xml:space="preserve">method</w:t>
+      </w:r>
+      <w:r>
+        <w:t xml:space="preserve">, such as</w:t>
+      </w:r>
+      <w:r>
+        <w:t xml:space="preserve"> </w:t>
+      </w:r>
+      <w:r>
+        <w:t xml:space="preserve">“charlson_quan2005”</w:t>
+      </w:r>
+      <w:r>
+        <w:t xml:space="preserve">). Additional optional parameters allow users to specify</w:t>
+      </w:r>
+      <w:r>
+        <w:t xml:space="preserve"> </w:t>
+      </w:r>
+      <w:r>
+        <w:t xml:space="preserve">encounter identifiers, ICD version (9 or 10), diagnosis versus procedure</w:t>
+      </w:r>
+      <w:r>
+        <w:t xml:space="preserve"> </w:t>
+      </w:r>
+      <w:r>
+        <w:t xml:space="preserve">indicators, present-on- admission status, patient age (for Charlson algorithms),</w:t>
+      </w:r>
+      <w:r>
+        <w:t xml:space="preserve"> </w:t>
+      </w:r>
+      <w:r>
+        <w:t xml:space="preserve">and primary diagnosis flags. Default arguments include</w:t>
+      </w:r>
+      <w:r>
+        <w:t xml:space="preserve"> </w:t>
+      </w:r>
+      <w:r>
+        <w:rPr>
+          <w:rStyle w:val="VerbatimChar"/>
+        </w:rPr>
+        <w:t xml:space="preserve">flag.method = "current"</w:t>
+      </w:r>
+      <w:r>
+        <w:t xml:space="preserve"> </w:t>
+      </w:r>
+      <w:r>
+        <w:t xml:space="preserve">for encounter-level detection,</w:t>
+      </w:r>
+      <w:r>
+        <w:t xml:space="preserve"> </w:t>
+      </w:r>
+      <w:r>
+        <w:rPr>
+          <w:rStyle w:val="VerbatimChar"/>
+        </w:rPr>
+        <w:t xml:space="preserve">full.codes = TRUE</w:t>
+      </w:r>
+      <w:r>
+        <w:t xml:space="preserve">,</w:t>
+      </w:r>
+      <w:r>
+        <w:t xml:space="preserve"> </w:t>
+      </w:r>
+      <w:r>
+        <w:rPr>
+          <w:rStyle w:val="VerbatimChar"/>
+        </w:rPr>
+        <w:t xml:space="preserve">compact.codes = TRUE</w:t>
+      </w:r>
+      <w:r>
+        <w:t xml:space="preserve">, and</w:t>
+      </w:r>
+      <w:r>
+        <w:t xml:space="preserve"> </w:t>
+      </w:r>
+      <w:r>
+        <w:rPr>
+          <w:rStyle w:val="VerbatimChar"/>
+        </w:rPr>
+        <w:t xml:space="preserve">subconditions = FALSE</w:t>
+      </w:r>
+      <w:r>
+        <w:t xml:space="preserve">.</w:t>
+      </w:r>
+    </w:p>
+    <w:p>
+      <w:pPr>
+        <w:pStyle w:val="BodyText"/>
+      </w:pPr>
+      <w:r>
+        <w:rPr>
+          <w:b/>
+          <w:bCs/>
+        </w:rPr>
+        <w:t xml:space="preserve">Figure 2:</w:t>
+      </w:r>
+      <w:r>
+        <w:t xml:space="preserve"> </w:t>
+      </w:r>
+      <w:r>
         <w:t xml:space="preserve">The time required to flag comorbidities in the MIMIC-IV v3.1</w:t>
       </w:r>
       <w:r>
@@ -11168,7 +10595,7 @@
         <w:t xml:space="preserve"> </w:t>
       </w:r>
       <w:r>
-        <w:t xml:space="preserve">and ICD-10 within the MIMIC-IV dataset. Applying the each of of the</w:t>
+        <w:t xml:space="preserve">and ICD-10 within the MIMIC-IV dataset. Applying each of the</w:t>
       </w:r>
       <w:r>
         <w:t xml:space="preserve"> </w:t>
@@ -11260,6 +10687,182 @@
       </w:r>
       <w:r>
         <w:t xml:space="preserve">with 16.0 GB RAM.</w:t>
+      </w:r>
+    </w:p>
+    <w:p>
+      <w:pPr>
+        <w:pStyle w:val="BodyText"/>
+      </w:pPr>
+      <w:r>
+        <w:rPr>
+          <w:b/>
+          <w:bCs/>
+        </w:rPr>
+        <w:t xml:space="preserve">Figure 2 ALT TEXT:</w:t>
+      </w:r>
+    </w:p>
+    <w:p>
+      <w:pPr>
+        <w:pStyle w:val="BodyText"/>
+      </w:pPr>
+      <w:r>
+        <w:t xml:space="preserve">Four-panel grouped bar chart showing time in seconds to flag comorbidities in</w:t>
+      </w:r>
+      <w:r>
+        <w:t xml:space="preserve"> </w:t>
+      </w:r>
+      <w:r>
+        <w:t xml:space="preserve">the MIMIC-IV v3.1 dataset. Panels compare four utilities:</w:t>
+      </w:r>
+      <w:r>
+        <w:t xml:space="preserve"> </w:t>
+      </w:r>
+      <w:r>
+        <w:rPr>
+          <w:rStyle w:val="VerbatimChar"/>
+        </w:rPr>
+        <w:t xml:space="preserve">comorbidity</w:t>
+      </w:r>
+      <w:r>
+        <w:t xml:space="preserve">,</w:t>
+      </w:r>
+      <w:r>
+        <w:t xml:space="preserve"> </w:t>
+      </w:r>
+      <w:r>
+        <w:rPr>
+          <w:rStyle w:val="VerbatimChar"/>
+        </w:rPr>
+        <w:t xml:space="preserve">medicalcoder</w:t>
+      </w:r>
+      <w:r>
+        <w:t xml:space="preserve">, MIMIC-IV code, and</w:t>
+      </w:r>
+      <w:r>
+        <w:t xml:space="preserve"> </w:t>
+      </w:r>
+      <w:r>
+        <w:rPr>
+          <w:rStyle w:val="VerbatimChar"/>
+        </w:rPr>
+        <w:t xml:space="preserve">pccc</w:t>
+      </w:r>
+      <w:r>
+        <w:t xml:space="preserve">. The x-axis lists comorbidity</w:t>
+      </w:r>
+      <w:r>
+        <w:t xml:space="preserve"> </w:t>
+      </w:r>
+      <w:r>
+        <w:t xml:space="preserve">algorithms: Charlson, Elixhauser, PCCC version 2.0, and PCCC version 3.1. The</w:t>
+      </w:r>
+      <w:r>
+        <w:t xml:space="preserve"> </w:t>
+      </w:r>
+      <w:r>
+        <w:t xml:space="preserve">y-axis is time in seconds from 0 to about 160. Blue bars indicate cumulative</w:t>
+      </w:r>
+      <w:r>
+        <w:t xml:space="preserve"> </w:t>
+      </w:r>
+      <w:r>
+        <w:t xml:space="preserve">flagging and maroon bars indicate current flagging. Only</w:t>
+      </w:r>
+      <w:r>
+        <w:t xml:space="preserve"> </w:t>
+      </w:r>
+      <w:r>
+        <w:rPr>
+          <w:rStyle w:val="VerbatimChar"/>
+        </w:rPr>
+        <w:t xml:space="preserve">medicalcoder</w:t>
+      </w:r>
+      <w:r>
+        <w:t xml:space="preserve"> </w:t>
+      </w:r>
+      <w:r>
+        <w:t xml:space="preserve">has</w:t>
+      </w:r>
+      <w:r>
+        <w:t xml:space="preserve"> </w:t>
+      </w:r>
+      <w:r>
+        <w:t xml:space="preserve">cumulative bars as it is the only utility natively supporting cumulative</w:t>
+      </w:r>
+      <w:r>
+        <w:t xml:space="preserve"> </w:t>
+      </w:r>
+      <w:r>
+        <w:t xml:space="preserve">flagging.</w:t>
+      </w:r>
+      <w:r>
+        <w:t xml:space="preserve"> </w:t>
+      </w:r>
+      <w:r>
+        <w:rPr>
+          <w:rStyle w:val="VerbatimChar"/>
+        </w:rPr>
+        <w:t xml:space="preserve">medicalcoder</w:t>
+      </w:r>
+      <w:r>
+        <w:t xml:space="preserve"> </w:t>
+      </w:r>
+      <w:r>
+        <w:t xml:space="preserve">is the fastest in every comparison shown, with times</w:t>
+      </w:r>
+      <w:r>
+        <w:t xml:space="preserve"> </w:t>
+      </w:r>
+      <w:r>
+        <w:t xml:space="preserve">of about 3 to 14 seconds across all four algorithms and flag methods.</w:t>
+      </w:r>
+      <w:r>
+        <w:t xml:space="preserve"> </w:t>
+      </w:r>
+      <w:r>
+        <w:rPr>
+          <w:rStyle w:val="VerbatimChar"/>
+        </w:rPr>
+        <w:t xml:space="preserve">comorbidity</w:t>
+      </w:r>
+      <w:r>
+        <w:t xml:space="preserve"> </w:t>
+      </w:r>
+      <w:r>
+        <w:t xml:space="preserve">is slower, at about 54 seconds for current Charlson, 76 seconds</w:t>
+      </w:r>
+      <w:r>
+        <w:t xml:space="preserve"> </w:t>
+      </w:r>
+      <w:r>
+        <w:t xml:space="preserve">for current Elixhauser. The MIMIC-IV code panel shows a single current Charlson</w:t>
+      </w:r>
+      <w:r>
+        <w:t xml:space="preserve"> </w:t>
+      </w:r>
+      <w:r>
+        <w:t xml:space="preserve">result at about 106 seconds. The</w:t>
+      </w:r>
+      <w:r>
+        <w:t xml:space="preserve"> </w:t>
+      </w:r>
+      <w:r>
+        <w:rPr>
+          <w:rStyle w:val="VerbatimChar"/>
+        </w:rPr>
+        <w:t xml:space="preserve">pccc</w:t>
+      </w:r>
+      <w:r>
+        <w:t xml:space="preserve"> </w:t>
+      </w:r>
+      <w:r>
+        <w:t xml:space="preserve">panel shows only PCCC version 2.0, with</w:t>
+      </w:r>
+      <w:r>
+        <w:t xml:space="preserve"> </w:t>
+      </w:r>
+      <w:r>
+        <w:t xml:space="preserve">about 152 seconds for current flagging.</w:t>
       </w:r>
     </w:p>
     <w:bookmarkEnd w:id="71"/>

</xml_diff>

<commit_message>
update build process; edit files to incorporate Tell's edits
</commit_message>
<xml_diff>
--- a/medicalcoder-manuscript.docx
+++ b/medicalcoder-manuscript.docx
@@ -40,12 +40,21 @@
         <w:t xml:space="preserve">1</w:t>
       </w:r>
       <w:r>
-        <w:t xml:space="preserve">, MS; Margaret N. Rebull</w:t>
+        <w:t xml:space="preserve">, MS; James A. Feinstein, MD, MPH</w:t>
       </w:r>
       <w:r>
         <w:rPr>
           <w:vertAlign w:val="superscript"/>
         </w:rPr>
+        <w:t xml:space="preserve">2,3,4</w:t>
+      </w:r>
+      <w:r>
+        <w:t xml:space="preserve">; Margaret N. Rebull</w:t>
+      </w:r>
+      <w:r>
+        <w:rPr>
+          <w:vertAlign w:val="superscript"/>
+        </w:rPr>
         <w:t xml:space="preserve">1</w:t>
       </w:r>
       <w:r>
@@ -55,7 +64,7 @@
         <w:rPr>
           <w:vertAlign w:val="superscript"/>
         </w:rPr>
-        <w:t xml:space="preserve">1,2</w:t>
+        <w:t xml:space="preserve">1,5</w:t>
       </w:r>
       <w:r>
         <w:t xml:space="preserve">, MD, MS</w:t>
@@ -88,6 +97,66 @@
       <w:r>
         <w:t xml:space="preserve">Department of Biomedical Informatics, University of Colorado School of Medicine, University of Colorado Anschutz Medical Campus, Aurora, Colorado, USA</w:t>
       </w:r>
+      <w:r>
+        <w:br/>
+      </w:r>
+      <w:r>
+        <w:rPr>
+          <w:vertAlign w:val="superscript"/>
+        </w:rPr>
+        <w:t xml:space="preserve">2</w:t>
+      </w:r>
+      <w:r>
+        <w:t xml:space="preserve"> </w:t>
+      </w:r>
+      <w:r>
+        <w:t xml:space="preserve">Adult and Child Center for Outcomes Research and Delivery Science, University of Colorado Anschutz Medical Campus, Aurora.</w:t>
+      </w:r>
+      <w:r>
+        <w:br/>
+      </w:r>
+      <w:r>
+        <w:rPr>
+          <w:vertAlign w:val="superscript"/>
+        </w:rPr>
+        <w:t xml:space="preserve">3</w:t>
+      </w:r>
+      <w:r>
+        <w:t xml:space="preserve"> </w:t>
+      </w:r>
+      <w:r>
+        <w:t xml:space="preserve">Children’s Hospital Colorado, Aurora.</w:t>
+      </w:r>
+      <w:r>
+        <w:br/>
+      </w:r>
+      <w:r>
+        <w:rPr>
+          <w:vertAlign w:val="superscript"/>
+        </w:rPr>
+        <w:t xml:space="preserve">4</w:t>
+      </w:r>
+      <w:r>
+        <w:t xml:space="preserve"> </w:t>
+      </w:r>
+      <w:r>
+        <w:t xml:space="preserve">Department of Pediatrics, University of Colorado Anschutz Medical Campus, Aurora.</w:t>
+      </w:r>
+      <w:r>
+        <w:br/>
+      </w:r>
+      <w:r>
+        <w:rPr>
+          <w:vertAlign w:val="superscript"/>
+        </w:rPr>
+        <w:t xml:space="preserve">5</w:t>
+      </w:r>
+      <w:r>
+        <w:t xml:space="preserve"> </w:t>
+      </w:r>
+      <w:r>
+        <w:t xml:space="preserve">Section of Critical Care Medicine, Department of Pediatrics, University of Colorado School of Medicine, University of Colorado Anschutz Medical Campus, Aurora, Colorado, USA</w:t>
+      </w:r>
     </w:p>
     <w:p>
       <w:pPr>
@@ -95,15 +164,11 @@
       </w:pPr>
       <w:r>
         <w:rPr>
-          <w:vertAlign w:val="superscript"/>
-        </w:rPr>
-        <w:t xml:space="preserve">2</w:t>
-      </w:r>
-      <w:r>
-        <w:t xml:space="preserve"> </w:t>
-      </w:r>
-      <w:r>
-        <w:t xml:space="preserve">Section of Critical Care Medicine, Department of Pediatrics, University of Colorado School of Medicine, University of Colorado Anschutz Medical Campus, Aurora, Colorado, USA</w:t>
+          <w:b/>
+          <w:bCs/>
+          <w:u w:val="single"/>
+        </w:rPr>
+        <w:t xml:space="preserve">Correspondence:</w:t>
       </w:r>
     </w:p>
     <w:p>
@@ -111,12 +176,37 @@
         <w:pStyle w:val="BodyText"/>
       </w:pPr>
       <w:r>
-        <w:rPr>
-          <w:b/>
-          <w:bCs/>
-          <w:u w:val="single"/>
-        </w:rPr>
-        <w:t xml:space="preserve">Correspondence:</w:t>
+        <w:t xml:space="preserve">Peter E. DeWitt, PhD</w:t>
+      </w:r>
+      <w:r>
+        <w:br/>
+      </w:r>
+      <w:r>
+        <w:t xml:space="preserve">Department of Biomedical Informatics</w:t>
+      </w:r>
+      <w:r>
+        <w:br/>
+      </w:r>
+      <w:r>
+        <w:t xml:space="preserve">University of Colorado School of Medicine</w:t>
+      </w:r>
+      <w:r>
+        <w:br/>
+      </w:r>
+      <w:r>
+        <w:t xml:space="preserve">1890 N. Revere Court</w:t>
+      </w:r>
+      <w:r>
+        <w:br/>
+      </w:r>
+      <w:r>
+        <w:t xml:space="preserve">Mailstop F600</w:t>
+      </w:r>
+      <w:r>
+        <w:br/>
+      </w:r>
+      <w:r>
+        <w:t xml:space="preserve">Aurora, Colorado, 80045</w:t>
       </w:r>
     </w:p>
     <w:p>
@@ -124,50 +214,12 @@
         <w:pStyle w:val="BodyText"/>
       </w:pPr>
       <w:r>
-        <w:t xml:space="preserve">Peter E. DeWitt, PhD</w:t>
-      </w:r>
-      <w:r>
-        <w:br/>
-      </w:r>
-      <w:r>
-        <w:t xml:space="preserve">Department of Biomedical Informatics</w:t>
-      </w:r>
-      <w:r>
-        <w:br/>
-      </w:r>
-      <w:r>
-        <w:t xml:space="preserve">University of Colorado School of Medicine</w:t>
-      </w:r>
-      <w:r>
-        <w:br/>
-      </w:r>
-      <w:r>
-        <w:t xml:space="preserve">1890 N. Revere Court</w:t>
-      </w:r>
-      <w:r>
-        <w:br/>
-      </w:r>
-      <w:r>
-        <w:t xml:space="preserve">Mailstop F600</w:t>
-      </w:r>
-      <w:r>
-        <w:br/>
-      </w:r>
-      <w:r>
-        <w:t xml:space="preserve">Aurora, Colorado, 80045</w:t>
-      </w:r>
-    </w:p>
-    <w:p>
-      <w:pPr>
-        <w:pStyle w:val="BodyText"/>
-      </w:pPr>
-      <w:r>
         <w:t xml:space="preserve">Email:</w:t>
       </w:r>
       <w:r>
         <w:t xml:space="preserve"> </w:t>
       </w:r>
-      <w:hyperlink r:id="rId20">
+      <w:hyperlink r:id="rId9">
         <w:r>
           <w:rPr>
             <w:rStyle w:val="Hyperlink"/>
@@ -211,7 +263,7 @@
         <w:t xml:space="preserve"> </w:t>
       </w:r>
       <w:r>
-        <w:t xml:space="preserve">1967 / 2000 (excluding tables)</w:t>
+        <w:t xml:space="preserve">1983 / 2000 (excluding tables)</w:t>
       </w:r>
     </w:p>
     <w:p>
@@ -278,7 +330,20 @@
         <w:t xml:space="preserve">Short running title</w:t>
       </w:r>
       <w:r>
-        <w:t xml:space="preserve">: medicalcoder: R package for ICD codes and Comorbidities with longitudinal data</w:t>
+        <w:t xml:space="preserve">:</w:t>
+      </w:r>
+      <w:r>
+        <w:t xml:space="preserve"> </w:t>
+      </w:r>
+      <w:r>
+        <w:rPr>
+          <w:i/>
+          <w:iCs/>
+        </w:rPr>
+        <w:t xml:space="preserve">medicalcoder</w:t>
+      </w:r>
+      <w:r>
+        <w:t xml:space="preserve">: R package for ICD codes and Comorbidities with longitudinal data</w:t>
       </w:r>
     </w:p>
     <w:p>
@@ -311,7 +376,7 @@
         <w:br w:type="page"/>
       </w:r>
     </w:p>
-    <w:bookmarkStart w:id="21" w:name="abstract"/>
+    <w:bookmarkStart w:id="10" w:name="abstract"/>
     <w:p>
       <w:pPr>
         <w:pStyle w:val="Heading1"/>
@@ -349,7 +414,7 @@
         <w:t xml:space="preserve"> </w:t>
       </w:r>
       <w:r>
-        <w:t xml:space="preserve">cohort characterization, yet existing software is fragmented, inconsistently</w:t>
+        <w:t xml:space="preserve">cohort characterization. However, existing software is fragmented, inconsistently</w:t>
       </w:r>
       <w:r>
         <w:t xml:space="preserve"> </w:t>
@@ -747,8 +812,8 @@
         <w:br w:type="page"/>
       </w:r>
     </w:p>
-    <w:bookmarkEnd w:id="21"/>
-    <w:bookmarkStart w:id="22" w:name="background-and-significance"/>
+    <w:bookmarkEnd w:id="10"/>
+    <w:bookmarkStart w:id="11" w:name="background-and-significance"/>
     <w:p>
       <w:pPr>
         <w:pStyle w:val="Heading1"/>
@@ -806,19 +871,19 @@
         <w:pStyle w:val="BodyText"/>
       </w:pPr>
       <w:r>
-        <w:t xml:space="preserve">Existing software for flagging comorbidities typically implement one or two</w:t>
-      </w:r>
-      <w:r>
-        <w:t xml:space="preserve"> </w:t>
-      </w:r>
-      <w:r>
-        <w:t xml:space="preserve">algorithms, most often variants of Charlson and Elixhauser, and support either</w:t>
-      </w:r>
-      <w:r>
-        <w:t xml:space="preserve"> </w:t>
-      </w:r>
-      <w:r>
-        <w:t xml:space="preserve">ICD-9 or ICD-10 (but not simultaneously),</w:t>
+        <w:t xml:space="preserve">Existing software for flagging comorbidities typically implements one or two</w:t>
+      </w:r>
+      <w:r>
+        <w:t xml:space="preserve"> </w:t>
+      </w:r>
+      <w:r>
+        <w:t xml:space="preserve">algorithms, most often variants of Charlson and Elixhauser, supports either</w:t>
+      </w:r>
+      <w:r>
+        <w:t xml:space="preserve"> </w:t>
+      </w:r>
+      <w:r>
+        <w:t xml:space="preserve">ICD-9 or ICD-10 (but not both simultaneously),</w:t>
       </w:r>
       <w:r>
         <w:t xml:space="preserve"> </w:t>
@@ -889,7 +954,7 @@
         <w:t xml:space="preserve"> </w:t>
       </w:r>
       <w:r>
-        <w:t xml:space="preserve">subsequent encounters, those comorbidities will not be flagged.</w:t>
+        <w:t xml:space="preserve">subsequent encounters, those comorbidities will not be correctly classified.</w:t>
       </w:r>
     </w:p>
     <w:p>
@@ -917,7 +982,7 @@
         <w:pStyle w:val="BodyText"/>
       </w:pPr>
       <w:r>
-        <w:t xml:space="preserve">We present the R package</w:t>
+        <w:t xml:space="preserve">We developed the R package</w:t>
       </w:r>
       <w:r>
         <w:t xml:space="preserve"> </w:t>
@@ -936,8 +1001,8 @@
         <w:t xml:space="preserve">to fill this need.</w:t>
       </w:r>
     </w:p>
-    <w:bookmarkEnd w:id="22"/>
-    <w:bookmarkStart w:id="23" w:name="objective"/>
+    <w:bookmarkEnd w:id="11"/>
+    <w:bookmarkStart w:id="12" w:name="objective"/>
     <w:p>
       <w:pPr>
         <w:pStyle w:val="Heading1"/>
@@ -990,8 +1055,8 @@
         <w:t xml:space="preserve">patient encounters.</w:t>
       </w:r>
     </w:p>
-    <w:bookmarkEnd w:id="23"/>
-    <w:bookmarkStart w:id="29" w:name="materials-and-methods"/>
+    <w:bookmarkEnd w:id="12"/>
+    <w:bookmarkStart w:id="18" w:name="materials-and-methods"/>
     <w:p>
       <w:pPr>
         <w:pStyle w:val="Heading1"/>
@@ -1027,7 +1092,7 @@
         <w:t xml:space="preserve"> </w:t>
       </w:r>
       <w:r>
-        <w:t xml:space="preserve">and tightly control system settings and software. No external namespaces are imported; R ≥</w:t>
+        <w:t xml:space="preserve">and tightly controled system settings and software. No external namespaces are imported; R ≥</w:t>
       </w:r>
       <w:r>
         <w:t xml:space="preserve"> </w:t>
@@ -1045,7 +1110,7 @@
         <w:rPr>
           <w:rStyle w:val="FootnoteReference"/>
         </w:rPr>
-        <w:footnoteReference w:id="24"/>
+        <w:footnoteReference w:id="13"/>
       </w:r>
       <w:r>
         <w:t xml:space="preserve">. Several packages are suggested for enhanced</w:t>
@@ -1089,7 +1154,7 @@
         <w:pStyle w:val="BodyText"/>
       </w:pPr>
       <w:r>
-        <w:t xml:space="preserve">The internal ICD database consists of ICD-9 diagnostic codes from the Centers</w:t>
+        <w:t xml:space="preserve">The internal ICD database includes ICD-9 diagnostic codes from the Centers</w:t>
       </w:r>
       <w:r>
         <w:t xml:space="preserve"> </w:t>
@@ -1207,7 +1272,7 @@
         <w:rPr>
           <w:rStyle w:val="FootnoteReference"/>
         </w:rPr>
-        <w:footnoteReference w:id="25"/>
+        <w:footnoteReference w:id="14"/>
       </w:r>
       <w:r>
         <w:t xml:space="preserve">.</w:t>
@@ -1279,7 +1344,7 @@
         <w:rPr>
           <w:rStyle w:val="FootnoteReference"/>
         </w:rPr>
-        <w:footnoteReference w:id="26"/>
+        <w:footnoteReference w:id="15"/>
       </w:r>
       <w:r>
         <w:t xml:space="preserve"> </w:t>
@@ -1300,7 +1365,7 @@
         <w:rPr>
           <w:rStyle w:val="FootnoteReference"/>
         </w:rPr>
-        <w:footnoteReference w:id="27"/>
+        <w:footnoteReference w:id="16"/>
       </w:r>
       <w:r>
         <w:t xml:space="preserve"> </w:t>
@@ -1422,7 +1487,7 @@
         <w:rPr>
           <w:rStyle w:val="FootnoteReference"/>
         </w:rPr>
-        <w:footnoteReference w:id="28"/>
+        <w:footnoteReference w:id="17"/>
       </w:r>
       <w:r>
         <w:t xml:space="preserve">, and the R packages</w:t>
@@ -1469,8 +1534,8 @@
         <w:t xml:space="preserve">.</w:t>
       </w:r>
     </w:p>
-    <w:bookmarkEnd w:id="29"/>
-    <w:bookmarkStart w:id="30" w:name="results"/>
+    <w:bookmarkEnd w:id="18"/>
+    <w:bookmarkStart w:id="19" w:name="results"/>
     <w:p>
       <w:pPr>
         <w:pStyle w:val="Heading1"/>
@@ -1484,13 +1549,13 @@
         <w:pStyle w:val="FirstParagraph"/>
       </w:pPr>
       <w:r>
-        <w:t xml:space="preserve">Within the MIMIC-IV v3.1 dataset there are</w:t>
-      </w:r>
-      <w:r>
-        <w:t xml:space="preserve"> </w:t>
-      </w:r>
-      <w:r>
-        <w:t xml:space="preserve">7,365,770 total rows of data for</w:t>
+        <w:t xml:space="preserve">The MIMIC-IV v3.1 dataset includes</w:t>
+      </w:r>
+      <w:r>
+        <w:t xml:space="preserve"> </w:t>
+      </w:r>
+      <w:r>
+        <w:t xml:space="preserve">7,365,770 rows of data for</w:t>
       </w:r>
       <w:r>
         <w:t xml:space="preserve"> </w:t>
@@ -2040,7 +2105,7 @@
         <w:rPr>
           <w:rStyle w:val="VerbatimChar"/>
         </w:rPr>
-        <w:t xml:space="preserve">summary</w:t>
+        <w:t xml:space="preserve">summary()</w:t>
       </w:r>
       <w:r>
         <w:t xml:space="preserve"> </w:t>
@@ -4302,7 +4367,13 @@
         <w:t xml:space="preserve"> </w:t>
       </w:r>
       <w:r>
-        <w:t xml:space="preserve">applied consistently.</w:t>
+        <w:t xml:space="preserve">applied consistently. Additional examples of missed flags and reduced severity</w:t>
+      </w:r>
+      <w:r>
+        <w:t xml:space="preserve"> </w:t>
+      </w:r>
+      <w:r>
+        <w:t xml:space="preserve">under encounter-level approaches are provided in the Supplement.</w:t>
       </w:r>
     </w:p>
     <w:p>
@@ -4404,7 +4475,7 @@
         <w:t xml:space="preserve"> </w:t>
       </w:r>
       <w:r>
-        <w:t xml:space="preserve">comorbidity was reported. Under a cumulative flagging paradigm the</w:t>
+        <w:t xml:space="preserve">comorbidity was reported. Under a cumulative flagging paradigm, the</w:t>
       </w:r>
       <w:r>
         <w:t xml:space="preserve"> </w:t>
@@ -4625,7 +4696,7 @@
             <w:r>
               <w:rPr>
                 <w:rFonts w:ascii="Calibri" w:hAnsi="Calibri"/>
-                <w:sz w:val="20"/>
+                <w:sz w:val="8pt"/>
               </w:rPr>
               <w:t xml:space="default">Encounter</w:t>
             </w:r>
@@ -4646,7 +4717,7 @@
             <w:r>
               <w:rPr>
                 <w:rFonts w:ascii="Calibri" w:hAnsi="Calibri"/>
-                <w:sz w:val="20"/>
+                <w:sz w:val="8pt"/>
               </w:rPr>
               <w:t xml:space="default">Current</w:t>
             </w:r>
@@ -4667,7 +4738,7 @@
             <w:r>
               <w:rPr>
                 <w:rFonts w:ascii="Calibri" w:hAnsi="Calibri"/>
-                <w:sz w:val="20"/>
+                <w:sz w:val="8pt"/>
               </w:rPr>
               <w:t xml:space="default">Cumulative</w:t>
             </w:r>
@@ -4688,7 +4759,7 @@
             <w:r>
               <w:rPr>
                 <w:rFonts w:ascii="Calibri" w:hAnsi="Calibri"/>
-                <w:sz w:val="20"/>
+                <w:sz w:val="8pt"/>
               </w:rPr>
               <w:t xml:space="default">Current</w:t>
             </w:r>
@@ -4709,7 +4780,7 @@
             <w:r>
               <w:rPr>
                 <w:rFonts w:ascii="Calibri" w:hAnsi="Calibri"/>
-                <w:sz w:val="20"/>
+                <w:sz w:val="8pt"/>
               </w:rPr>
               <w:t xml:space="default">Cumulative</w:t>
             </w:r>
@@ -4730,7 +4801,7 @@
             <w:r>
               <w:rPr>
                 <w:rFonts w:ascii="Calibri" w:hAnsi="Calibri"/>
-                <w:sz w:val="20"/>
+                <w:sz w:val="8pt"/>
               </w:rPr>
               <w:t xml:space="default">Current</w:t>
             </w:r>
@@ -4751,7 +4822,7 @@
             <w:r>
               <w:rPr>
                 <w:rFonts w:ascii="Calibri" w:hAnsi="Calibri"/>
-                <w:sz w:val="20"/>
+                <w:sz w:val="8pt"/>
               </w:rPr>
               <w:t xml:space="default">Cumulative</w:t>
             </w:r>
@@ -4772,7 +4843,7 @@
             <w:r>
               <w:rPr>
                 <w:rFonts w:ascii="Calibri" w:hAnsi="Calibri"/>
-                <w:sz w:val="20"/>
+                <w:sz w:val="8pt"/>
               </w:rPr>
               <w:t xml:space="default">Current</w:t>
             </w:r>
@@ -4793,7 +4864,7 @@
             <w:r>
               <w:rPr>
                 <w:rFonts w:ascii="Calibri" w:hAnsi="Calibri"/>
-                <w:sz w:val="20"/>
+                <w:sz w:val="8pt"/>
               </w:rPr>
               <w:t xml:space="default">Cumulative</w:t>
             </w:r>
@@ -4814,7 +4885,7 @@
             <w:r>
               <w:rPr>
                 <w:rFonts w:ascii="Calibri" w:hAnsi="Calibri"/>
-                <w:sz w:val="20"/>
+                <w:sz w:val="8pt"/>
               </w:rPr>
               <w:t xml:space="default">Current</w:t>
             </w:r>
@@ -4836,7 +4907,7 @@
             <w:r>
               <w:rPr>
                 <w:rFonts w:ascii="Calibri" w:hAnsi="Calibri"/>
-                <w:sz w:val="20"/>
+                <w:sz w:val="8pt"/>
               </w:rPr>
               <w:t xml:space="default">Cumulative</w:t>
             </w:r>
@@ -4865,7 +4936,7 @@
             <w:r>
               <w:rPr>
                 <w:rFonts w:ascii="Calibri" w:hAnsi="Calibri"/>
-                <w:sz w:val="20"/>
+                <w:sz w:val="8pt"/>
               </w:rPr>
               <w:t xml:space="default">1</w:t>
             </w:r>
@@ -4889,7 +4960,7 @@
             <w:r>
               <w:rPr>
                 <w:rFonts w:ascii="Calibri" w:hAnsi="Calibri"/>
-                <w:sz w:val="20"/>
+                <w:sz w:val="8pt"/>
               </w:rPr>
               <w:t xml:space="default"/>
             </w:r>
@@ -4913,7 +4984,7 @@
             <w:r>
               <w:rPr>
                 <w:rFonts w:ascii="Calibri" w:hAnsi="Calibri"/>
-                <w:sz w:val="20"/>
+                <w:sz w:val="8pt"/>
               </w:rPr>
               <w:t xml:space="default"/>
             </w:r>
@@ -4937,7 +5008,7 @@
             <w:r>
               <w:rPr>
                 <w:rFonts w:ascii="Calibri" w:hAnsi="Calibri"/>
-                <w:sz w:val="20"/>
+                <w:sz w:val="8pt"/>
               </w:rPr>
               <w:t xml:space="default"/>
             </w:r>
@@ -4961,7 +5032,7 @@
             <w:r>
               <w:rPr>
                 <w:rFonts w:ascii="Calibri" w:hAnsi="Calibri"/>
-                <w:sz w:val="20"/>
+                <w:sz w:val="8pt"/>
               </w:rPr>
               <w:t xml:space="default"/>
             </w:r>
@@ -4985,7 +5056,7 @@
             <w:r>
               <w:rPr>
                 <w:rFonts w:ascii="Calibri" w:hAnsi="Calibri"/>
-                <w:sz w:val="20"/>
+                <w:sz w:val="8pt"/>
               </w:rPr>
               <w:t xml:space="default">*</w:t>
             </w:r>
@@ -5009,7 +5080,7 @@
             <w:r>
               <w:rPr>
                 <w:rFonts w:ascii="Calibri" w:hAnsi="Calibri"/>
-                <w:sz w:val="20"/>
+                <w:sz w:val="8pt"/>
               </w:rPr>
               <w:t xml:space="default">*</w:t>
             </w:r>
@@ -5033,7 +5104,7 @@
             <w:r>
               <w:rPr>
                 <w:rFonts w:ascii="Calibri" w:hAnsi="Calibri"/>
-                <w:sz w:val="20"/>
+                <w:sz w:val="8pt"/>
               </w:rPr>
               <w:t xml:space="default"/>
             </w:r>
@@ -5057,7 +5128,7 @@
             <w:r>
               <w:rPr>
                 <w:rFonts w:ascii="Calibri" w:hAnsi="Calibri"/>
-                <w:sz w:val="20"/>
+                <w:sz w:val="8pt"/>
               </w:rPr>
               <w:t xml:space="default"/>
             </w:r>
@@ -5081,7 +5152,7 @@
             <w:r>
               <w:rPr>
                 <w:rFonts w:ascii="Calibri" w:hAnsi="Calibri"/>
-                <w:sz w:val="20"/>
+                <w:sz w:val="8pt"/>
               </w:rPr>
               <w:t xml:space="default">0</w:t>
             </w:r>
@@ -5105,7 +5176,7 @@
             <w:r>
               <w:rPr>
                 <w:rFonts w:ascii="Calibri" w:hAnsi="Calibri"/>
-                <w:sz w:val="20"/>
+                <w:sz w:val="8pt"/>
               </w:rPr>
               <w:t xml:space="default">0</w:t>
             </w:r>
@@ -5134,7 +5205,7 @@
             <w:r>
               <w:rPr>
                 <w:rFonts w:ascii="Calibri" w:hAnsi="Calibri"/>
-                <w:sz w:val="20"/>
+                <w:sz w:val="8pt"/>
               </w:rPr>
               <w:t xml:space="default">2</w:t>
             </w:r>
@@ -5158,7 +5229,7 @@
             <w:r>
               <w:rPr>
                 <w:rFonts w:ascii="Calibri" w:hAnsi="Calibri"/>
-                <w:sz w:val="20"/>
+                <w:sz w:val="8pt"/>
               </w:rPr>
               <w:t xml:space="default"/>
             </w:r>
@@ -5182,7 +5253,7 @@
             <w:r>
               <w:rPr>
                 <w:rFonts w:ascii="Calibri" w:hAnsi="Calibri"/>
-                <w:sz w:val="20"/>
+                <w:sz w:val="8pt"/>
               </w:rPr>
               <w:t xml:space="default"/>
             </w:r>
@@ -5206,7 +5277,7 @@
             <w:r>
               <w:rPr>
                 <w:rFonts w:ascii="Calibri" w:hAnsi="Calibri"/>
-                <w:sz w:val="20"/>
+                <w:sz w:val="8pt"/>
               </w:rPr>
               <w:t xml:space="default"/>
             </w:r>
@@ -5230,7 +5301,7 @@
             <w:r>
               <w:rPr>
                 <w:rFonts w:ascii="Calibri" w:hAnsi="Calibri"/>
-                <w:sz w:val="20"/>
+                <w:sz w:val="8pt"/>
               </w:rPr>
               <w:t xml:space="default"/>
             </w:r>
@@ -5254,7 +5325,7 @@
             <w:r>
               <w:rPr>
                 <w:rFonts w:ascii="Calibri" w:hAnsi="Calibri"/>
-                <w:sz w:val="20"/>
+                <w:sz w:val="8pt"/>
               </w:rPr>
               <w:t xml:space="default"/>
             </w:r>
@@ -5278,7 +5349,7 @@
             <w:r>
               <w:rPr>
                 <w:rFonts w:ascii="Calibri" w:hAnsi="Calibri"/>
-                <w:sz w:val="20"/>
+                <w:sz w:val="8pt"/>
               </w:rPr>
               <w:t xml:space="default">†</w:t>
             </w:r>
@@ -5302,7 +5373,7 @@
             <w:r>
               <w:rPr>
                 <w:rFonts w:ascii="Calibri" w:hAnsi="Calibri"/>
-                <w:sz w:val="20"/>
+                <w:sz w:val="8pt"/>
               </w:rPr>
               <w:t xml:space="default"/>
             </w:r>
@@ -5326,7 +5397,7 @@
             <w:r>
               <w:rPr>
                 <w:rFonts w:ascii="Calibri" w:hAnsi="Calibri"/>
-                <w:sz w:val="20"/>
+                <w:sz w:val="8pt"/>
               </w:rPr>
               <w:t xml:space="default"/>
             </w:r>
@@ -5350,7 +5421,7 @@
             <w:r>
               <w:rPr>
                 <w:rFonts w:ascii="Calibri" w:hAnsi="Calibri"/>
-                <w:sz w:val="20"/>
+                <w:sz w:val="8pt"/>
               </w:rPr>
               <w:t xml:space="default">0</w:t>
             </w:r>
@@ -5374,7 +5445,7 @@
             <w:r>
               <w:rPr>
                 <w:rFonts w:ascii="Calibri" w:hAnsi="Calibri"/>
-                <w:sz w:val="20"/>
+                <w:sz w:val="8pt"/>
               </w:rPr>
               <w:t xml:space="default">0</w:t>
             </w:r>
@@ -5403,7 +5474,7 @@
             <w:r>
               <w:rPr>
                 <w:rFonts w:ascii="Calibri" w:hAnsi="Calibri"/>
-                <w:sz w:val="20"/>
+                <w:sz w:val="8pt"/>
               </w:rPr>
               <w:t xml:space="default">3</w:t>
             </w:r>
@@ -5427,7 +5498,7 @@
             <w:r>
               <w:rPr>
                 <w:rFonts w:ascii="Calibri" w:hAnsi="Calibri"/>
-                <w:sz w:val="20"/>
+                <w:sz w:val="8pt"/>
               </w:rPr>
               <w:t xml:space="default"/>
             </w:r>
@@ -5451,7 +5522,7 @@
             <w:r>
               <w:rPr>
                 <w:rFonts w:ascii="Calibri" w:hAnsi="Calibri"/>
-                <w:sz w:val="20"/>
+                <w:sz w:val="8pt"/>
               </w:rPr>
               <w:t xml:space="default"/>
             </w:r>
@@ -5475,7 +5546,7 @@
             <w:r>
               <w:rPr>
                 <w:rFonts w:ascii="Calibri" w:hAnsi="Calibri"/>
-                <w:sz w:val="20"/>
+                <w:sz w:val="8pt"/>
               </w:rPr>
               <w:t xml:space="default">*</w:t>
             </w:r>
@@ -5499,7 +5570,7 @@
             <w:r>
               <w:rPr>
                 <w:rFonts w:ascii="Calibri" w:hAnsi="Calibri"/>
-                <w:sz w:val="20"/>
+                <w:sz w:val="8pt"/>
               </w:rPr>
               <w:t xml:space="default">*</w:t>
             </w:r>
@@ -5523,7 +5594,7 @@
             <w:r>
               <w:rPr>
                 <w:rFonts w:ascii="Calibri" w:hAnsi="Calibri"/>
-                <w:sz w:val="20"/>
+                <w:sz w:val="8pt"/>
               </w:rPr>
               <w:t xml:space="default"/>
             </w:r>
@@ -5547,7 +5618,7 @@
             <w:r>
               <w:rPr>
                 <w:rFonts w:ascii="Calibri" w:hAnsi="Calibri"/>
-                <w:sz w:val="20"/>
+                <w:sz w:val="8pt"/>
               </w:rPr>
               <w:t xml:space="default">†</w:t>
             </w:r>
@@ -5571,7 +5642,7 @@
             <w:r>
               <w:rPr>
                 <w:rFonts w:ascii="Calibri" w:hAnsi="Calibri"/>
-                <w:sz w:val="20"/>
+                <w:sz w:val="8pt"/>
               </w:rPr>
               <w:t xml:space="default"/>
             </w:r>
@@ -5595,7 +5666,7 @@
             <w:r>
               <w:rPr>
                 <w:rFonts w:ascii="Calibri" w:hAnsi="Calibri"/>
-                <w:sz w:val="20"/>
+                <w:sz w:val="8pt"/>
               </w:rPr>
               <w:t xml:space="default"/>
             </w:r>
@@ -5619,7 +5690,7 @@
             <w:r>
               <w:rPr>
                 <w:rFonts w:ascii="Calibri" w:hAnsi="Calibri"/>
-                <w:sz w:val="20"/>
+                <w:sz w:val="8pt"/>
               </w:rPr>
               <w:t xml:space="default">0</w:t>
             </w:r>
@@ -5643,7 +5714,7 @@
             <w:r>
               <w:rPr>
                 <w:rFonts w:ascii="Calibri" w:hAnsi="Calibri"/>
-                <w:sz w:val="20"/>
+                <w:sz w:val="8pt"/>
               </w:rPr>
               <w:t xml:space="default">0</w:t>
             </w:r>
@@ -5672,7 +5743,7 @@
             <w:r>
               <w:rPr>
                 <w:rFonts w:ascii="Calibri" w:hAnsi="Calibri"/>
-                <w:sz w:val="20"/>
+                <w:sz w:val="8pt"/>
               </w:rPr>
               <w:t xml:space="default">4</w:t>
             </w:r>
@@ -5696,7 +5767,7 @@
             <w:r>
               <w:rPr>
                 <w:rFonts w:ascii="Calibri" w:hAnsi="Calibri"/>
-                <w:sz w:val="20"/>
+                <w:sz w:val="8pt"/>
               </w:rPr>
               <w:t xml:space="default">DxPr</w:t>
             </w:r>
@@ -5720,7 +5791,7 @@
             <w:r>
               <w:rPr>
                 <w:rFonts w:ascii="Calibri" w:hAnsi="Calibri"/>
-                <w:sz w:val="20"/>
+                <w:sz w:val="8pt"/>
               </w:rPr>
               <w:t xml:space="default">DxPr</w:t>
             </w:r>
@@ -5744,7 +5815,7 @@
             <w:r>
               <w:rPr>
                 <w:rFonts w:ascii="Calibri" w:hAnsi="Calibri"/>
-                <w:sz w:val="20"/>
+                <w:sz w:val="8pt"/>
               </w:rPr>
               <w:t xml:space="default"/>
             </w:r>
@@ -5768,7 +5839,7 @@
             <w:r>
               <w:rPr>
                 <w:rFonts w:ascii="Calibri" w:hAnsi="Calibri"/>
-                <w:sz w:val="20"/>
+                <w:sz w:val="8pt"/>
               </w:rPr>
               <w:t xml:space="default">Tech</w:t>
             </w:r>
@@ -5792,7 +5863,7 @@
             <w:r>
               <w:rPr>
                 <w:rFonts w:ascii="Calibri" w:hAnsi="Calibri"/>
-                <w:sz w:val="20"/>
+                <w:sz w:val="8pt"/>
               </w:rPr>
               <w:t xml:space="default"/>
             </w:r>
@@ -5816,7 +5887,7 @@
             <w:r>
               <w:rPr>
                 <w:rFonts w:ascii="Calibri" w:hAnsi="Calibri"/>
-                <w:sz w:val="20"/>
+                <w:sz w:val="8pt"/>
               </w:rPr>
               <w:t xml:space="default">Tech</w:t>
             </w:r>
@@ -5840,7 +5911,7 @@
             <w:r>
               <w:rPr>
                 <w:rFonts w:ascii="Calibri" w:hAnsi="Calibri"/>
-                <w:sz w:val="20"/>
+                <w:sz w:val="8pt"/>
               </w:rPr>
               <w:t xml:space="default"/>
             </w:r>
@@ -5864,7 +5935,7 @@
             <w:r>
               <w:rPr>
                 <w:rFonts w:ascii="Calibri" w:hAnsi="Calibri"/>
-                <w:sz w:val="20"/>
+                <w:sz w:val="8pt"/>
               </w:rPr>
               <w:t xml:space="default">1</w:t>
             </w:r>
@@ -5888,7 +5959,7 @@
             <w:r>
               <w:rPr>
                 <w:rFonts w:ascii="Calibri" w:hAnsi="Calibri"/>
-                <w:sz w:val="20"/>
+                <w:sz w:val="8pt"/>
               </w:rPr>
               <w:t xml:space="default">1</w:t>
             </w:r>
@@ -5912,7 +5983,7 @@
             <w:r>
               <w:rPr>
                 <w:rFonts w:ascii="Calibri" w:hAnsi="Calibri"/>
-                <w:sz w:val="20"/>
+                <w:sz w:val="8pt"/>
               </w:rPr>
               <w:t xml:space="default">3</w:t>
             </w:r>
@@ -5941,7 +6012,7 @@
             <w:r>
               <w:rPr>
                 <w:rFonts w:ascii="Calibri" w:hAnsi="Calibri"/>
-                <w:sz w:val="20"/>
+                <w:sz w:val="8pt"/>
               </w:rPr>
               <w:t xml:space="default">5</w:t>
             </w:r>
@@ -5965,7 +6036,7 @@
             <w:r>
               <w:rPr>
                 <w:rFonts w:ascii="Calibri" w:hAnsi="Calibri"/>
-                <w:sz w:val="20"/>
+                <w:sz w:val="8pt"/>
               </w:rPr>
               <w:t xml:space="default">DxPr</w:t>
             </w:r>
@@ -5989,7 +6060,7 @@
             <w:r>
               <w:rPr>
                 <w:rFonts w:ascii="Calibri" w:hAnsi="Calibri"/>
-                <w:sz w:val="20"/>
+                <w:sz w:val="8pt"/>
               </w:rPr>
               <w:t xml:space="default">DxPr</w:t>
             </w:r>
@@ -6013,7 +6084,7 @@
             <w:r>
               <w:rPr>
                 <w:rFonts w:ascii="Calibri" w:hAnsi="Calibri"/>
-                <w:sz w:val="20"/>
+                <w:sz w:val="8pt"/>
               </w:rPr>
               <w:t xml:space="default"/>
             </w:r>
@@ -6037,7 +6108,7 @@
             <w:r>
               <w:rPr>
                 <w:rFonts w:ascii="Calibri" w:hAnsi="Calibri"/>
-                <w:sz w:val="20"/>
+                <w:sz w:val="8pt"/>
               </w:rPr>
               <w:t xml:space="default">Tech</w:t>
             </w:r>
@@ -6061,7 +6132,7 @@
             <w:r>
               <w:rPr>
                 <w:rFonts w:ascii="Calibri" w:hAnsi="Calibri"/>
-                <w:sz w:val="20"/>
+                <w:sz w:val="8pt"/>
               </w:rPr>
               <w:t xml:space="default"/>
             </w:r>
@@ -6085,7 +6156,7 @@
             <w:r>
               <w:rPr>
                 <w:rFonts w:ascii="Calibri" w:hAnsi="Calibri"/>
-                <w:sz w:val="20"/>
+                <w:sz w:val="8pt"/>
               </w:rPr>
               <w:t xml:space="default">Tech</w:t>
             </w:r>
@@ -6109,7 +6180,7 @@
             <w:r>
               <w:rPr>
                 <w:rFonts w:ascii="Calibri" w:hAnsi="Calibri"/>
-                <w:sz w:val="20"/>
+                <w:sz w:val="8pt"/>
               </w:rPr>
               <w:t xml:space="default"/>
             </w:r>
@@ -6133,7 +6204,7 @@
             <w:r>
               <w:rPr>
                 <w:rFonts w:ascii="Calibri" w:hAnsi="Calibri"/>
-                <w:sz w:val="20"/>
+                <w:sz w:val="8pt"/>
               </w:rPr>
               <w:t xml:space="default">1</w:t>
             </w:r>
@@ -6157,7 +6228,7 @@
             <w:r>
               <w:rPr>
                 <w:rFonts w:ascii="Calibri" w:hAnsi="Calibri"/>
-                <w:sz w:val="20"/>
+                <w:sz w:val="8pt"/>
               </w:rPr>
               <w:t xml:space="default">1</w:t>
             </w:r>
@@ -6181,7 +6252,7 @@
             <w:r>
               <w:rPr>
                 <w:rFonts w:ascii="Calibri" w:hAnsi="Calibri"/>
-                <w:sz w:val="20"/>
+                <w:sz w:val="8pt"/>
               </w:rPr>
               <w:t xml:space="default">3</w:t>
             </w:r>
@@ -6210,7 +6281,7 @@
             <w:r>
               <w:rPr>
                 <w:rFonts w:ascii="Calibri" w:hAnsi="Calibri"/>
-                <w:sz w:val="20"/>
+                <w:sz w:val="8pt"/>
               </w:rPr>
               <w:t xml:space="default">6</w:t>
             </w:r>
@@ -6234,7 +6305,7 @@
             <w:r>
               <w:rPr>
                 <w:rFonts w:ascii="Calibri" w:hAnsi="Calibri"/>
-                <w:sz w:val="20"/>
+                <w:sz w:val="8pt"/>
               </w:rPr>
               <w:t xml:space="default">DxPr</w:t>
             </w:r>
@@ -6258,7 +6329,7 @@
             <w:r>
               <w:rPr>
                 <w:rFonts w:ascii="Calibri" w:hAnsi="Calibri"/>
-                <w:sz w:val="20"/>
+                <w:sz w:val="8pt"/>
               </w:rPr>
               <w:t xml:space="default">DxPr</w:t>
             </w:r>
@@ -6282,7 +6353,7 @@
             <w:r>
               <w:rPr>
                 <w:rFonts w:ascii="Calibri" w:hAnsi="Calibri"/>
-                <w:sz w:val="20"/>
+                <w:sz w:val="8pt"/>
               </w:rPr>
               <w:t xml:space="default"/>
             </w:r>
@@ -6306,7 +6377,7 @@
             <w:r>
               <w:rPr>
                 <w:rFonts w:ascii="Calibri" w:hAnsi="Calibri"/>
-                <w:sz w:val="20"/>
+                <w:sz w:val="8pt"/>
               </w:rPr>
               <w:t xml:space="default">Tech</w:t>
             </w:r>
@@ -6330,7 +6401,7 @@
             <w:r>
               <w:rPr>
                 <w:rFonts w:ascii="Calibri" w:hAnsi="Calibri"/>
-                <w:sz w:val="20"/>
+                <w:sz w:val="8pt"/>
               </w:rPr>
               <w:t xml:space="default">DxPr</w:t>
             </w:r>
@@ -6354,7 +6425,7 @@
             <w:r>
               <w:rPr>
                 <w:rFonts w:ascii="Calibri" w:hAnsi="Calibri"/>
-                <w:sz w:val="20"/>
+                <w:sz w:val="8pt"/>
               </w:rPr>
               <w:t xml:space="default">DxPrTech</w:t>
             </w:r>
@@ -6378,7 +6449,7 @@
             <w:r>
               <w:rPr>
                 <w:rFonts w:ascii="Calibri" w:hAnsi="Calibri"/>
-                <w:sz w:val="20"/>
+                <w:sz w:val="8pt"/>
               </w:rPr>
               <w:t xml:space="default"/>
             </w:r>
@@ -6402,7 +6473,7 @@
             <w:r>
               <w:rPr>
                 <w:rFonts w:ascii="Calibri" w:hAnsi="Calibri"/>
-                <w:sz w:val="20"/>
+                <w:sz w:val="8pt"/>
               </w:rPr>
               <w:t xml:space="default">1</w:t>
             </w:r>
@@ -6426,7 +6497,7 @@
             <w:r>
               <w:rPr>
                 <w:rFonts w:ascii="Calibri" w:hAnsi="Calibri"/>
-                <w:sz w:val="20"/>
+                <w:sz w:val="8pt"/>
               </w:rPr>
               <w:t xml:space="default">2</w:t>
             </w:r>
@@ -6450,7 +6521,7 @@
             <w:r>
               <w:rPr>
                 <w:rFonts w:ascii="Calibri" w:hAnsi="Calibri"/>
-                <w:sz w:val="20"/>
+                <w:sz w:val="8pt"/>
               </w:rPr>
               <w:t xml:space="default">3</w:t>
             </w:r>
@@ -6479,7 +6550,7 @@
             <w:r>
               <w:rPr>
                 <w:rFonts w:ascii="Calibri" w:hAnsi="Calibri"/>
-                <w:sz w:val="20"/>
+                <w:sz w:val="8pt"/>
               </w:rPr>
               <w:t xml:space="default">7</w:t>
             </w:r>
@@ -6503,7 +6574,7 @@
             <w:r>
               <w:rPr>
                 <w:rFonts w:ascii="Calibri" w:hAnsi="Calibri"/>
-                <w:sz w:val="20"/>
+                <w:sz w:val="8pt"/>
               </w:rPr>
               <w:t xml:space="default">DxPr</w:t>
             </w:r>
@@ -6527,7 +6598,7 @@
             <w:r>
               <w:rPr>
                 <w:rFonts w:ascii="Calibri" w:hAnsi="Calibri"/>
-                <w:sz w:val="20"/>
+                <w:sz w:val="8pt"/>
               </w:rPr>
               <w:t xml:space="default">DxPr</w:t>
             </w:r>
@@ -6551,7 +6622,7 @@
             <w:r>
               <w:rPr>
                 <w:rFonts w:ascii="Calibri" w:hAnsi="Calibri"/>
-                <w:sz w:val="20"/>
+                <w:sz w:val="8pt"/>
               </w:rPr>
               <w:t xml:space="default"/>
             </w:r>
@@ -6575,7 +6646,7 @@
             <w:r>
               <w:rPr>
                 <w:rFonts w:ascii="Calibri" w:hAnsi="Calibri"/>
-                <w:sz w:val="20"/>
+                <w:sz w:val="8pt"/>
               </w:rPr>
               <w:t xml:space="default">Tech</w:t>
             </w:r>
@@ -6599,7 +6670,7 @@
             <w:r>
               <w:rPr>
                 <w:rFonts w:ascii="Calibri" w:hAnsi="Calibri"/>
-                <w:sz w:val="20"/>
+                <w:sz w:val="8pt"/>
               </w:rPr>
               <w:t xml:space="default"/>
             </w:r>
@@ -6623,7 +6694,7 @@
             <w:r>
               <w:rPr>
                 <w:rFonts w:ascii="Calibri" w:hAnsi="Calibri"/>
-                <w:sz w:val="20"/>
+                <w:sz w:val="8pt"/>
               </w:rPr>
               <w:t xml:space="default">DxPrTech</w:t>
             </w:r>
@@ -6647,7 +6718,7 @@
             <w:r>
               <w:rPr>
                 <w:rFonts w:ascii="Calibri" w:hAnsi="Calibri"/>
-                <w:sz w:val="20"/>
+                <w:sz w:val="8pt"/>
               </w:rPr>
               <w:t xml:space="default"/>
             </w:r>
@@ -6671,7 +6742,7 @@
             <w:r>
               <w:rPr>
                 <w:rFonts w:ascii="Calibri" w:hAnsi="Calibri"/>
-                <w:sz w:val="20"/>
+                <w:sz w:val="8pt"/>
               </w:rPr>
               <w:t xml:space="default">1</w:t>
             </w:r>
@@ -6695,7 +6766,7 @@
             <w:r>
               <w:rPr>
                 <w:rFonts w:ascii="Calibri" w:hAnsi="Calibri"/>
-                <w:sz w:val="20"/>
+                <w:sz w:val="8pt"/>
               </w:rPr>
               <w:t xml:space="default">1</w:t>
             </w:r>
@@ -6719,7 +6790,7 @@
             <w:r>
               <w:rPr>
                 <w:rFonts w:ascii="Calibri" w:hAnsi="Calibri"/>
-                <w:sz w:val="20"/>
+                <w:sz w:val="8pt"/>
               </w:rPr>
               <w:t xml:space="default">3</w:t>
             </w:r>
@@ -6748,7 +6819,7 @@
             <w:r>
               <w:rPr>
                 <w:rFonts w:ascii="Calibri" w:hAnsi="Calibri"/>
-                <w:sz w:val="20"/>
+                <w:sz w:val="8pt"/>
               </w:rPr>
               <w:t xml:space="default">8</w:t>
             </w:r>
@@ -6772,7 +6843,7 @@
             <w:r>
               <w:rPr>
                 <w:rFonts w:ascii="Calibri" w:hAnsi="Calibri"/>
-                <w:sz w:val="20"/>
+                <w:sz w:val="8pt"/>
               </w:rPr>
               <w:t xml:space="default">DxPr</w:t>
             </w:r>
@@ -6796,7 +6867,7 @@
             <w:r>
               <w:rPr>
                 <w:rFonts w:ascii="Calibri" w:hAnsi="Calibri"/>
-                <w:sz w:val="20"/>
+                <w:sz w:val="8pt"/>
               </w:rPr>
               <w:t xml:space="default">DxPr</w:t>
             </w:r>
@@ -6820,7 +6891,7 @@
             <w:r>
               <w:rPr>
                 <w:rFonts w:ascii="Calibri" w:hAnsi="Calibri"/>
-                <w:sz w:val="20"/>
+                <w:sz w:val="8pt"/>
               </w:rPr>
               <w:t xml:space="default"/>
             </w:r>
@@ -6844,7 +6915,7 @@
             <w:r>
               <w:rPr>
                 <w:rFonts w:ascii="Calibri" w:hAnsi="Calibri"/>
-                <w:sz w:val="20"/>
+                <w:sz w:val="8pt"/>
               </w:rPr>
               <w:t xml:space="default">Tech</w:t>
             </w:r>
@@ -6868,7 +6939,7 @@
             <w:r>
               <w:rPr>
                 <w:rFonts w:ascii="Calibri" w:hAnsi="Calibri"/>
-                <w:sz w:val="20"/>
+                <w:sz w:val="8pt"/>
               </w:rPr>
               <w:t xml:space="default"/>
             </w:r>
@@ -6892,7 +6963,7 @@
             <w:r>
               <w:rPr>
                 <w:rFonts w:ascii="Calibri" w:hAnsi="Calibri"/>
-                <w:sz w:val="20"/>
+                <w:sz w:val="8pt"/>
               </w:rPr>
               <w:t xml:space="default">DxPrTech</w:t>
             </w:r>
@@ -6916,7 +6987,7 @@
             <w:r>
               <w:rPr>
                 <w:rFonts w:ascii="Calibri" w:hAnsi="Calibri"/>
-                <w:sz w:val="20"/>
+                <w:sz w:val="8pt"/>
               </w:rPr>
               <w:t xml:space="default"/>
             </w:r>
@@ -6940,7 +7011,7 @@
             <w:r>
               <w:rPr>
                 <w:rFonts w:ascii="Calibri" w:hAnsi="Calibri"/>
-                <w:sz w:val="20"/>
+                <w:sz w:val="8pt"/>
               </w:rPr>
               <w:t xml:space="default">1</w:t>
             </w:r>
@@ -6964,7 +7035,7 @@
             <w:r>
               <w:rPr>
                 <w:rFonts w:ascii="Calibri" w:hAnsi="Calibri"/>
-                <w:sz w:val="20"/>
+                <w:sz w:val="8pt"/>
               </w:rPr>
               <w:t xml:space="default">1</w:t>
             </w:r>
@@ -6988,7 +7059,7 @@
             <w:r>
               <w:rPr>
                 <w:rFonts w:ascii="Calibri" w:hAnsi="Calibri"/>
-                <w:sz w:val="20"/>
+                <w:sz w:val="8pt"/>
               </w:rPr>
               <w:t xml:space="default">3</w:t>
             </w:r>
@@ -7017,7 +7088,7 @@
             <w:r>
               <w:rPr>
                 <w:rFonts w:ascii="Calibri" w:hAnsi="Calibri"/>
-                <w:sz w:val="20"/>
+                <w:sz w:val="8pt"/>
               </w:rPr>
               <w:t xml:space="default">9</w:t>
             </w:r>
@@ -7041,7 +7112,7 @@
             <w:r>
               <w:rPr>
                 <w:rFonts w:ascii="Calibri" w:hAnsi="Calibri"/>
-                <w:sz w:val="20"/>
+                <w:sz w:val="8pt"/>
               </w:rPr>
               <w:t xml:space="default">DxPr</w:t>
             </w:r>
@@ -7065,7 +7136,7 @@
             <w:r>
               <w:rPr>
                 <w:rFonts w:ascii="Calibri" w:hAnsi="Calibri"/>
-                <w:sz w:val="20"/>
+                <w:sz w:val="8pt"/>
               </w:rPr>
               <w:t xml:space="default">DxPr</w:t>
             </w:r>
@@ -7089,7 +7160,7 @@
             <w:r>
               <w:rPr>
                 <w:rFonts w:ascii="Calibri" w:hAnsi="Calibri"/>
-                <w:sz w:val="20"/>
+                <w:sz w:val="8pt"/>
               </w:rPr>
               <w:t xml:space="default"/>
             </w:r>
@@ -7113,7 +7184,7 @@
             <w:r>
               <w:rPr>
                 <w:rFonts w:ascii="Calibri" w:hAnsi="Calibri"/>
-                <w:sz w:val="20"/>
+                <w:sz w:val="8pt"/>
               </w:rPr>
               <w:t xml:space="default">Tech</w:t>
             </w:r>
@@ -7137,7 +7208,7 @@
             <w:r>
               <w:rPr>
                 <w:rFonts w:ascii="Calibri" w:hAnsi="Calibri"/>
-                <w:sz w:val="20"/>
+                <w:sz w:val="8pt"/>
               </w:rPr>
               <w:t xml:space="default"/>
             </w:r>
@@ -7161,7 +7232,7 @@
             <w:r>
               <w:rPr>
                 <w:rFonts w:ascii="Calibri" w:hAnsi="Calibri"/>
-                <w:sz w:val="20"/>
+                <w:sz w:val="8pt"/>
               </w:rPr>
               <w:t xml:space="default">DxPrTech</w:t>
             </w:r>
@@ -7185,7 +7256,7 @@
             <w:r>
               <w:rPr>
                 <w:rFonts w:ascii="Calibri" w:hAnsi="Calibri"/>
-                <w:sz w:val="20"/>
+                <w:sz w:val="8pt"/>
               </w:rPr>
               <w:t xml:space="default"/>
             </w:r>
@@ -7209,7 +7280,7 @@
             <w:r>
               <w:rPr>
                 <w:rFonts w:ascii="Calibri" w:hAnsi="Calibri"/>
-                <w:sz w:val="20"/>
+                <w:sz w:val="8pt"/>
               </w:rPr>
               <w:t xml:space="default">1</w:t>
             </w:r>
@@ -7233,7 +7304,7 @@
             <w:r>
               <w:rPr>
                 <w:rFonts w:ascii="Calibri" w:hAnsi="Calibri"/>
-                <w:sz w:val="20"/>
+                <w:sz w:val="8pt"/>
               </w:rPr>
               <w:t xml:space="default">1</w:t>
             </w:r>
@@ -7257,7 +7328,7 @@
             <w:r>
               <w:rPr>
                 <w:rFonts w:ascii="Calibri" w:hAnsi="Calibri"/>
-                <w:sz w:val="20"/>
+                <w:sz w:val="8pt"/>
               </w:rPr>
               <w:t xml:space="default">3</w:t>
             </w:r>
@@ -7286,7 +7357,7 @@
             <w:r>
               <w:rPr>
                 <w:rFonts w:ascii="Calibri" w:hAnsi="Calibri"/>
-                <w:sz w:val="20"/>
+                <w:sz w:val="8pt"/>
               </w:rPr>
               <w:t xml:space="default">10</w:t>
             </w:r>
@@ -7310,7 +7381,7 @@
             <w:r>
               <w:rPr>
                 <w:rFonts w:ascii="Calibri" w:hAnsi="Calibri"/>
-                <w:sz w:val="20"/>
+                <w:sz w:val="8pt"/>
               </w:rPr>
               <w:t xml:space="default">DxPr</w:t>
             </w:r>
@@ -7334,7 +7405,7 @@
             <w:r>
               <w:rPr>
                 <w:rFonts w:ascii="Calibri" w:hAnsi="Calibri"/>
-                <w:sz w:val="20"/>
+                <w:sz w:val="8pt"/>
               </w:rPr>
               <w:t xml:space="default">DxPr</w:t>
             </w:r>
@@ -7358,7 +7429,7 @@
             <w:r>
               <w:rPr>
                 <w:rFonts w:ascii="Calibri" w:hAnsi="Calibri"/>
-                <w:sz w:val="20"/>
+                <w:sz w:val="8pt"/>
               </w:rPr>
               <w:t xml:space="default"/>
             </w:r>
@@ -7382,7 +7453,7 @@
             <w:r>
               <w:rPr>
                 <w:rFonts w:ascii="Calibri" w:hAnsi="Calibri"/>
-                <w:sz w:val="20"/>
+                <w:sz w:val="8pt"/>
               </w:rPr>
               <w:t xml:space="default">Tech</w:t>
             </w:r>
@@ -7406,7 +7477,7 @@
             <w:r>
               <w:rPr>
                 <w:rFonts w:ascii="Calibri" w:hAnsi="Calibri"/>
-                <w:sz w:val="20"/>
+                <w:sz w:val="8pt"/>
               </w:rPr>
               <w:t xml:space="default"/>
             </w:r>
@@ -7430,7 +7501,7 @@
             <w:r>
               <w:rPr>
                 <w:rFonts w:ascii="Calibri" w:hAnsi="Calibri"/>
-                <w:sz w:val="20"/>
+                <w:sz w:val="8pt"/>
               </w:rPr>
               <w:t xml:space="default">DxPrTech</w:t>
             </w:r>
@@ -7454,7 +7525,7 @@
             <w:r>
               <w:rPr>
                 <w:rFonts w:ascii="Calibri" w:hAnsi="Calibri"/>
-                <w:sz w:val="20"/>
+                <w:sz w:val="8pt"/>
               </w:rPr>
               <w:t xml:space="default"/>
             </w:r>
@@ -7478,7 +7549,7 @@
             <w:r>
               <w:rPr>
                 <w:rFonts w:ascii="Calibri" w:hAnsi="Calibri"/>
-                <w:sz w:val="20"/>
+                <w:sz w:val="8pt"/>
               </w:rPr>
               <w:t xml:space="default">1</w:t>
             </w:r>
@@ -7502,7 +7573,7 @@
             <w:r>
               <w:rPr>
                 <w:rFonts w:ascii="Calibri" w:hAnsi="Calibri"/>
-                <w:sz w:val="20"/>
+                <w:sz w:val="8pt"/>
               </w:rPr>
               <w:t xml:space="default">1</w:t>
             </w:r>
@@ -7526,7 +7597,7 @@
             <w:r>
               <w:rPr>
                 <w:rFonts w:ascii="Calibri" w:hAnsi="Calibri"/>
-                <w:sz w:val="20"/>
+                <w:sz w:val="8pt"/>
               </w:rPr>
               <w:t xml:space="default">3</w:t>
             </w:r>
@@ -7555,7 +7626,7 @@
             <w:r>
               <w:rPr>
                 <w:rFonts w:ascii="Calibri" w:hAnsi="Calibri"/>
-                <w:sz w:val="20"/>
+                <w:sz w:val="8pt"/>
               </w:rPr>
               <w:t xml:space="default">11</w:t>
             </w:r>
@@ -7579,7 +7650,7 @@
             <w:r>
               <w:rPr>
                 <w:rFonts w:ascii="Calibri" w:hAnsi="Calibri"/>
-                <w:sz w:val="20"/>
+                <w:sz w:val="8pt"/>
               </w:rPr>
               <w:t xml:space="default"/>
             </w:r>
@@ -7603,7 +7674,7 @@
             <w:r>
               <w:rPr>
                 <w:rFonts w:ascii="Calibri" w:hAnsi="Calibri"/>
-                <w:sz w:val="20"/>
+                <w:sz w:val="8pt"/>
               </w:rPr>
               <w:t xml:space="default">DxPr</w:t>
             </w:r>
@@ -7627,7 +7698,7 @@
             <w:r>
               <w:rPr>
                 <w:rFonts w:ascii="Calibri" w:hAnsi="Calibri"/>
-                <w:sz w:val="20"/>
+                <w:sz w:val="8pt"/>
               </w:rPr>
               <w:t xml:space="default"/>
             </w:r>
@@ -7651,7 +7722,7 @@
             <w:r>
               <w:rPr>
                 <w:rFonts w:ascii="Calibri" w:hAnsi="Calibri"/>
-                <w:sz w:val="20"/>
+                <w:sz w:val="8pt"/>
               </w:rPr>
               <w:t xml:space="default">Tech</w:t>
             </w:r>
@@ -7675,7 +7746,7 @@
             <w:r>
               <w:rPr>
                 <w:rFonts w:ascii="Calibri" w:hAnsi="Calibri"/>
-                <w:sz w:val="20"/>
+                <w:sz w:val="8pt"/>
               </w:rPr>
               <w:t xml:space="default"/>
             </w:r>
@@ -7699,7 +7770,7 @@
             <w:r>
               <w:rPr>
                 <w:rFonts w:ascii="Calibri" w:hAnsi="Calibri"/>
-                <w:sz w:val="20"/>
+                <w:sz w:val="8pt"/>
               </w:rPr>
               <w:t xml:space="default">DxPrTech</w:t>
             </w:r>
@@ -7723,7 +7794,7 @@
             <w:r>
               <w:rPr>
                 <w:rFonts w:ascii="Calibri" w:hAnsi="Calibri"/>
-                <w:sz w:val="20"/>
+                <w:sz w:val="8pt"/>
               </w:rPr>
               <w:t xml:space="default"/>
             </w:r>
@@ -7747,7 +7818,7 @@
             <w:r>
               <w:rPr>
                 <w:rFonts w:ascii="Calibri" w:hAnsi="Calibri"/>
-                <w:sz w:val="20"/>
+                <w:sz w:val="8pt"/>
               </w:rPr>
               <w:t xml:space="default">1</w:t>
             </w:r>
@@ -7771,7 +7842,7 @@
             <w:r>
               <w:rPr>
                 <w:rFonts w:ascii="Calibri" w:hAnsi="Calibri"/>
-                <w:sz w:val="20"/>
+                <w:sz w:val="8pt"/>
               </w:rPr>
               <w:t xml:space="default">0</w:t>
             </w:r>
@@ -7795,7 +7866,7 @@
             <w:r>
               <w:rPr>
                 <w:rFonts w:ascii="Calibri" w:hAnsi="Calibri"/>
-                <w:sz w:val="20"/>
+                <w:sz w:val="8pt"/>
               </w:rPr>
               <w:t xml:space="default">3</w:t>
             </w:r>
@@ -7824,7 +7895,7 @@
             <w:r>
               <w:rPr>
                 <w:rFonts w:ascii="Calibri" w:hAnsi="Calibri"/>
-                <w:sz w:val="20"/>
+                <w:sz w:val="8pt"/>
               </w:rPr>
               <w:t xml:space="default">12</w:t>
             </w:r>
@@ -7848,7 +7919,7 @@
             <w:r>
               <w:rPr>
                 <w:rFonts w:ascii="Calibri" w:hAnsi="Calibri"/>
-                <w:sz w:val="20"/>
+                <w:sz w:val="8pt"/>
               </w:rPr>
               <w:t xml:space="default"/>
             </w:r>
@@ -7872,7 +7943,7 @@
             <w:r>
               <w:rPr>
                 <w:rFonts w:ascii="Calibri" w:hAnsi="Calibri"/>
-                <w:sz w:val="20"/>
+                <w:sz w:val="8pt"/>
               </w:rPr>
               <w:t xml:space="default">DxPr</w:t>
             </w:r>
@@ -7896,7 +7967,7 @@
             <w:r>
               <w:rPr>
                 <w:rFonts w:ascii="Calibri" w:hAnsi="Calibri"/>
-                <w:sz w:val="20"/>
+                <w:sz w:val="8pt"/>
               </w:rPr>
               <w:t xml:space="default"/>
             </w:r>
@@ -7920,7 +7991,7 @@
             <w:r>
               <w:rPr>
                 <w:rFonts w:ascii="Calibri" w:hAnsi="Calibri"/>
-                <w:sz w:val="20"/>
+                <w:sz w:val="8pt"/>
               </w:rPr>
               <w:t xml:space="default">Tech</w:t>
             </w:r>
@@ -7944,7 +8015,7 @@
             <w:r>
               <w:rPr>
                 <w:rFonts w:ascii="Calibri" w:hAnsi="Calibri"/>
-                <w:sz w:val="20"/>
+                <w:sz w:val="8pt"/>
               </w:rPr>
               <w:t xml:space="default"/>
             </w:r>
@@ -7968,7 +8039,7 @@
             <w:r>
               <w:rPr>
                 <w:rFonts w:ascii="Calibri" w:hAnsi="Calibri"/>
-                <w:sz w:val="20"/>
+                <w:sz w:val="8pt"/>
               </w:rPr>
               <w:t xml:space="default">DxPrTech</w:t>
             </w:r>
@@ -7992,7 +8063,7 @@
             <w:r>
               <w:rPr>
                 <w:rFonts w:ascii="Calibri" w:hAnsi="Calibri"/>
-                <w:sz w:val="20"/>
+                <w:sz w:val="8pt"/>
               </w:rPr>
               <w:t xml:space="default"/>
             </w:r>
@@ -8016,7 +8087,7 @@
             <w:r>
               <w:rPr>
                 <w:rFonts w:ascii="Calibri" w:hAnsi="Calibri"/>
-                <w:sz w:val="20"/>
+                <w:sz w:val="8pt"/>
               </w:rPr>
               <w:t xml:space="default">1</w:t>
             </w:r>
@@ -8040,7 +8111,7 @@
             <w:r>
               <w:rPr>
                 <w:rFonts w:ascii="Calibri" w:hAnsi="Calibri"/>
-                <w:sz w:val="20"/>
+                <w:sz w:val="8pt"/>
               </w:rPr>
               <w:t xml:space="default">0</w:t>
             </w:r>
@@ -8064,7 +8135,7 @@
             <w:r>
               <w:rPr>
                 <w:rFonts w:ascii="Calibri" w:hAnsi="Calibri"/>
-                <w:sz w:val="20"/>
+                <w:sz w:val="8pt"/>
               </w:rPr>
               <w:t xml:space="default">3</w:t>
             </w:r>
@@ -8093,7 +8164,7 @@
             <w:r>
               <w:rPr>
                 <w:rFonts w:ascii="Calibri" w:hAnsi="Calibri"/>
-                <w:sz w:val="20"/>
+                <w:sz w:val="8pt"/>
               </w:rPr>
               <w:t xml:space="default">13</w:t>
             </w:r>
@@ -8117,7 +8188,7 @@
             <w:r>
               <w:rPr>
                 <w:rFonts w:ascii="Calibri" w:hAnsi="Calibri"/>
-                <w:sz w:val="20"/>
+                <w:sz w:val="8pt"/>
               </w:rPr>
               <w:t xml:space="default">DxPr</w:t>
             </w:r>
@@ -8141,7 +8212,7 @@
             <w:r>
               <w:rPr>
                 <w:rFonts w:ascii="Calibri" w:hAnsi="Calibri"/>
-                <w:sz w:val="20"/>
+                <w:sz w:val="8pt"/>
               </w:rPr>
               <w:t xml:space="default">DxPr</w:t>
             </w:r>
@@ -8165,7 +8236,7 @@
             <w:r>
               <w:rPr>
                 <w:rFonts w:ascii="Calibri" w:hAnsi="Calibri"/>
-                <w:sz w:val="20"/>
+                <w:sz w:val="8pt"/>
               </w:rPr>
               <w:t xml:space="default"/>
             </w:r>
@@ -8189,7 +8260,7 @@
             <w:r>
               <w:rPr>
                 <w:rFonts w:ascii="Calibri" w:hAnsi="Calibri"/>
-                <w:sz w:val="20"/>
+                <w:sz w:val="8pt"/>
               </w:rPr>
               <w:t xml:space="default">Tech</w:t>
             </w:r>
@@ -8213,7 +8284,7 @@
             <w:r>
               <w:rPr>
                 <w:rFonts w:ascii="Calibri" w:hAnsi="Calibri"/>
-                <w:sz w:val="20"/>
+                <w:sz w:val="8pt"/>
               </w:rPr>
               <w:t xml:space="default">Tech</w:t>
             </w:r>
@@ -8237,7 +8308,7 @@
             <w:r>
               <w:rPr>
                 <w:rFonts w:ascii="Calibri" w:hAnsi="Calibri"/>
-                <w:sz w:val="20"/>
+                <w:sz w:val="8pt"/>
               </w:rPr>
               <w:t xml:space="default">DxPrTech</w:t>
             </w:r>
@@ -8261,7 +8332,7 @@
             <w:r>
               <w:rPr>
                 <w:rFonts w:ascii="Calibri" w:hAnsi="Calibri"/>
-                <w:sz w:val="20"/>
+                <w:sz w:val="8pt"/>
               </w:rPr>
               <w:t xml:space="default">1</w:t>
             </w:r>
@@ -8285,7 +8356,7 @@
             <w:r>
               <w:rPr>
                 <w:rFonts w:ascii="Calibri" w:hAnsi="Calibri"/>
-                <w:sz w:val="20"/>
+                <w:sz w:val="8pt"/>
               </w:rPr>
               <w:t xml:space="default">1</w:t>
             </w:r>
@@ -8309,7 +8380,7 @@
             <w:r>
               <w:rPr>
                 <w:rFonts w:ascii="Calibri" w:hAnsi="Calibri"/>
-                <w:sz w:val="20"/>
+                <w:sz w:val="8pt"/>
               </w:rPr>
               <w:t xml:space="default">2</w:t>
             </w:r>
@@ -8333,7 +8404,7 @@
             <w:r>
               <w:rPr>
                 <w:rFonts w:ascii="Calibri" w:hAnsi="Calibri"/>
-                <w:sz w:val="20"/>
+                <w:sz w:val="8pt"/>
               </w:rPr>
               <w:t xml:space="default">3</w:t>
             </w:r>
@@ -8392,7 +8463,7 @@
         <w:pStyle w:val="BodyText"/>
       </w:pPr>
       <w:r>
-        <w:t xml:space="preserve">In the supplement is a detailed exploration of the flags produced by</w:t>
+        <w:t xml:space="preserve">The supplement includes a detailed exploration of the flags produced by</w:t>
       </w:r>
       <w:r>
         <w:t xml:space="preserve"> </w:t>
@@ -8407,7 +8478,7 @@
         <w:t xml:space="preserve"> </w:t>
       </w:r>
       <w:r>
-        <w:t xml:space="preserve">versus the code from MIMIC-IV, and the R</w:t>
+        <w:t xml:space="preserve">versus the code from MIMIC-IV and the R</w:t>
       </w:r>
       <w:r>
         <w:t xml:space="preserve"> </w:t>
@@ -8653,7 +8724,23 @@
         <w:pStyle w:val="BodyText"/>
       </w:pPr>
       <w:r>
-        <w:t xml:space="preserve">In addition to the comorbidity interface, medicalcoder provides several ICD</w:t>
+        <w:t xml:space="preserve">In addition to the comorbidity interface,</w:t>
+      </w:r>
+      <w:r>
+        <w:t xml:space="preserve"> </w:t>
+      </w:r>
+      <w:r>
+        <w:rPr>
+          <w:i/>
+          <w:iCs/>
+        </w:rPr>
+        <w:t xml:space="preserve">medicalcoder</w:t>
+      </w:r>
+      <w:r>
+        <w:t xml:space="preserve"> </w:t>
+      </w:r>
+      <w:r>
+        <w:t xml:space="preserve">provides several ICD</w:t>
       </w:r>
       <w:r>
         <w:t xml:space="preserve"> </w:t>
@@ -8740,8 +8827,8 @@
         <w:t xml:space="preserve">algorithms.</w:t>
       </w:r>
     </w:p>
-    <w:bookmarkEnd w:id="30"/>
-    <w:bookmarkStart w:id="32" w:name="discussion"/>
+    <w:bookmarkEnd w:id="19"/>
+    <w:bookmarkStart w:id="21" w:name="discussion"/>
     <w:p>
       <w:pPr>
         <w:pStyle w:val="Heading1"/>
@@ -8848,7 +8935,23 @@
         <w:t xml:space="preserve"> </w:t>
       </w:r>
       <w:r>
-        <w:t xml:space="preserve">on base R ensures that medicalcoder can be installed and used wherever R ≥ 3.5.0</w:t>
+        <w:t xml:space="preserve">on base R ensures that</w:t>
+      </w:r>
+      <w:r>
+        <w:t xml:space="preserve"> </w:t>
+      </w:r>
+      <w:r>
+        <w:rPr>
+          <w:i/>
+          <w:iCs/>
+        </w:rPr>
+        <w:t xml:space="preserve">medicalcoder</w:t>
+      </w:r>
+      <w:r>
+        <w:t xml:space="preserve"> </w:t>
+      </w:r>
+      <w:r>
+        <w:t xml:space="preserve">can be installed and used wherever R ≥ 3.5.0</w:t>
       </w:r>
       <w:r>
         <w:t xml:space="preserve"> </w:t>
@@ -8860,7 +8963,20 @@
         <w:t xml:space="preserve"> </w:t>
       </w:r>
       <w:r>
-        <w:t xml:space="preserve">common barriers to reproducible research. medicalcoder, with no additional</w:t>
+        <w:t xml:space="preserve">common barriers to reproducible research.</w:t>
+      </w:r>
+      <w:r>
+        <w:t xml:space="preserve"> </w:t>
+      </w:r>
+      <w:r>
+        <w:rPr>
+          <w:i/>
+          <w:iCs/>
+        </w:rPr>
+        <w:t xml:space="preserve">medicalcoder</w:t>
+      </w:r>
+      <w:r>
+        <w:t xml:space="preserve">, with no additional</w:t>
       </w:r>
       <w:r>
         <w:t xml:space="preserve"> </w:t>
@@ -9034,7 +9150,23 @@
         <w:pStyle w:val="BodyText"/>
       </w:pPr>
       <w:r>
-        <w:t xml:space="preserve">Although the primary focus of medicalcoder is comorbidity classification, the</w:t>
+        <w:t xml:space="preserve">Although the primary focus of</w:t>
+      </w:r>
+      <w:r>
+        <w:t xml:space="preserve"> </w:t>
+      </w:r>
+      <w:r>
+        <w:rPr>
+          <w:i/>
+          <w:iCs/>
+        </w:rPr>
+        <w:t xml:space="preserve">medicalcoder</w:t>
+      </w:r>
+      <w:r>
+        <w:t xml:space="preserve"> </w:t>
+      </w:r>
+      <w:r>
+        <w:t xml:space="preserve">is comorbidity classification, the</w:t>
       </w:r>
       <w:r>
         <w:t xml:space="preserve"> </w:t>
@@ -9064,7 +9196,23 @@
         <w:t xml:space="preserve"> </w:t>
       </w:r>
       <w:r>
-        <w:t xml:space="preserve">is_icd(), medicalcoder allows analysts to perform exploratory and preprocessing</w:t>
+        <w:t xml:space="preserve">is_icd(),</w:t>
+      </w:r>
+      <w:r>
+        <w:t xml:space="preserve"> </w:t>
+      </w:r>
+      <w:r>
+        <w:rPr>
+          <w:i/>
+          <w:iCs/>
+        </w:rPr>
+        <w:t xml:space="preserve">medicalcoder</w:t>
+      </w:r>
+      <w:r>
+        <w:t xml:space="preserve"> </w:t>
+      </w:r>
+      <w:r>
+        <w:t xml:space="preserve">allows analysts to perform exploratory and preprocessing</w:t>
       </w:r>
       <w:r>
         <w:t xml:space="preserve"> </w:t>
@@ -9130,7 +9278,17 @@
         <w:t xml:space="preserve"> </w:t>
       </w:r>
       <w:r>
-        <w:t xml:space="preserve">internal and user-facing functions (97% code lines covered as of medicalcoder</w:t>
+        <w:t xml:space="preserve">internal and user-facing functions (97% code lines covered as of</w:t>
+      </w:r>
+      <w:r>
+        <w:t xml:space="preserve"> </w:t>
+      </w:r>
+      <w:r>
+        <w:rPr>
+          <w:i/>
+          <w:iCs/>
+        </w:rPr>
+        <w:t xml:space="preserve">medicalcoder</w:t>
       </w:r>
       <w:r>
         <w:t xml:space="preserve"> </w:t>
@@ -9187,7 +9345,7 @@
         <w:t xml:space="preserve">comorbidity definitions influence analytic results.</w:t>
       </w:r>
     </w:p>
-    <w:bookmarkStart w:id="31" w:name="conclusions"/>
+    <w:bookmarkStart w:id="20" w:name="conclusions"/>
     <w:p>
       <w:pPr>
         <w:pStyle w:val="Heading2"/>
@@ -9340,7 +9498,7 @@
         <w:t xml:space="preserve"> </w:t>
       </w:r>
       <w:r>
-        <w:t xml:space="preserve">1.8.27</w:t>
+        <w:t xml:space="preserve">1.9.35</w:t>
       </w:r>
       <w:r>
         <w:t xml:space="preserve"> </w:t>
@@ -9466,9 +9624,9 @@
         <w:br w:type="page"/>
       </w:r>
     </w:p>
-    <w:bookmarkEnd w:id="31"/>
-    <w:bookmarkEnd w:id="32"/>
-    <w:bookmarkStart w:id="70" w:name="references"/>
+    <w:bookmarkEnd w:id="20"/>
+    <w:bookmarkEnd w:id="21"/>
+    <w:bookmarkStart w:id="59" w:name="references"/>
     <w:p>
       <w:pPr>
         <w:pStyle w:val="Heading1"/>
@@ -9477,8 +9635,8 @@
         <w:t xml:space="preserve">References</w:t>
       </w:r>
     </w:p>
-    <w:bookmarkStart w:id="69" w:name="refs"/>
-    <w:bookmarkStart w:id="34" w:name="ref-quan2005"/>
+    <w:bookmarkStart w:id="58" w:name="refs"/>
+    <w:bookmarkStart w:id="23" w:name="ref-quan2005"/>
     <w:p>
       <w:pPr>
         <w:pStyle w:val="Bibliography"/>
@@ -9524,7 +9682,7 @@
       <w:r>
         <w:t xml:space="preserve"> </w:t>
       </w:r>
-      <w:hyperlink r:id="rId33">
+      <w:hyperlink r:id="rId22">
         <w:r>
           <w:rPr>
             <w:rStyle w:val="Hyperlink"/>
@@ -9533,8 +9691,8 @@
         </w:r>
       </w:hyperlink>
     </w:p>
-    <w:bookmarkEnd w:id="34"/>
-    <w:bookmarkStart w:id="36" w:name="ref-quan2011"/>
+    <w:bookmarkEnd w:id="23"/>
+    <w:bookmarkStart w:id="25" w:name="ref-quan2011"/>
     <w:p>
       <w:pPr>
         <w:pStyle w:val="Bibliography"/>
@@ -9580,7 +9738,7 @@
       <w:r>
         <w:t xml:space="preserve"> </w:t>
       </w:r>
-      <w:hyperlink r:id="rId35">
+      <w:hyperlink r:id="rId24">
         <w:r>
           <w:rPr>
             <w:rStyle w:val="Hyperlink"/>
@@ -9589,8 +9747,8 @@
         </w:r>
       </w:hyperlink>
     </w:p>
-    <w:bookmarkEnd w:id="36"/>
-    <w:bookmarkStart w:id="38" w:name="ref-feinstein2024pediatric"/>
+    <w:bookmarkEnd w:id="25"/>
+    <w:bookmarkStart w:id="27" w:name="ref-feinstein2024pediatric"/>
     <w:p>
       <w:pPr>
         <w:pStyle w:val="Bibliography"/>
@@ -9620,7 +9778,7 @@
       <w:r>
         <w:t xml:space="preserve"> </w:t>
       </w:r>
-      <w:hyperlink r:id="rId37">
+      <w:hyperlink r:id="rId26">
         <w:r>
           <w:rPr>
             <w:rStyle w:val="Hyperlink"/>
@@ -9645,8 +9803,8 @@
         <w:t xml:space="preserve">. 2024;7:e2420579–9.</w:t>
       </w:r>
     </w:p>
-    <w:bookmarkEnd w:id="38"/>
-    <w:bookmarkStart w:id="40" w:name="ref-feudtner2014pediatric"/>
+    <w:bookmarkEnd w:id="27"/>
+    <w:bookmarkStart w:id="29" w:name="ref-feudtner2014pediatric"/>
     <w:p>
       <w:pPr>
         <w:pStyle w:val="Bibliography"/>
@@ -9676,7 +9834,7 @@
       <w:r>
         <w:t xml:space="preserve"> </w:t>
       </w:r>
-      <w:hyperlink r:id="rId39">
+      <w:hyperlink r:id="rId28">
         <w:r>
           <w:rPr>
             <w:rStyle w:val="Hyperlink"/>
@@ -9701,8 +9859,8 @@
         <w:t xml:space="preserve">. 2014;14:1–7.</w:t>
       </w:r>
     </w:p>
-    <w:bookmarkEnd w:id="40"/>
-    <w:bookmarkStart w:id="42" w:name="ref-ahrq2025"/>
+    <w:bookmarkEnd w:id="29"/>
+    <w:bookmarkStart w:id="31" w:name="ref-ahrq2025"/>
     <w:p>
       <w:pPr>
         <w:pStyle w:val="Bibliography"/>
@@ -9722,7 +9880,7 @@
       <w:r>
         <w:t xml:space="preserve"> </w:t>
       </w:r>
-      <w:hyperlink r:id="rId41">
+      <w:hyperlink r:id="rId30">
         <w:r>
           <w:rPr>
             <w:rStyle w:val="Hyperlink"/>
@@ -9734,8 +9892,8 @@
         <w:t xml:space="preserve">. 2025.</w:t>
       </w:r>
     </w:p>
-    <w:bookmarkEnd w:id="42"/>
-    <w:bookmarkStart w:id="44" w:name="ref-glasheen2019"/>
+    <w:bookmarkEnd w:id="31"/>
+    <w:bookmarkStart w:id="33" w:name="ref-glasheen2019"/>
     <w:p>
       <w:pPr>
         <w:pStyle w:val="Bibliography"/>
@@ -9765,7 +9923,7 @@
       <w:r>
         <w:t xml:space="preserve"> </w:t>
       </w:r>
-      <w:hyperlink r:id="rId43">
+      <w:hyperlink r:id="rId32">
         <w:r>
           <w:rPr>
             <w:rStyle w:val="Hyperlink"/>
@@ -9790,8 +9948,8 @@
         <w:t xml:space="preserve">. 2019;12:188.</w:t>
       </w:r>
     </w:p>
-    <w:bookmarkEnd w:id="44"/>
-    <w:bookmarkStart w:id="45" w:name="ref-yurkovich2015systematic"/>
+    <w:bookmarkEnd w:id="33"/>
+    <w:bookmarkStart w:id="34" w:name="ref-yurkovich2015systematic"/>
     <w:p>
       <w:pPr>
         <w:pStyle w:val="Bibliography"/>
@@ -9835,8 +9993,8 @@
         <w:t xml:space="preserve">. 2015;68:3–14.</w:t>
       </w:r>
     </w:p>
-    <w:bookmarkEnd w:id="45"/>
-    <w:bookmarkStart w:id="46" w:name="ref-guo2022evaluation"/>
+    <w:bookmarkEnd w:id="34"/>
+    <w:bookmarkStart w:id="35" w:name="ref-guo2022evaluation"/>
     <w:p>
       <w:pPr>
         <w:pStyle w:val="Bibliography"/>
@@ -9880,8 +10038,8 @@
         <w:t xml:space="preserve">. 2022;17:e0270468.</w:t>
       </w:r>
     </w:p>
-    <w:bookmarkEnd w:id="46"/>
-    <w:bookmarkStart w:id="47" w:name="ref-li2008risk"/>
+    <w:bookmarkEnd w:id="35"/>
+    <w:bookmarkStart w:id="36" w:name="ref-li2008risk"/>
     <w:p>
       <w:pPr>
         <w:pStyle w:val="Bibliography"/>
@@ -9925,8 +10083,8 @@
         <w:t xml:space="preserve">. 2008;8:12.</w:t>
       </w:r>
     </w:p>
-    <w:bookmarkEnd w:id="47"/>
-    <w:bookmarkStart w:id="49" w:name="ref-r-comorbidity"/>
+    <w:bookmarkEnd w:id="36"/>
+    <w:bookmarkStart w:id="38" w:name="ref-r-comorbidity"/>
     <w:p>
       <w:pPr>
         <w:pStyle w:val="Bibliography"/>
@@ -9959,7 +10117,7 @@
       <w:r>
         <w:t xml:space="preserve"> </w:t>
       </w:r>
-      <w:hyperlink r:id="rId48">
+      <w:hyperlink r:id="rId37">
         <w:r>
           <w:rPr>
             <w:rStyle w:val="Hyperlink"/>
@@ -9968,8 +10126,8 @@
         </w:r>
       </w:hyperlink>
     </w:p>
-    <w:bookmarkEnd w:id="49"/>
-    <w:bookmarkStart w:id="51" w:name="ref-r-pccc"/>
+    <w:bookmarkEnd w:id="38"/>
+    <w:bookmarkStart w:id="40" w:name="ref-r-pccc"/>
     <w:p>
       <w:pPr>
         <w:pStyle w:val="Bibliography"/>
@@ -9989,7 +10147,7 @@
       <w:r>
         <w:t xml:space="preserve"> </w:t>
       </w:r>
-      <w:hyperlink r:id="rId50">
+      <w:hyperlink r:id="rId39">
         <w:r>
           <w:rPr>
             <w:rStyle w:val="Hyperlink"/>
@@ -10003,8 +10161,8 @@
         <w:t xml:space="preserve">. 2025.</w:t>
       </w:r>
     </w:p>
-    <w:bookmarkEnd w:id="51"/>
-    <w:bookmarkStart w:id="52" w:name="ref-pcccv3sas"/>
+    <w:bookmarkEnd w:id="40"/>
+    <w:bookmarkStart w:id="41" w:name="ref-pcccv3sas"/>
     <w:p>
       <w:pPr>
         <w:pStyle w:val="Bibliography"/>
@@ -10022,8 +10180,8 @@
         <w:t xml:space="preserve">Complex chronic conditions version 3.0. 2024.</w:t>
       </w:r>
     </w:p>
-    <w:bookmarkEnd w:id="52"/>
-    <w:bookmarkStart w:id="54" w:name="ref-r-icdcomorbid"/>
+    <w:bookmarkEnd w:id="41"/>
+    <w:bookmarkStart w:id="43" w:name="ref-r-icdcomorbid"/>
     <w:p>
       <w:pPr>
         <w:pStyle w:val="Bibliography"/>
@@ -10043,7 +10201,7 @@
       <w:r>
         <w:t xml:space="preserve"> </w:t>
       </w:r>
-      <w:hyperlink r:id="rId53">
+      <w:hyperlink r:id="rId42">
         <w:r>
           <w:rPr>
             <w:rStyle w:val="Hyperlink"/>
@@ -10057,8 +10215,8 @@
         <w:t xml:space="preserve">. 2024.</w:t>
       </w:r>
     </w:p>
-    <w:bookmarkEnd w:id="54"/>
-    <w:bookmarkStart w:id="56" w:name="ref-r-multimorbidity"/>
+    <w:bookmarkEnd w:id="43"/>
+    <w:bookmarkStart w:id="45" w:name="ref-r-multimorbidity"/>
     <w:p>
       <w:pPr>
         <w:pStyle w:val="Bibliography"/>
@@ -10078,7 +10236,7 @@
       <w:r>
         <w:t xml:space="preserve"> </w:t>
       </w:r>
-      <w:hyperlink r:id="rId55">
+      <w:hyperlink r:id="rId44">
         <w:r>
           <w:rPr>
             <w:rStyle w:val="Hyperlink"/>
@@ -10092,8 +10250,8 @@
         <w:t xml:space="preserve">. 2023.</w:t>
       </w:r>
     </w:p>
-    <w:bookmarkEnd w:id="56"/>
-    <w:bookmarkStart w:id="58" w:name="ref-r-data.table"/>
+    <w:bookmarkEnd w:id="45"/>
+    <w:bookmarkStart w:id="47" w:name="ref-r-data.table"/>
     <w:p>
       <w:pPr>
         <w:pStyle w:val="Bibliography"/>
@@ -10123,7 +10281,7 @@
       <w:r>
         <w:t xml:space="preserve"> </w:t>
       </w:r>
-      <w:hyperlink r:id="rId57">
+      <w:hyperlink r:id="rId46">
         <w:r>
           <w:rPr>
             <w:rStyle w:val="Hyperlink"/>
@@ -10137,8 +10295,8 @@
         <w:t xml:space="preserve">. 2025.</w:t>
       </w:r>
     </w:p>
-    <w:bookmarkEnd w:id="58"/>
-    <w:bookmarkStart w:id="60" w:name="ref-r-dplyr"/>
+    <w:bookmarkEnd w:id="47"/>
+    <w:bookmarkStart w:id="49" w:name="ref-r-dplyr"/>
     <w:p>
       <w:pPr>
         <w:pStyle w:val="Bibliography"/>
@@ -10168,7 +10326,7 @@
       <w:r>
         <w:t xml:space="preserve"> </w:t>
       </w:r>
-      <w:hyperlink r:id="rId59">
+      <w:hyperlink r:id="rId48">
         <w:r>
           <w:rPr>
             <w:rStyle w:val="Hyperlink"/>
@@ -10182,8 +10340,8 @@
         <w:t xml:space="preserve">. 2023.</w:t>
       </w:r>
     </w:p>
-    <w:bookmarkEnd w:id="60"/>
-    <w:bookmarkStart w:id="62" w:name="ref-feinstein2018pccc"/>
+    <w:bookmarkEnd w:id="49"/>
+    <w:bookmarkStart w:id="51" w:name="ref-feinstein2018pccc"/>
     <w:p>
       <w:pPr>
         <w:pStyle w:val="Bibliography"/>
@@ -10229,7 +10387,7 @@
       <w:r>
         <w:t xml:space="preserve"> </w:t>
       </w:r>
-      <w:hyperlink r:id="rId61">
+      <w:hyperlink r:id="rId50">
         <w:r>
           <w:rPr>
             <w:rStyle w:val="Hyperlink"/>
@@ -10238,8 +10396,8 @@
         </w:r>
       </w:hyperlink>
     </w:p>
-    <w:bookmarkEnd w:id="62"/>
-    <w:bookmarkStart w:id="63" w:name="ref-johnson2018mimic"/>
+    <w:bookmarkEnd w:id="51"/>
+    <w:bookmarkStart w:id="52" w:name="ref-johnson2018mimic"/>
     <w:p>
       <w:pPr>
         <w:pStyle w:val="Bibliography"/>
@@ -10283,8 +10441,8 @@
         <w:t xml:space="preserve">. 2018;25:32–9.</w:t>
       </w:r>
     </w:p>
-    <w:bookmarkEnd w:id="63"/>
-    <w:bookmarkStart w:id="65" w:name="ref-PhysioNet-mimiciv-3.1"/>
+    <w:bookmarkEnd w:id="52"/>
+    <w:bookmarkStart w:id="54" w:name="ref-PhysioNet-mimiciv-3.1"/>
     <w:p>
       <w:pPr>
         <w:pStyle w:val="Bibliography"/>
@@ -10336,7 +10494,7 @@
       <w:r>
         <w:t xml:space="preserve"> </w:t>
       </w:r>
-      <w:hyperlink r:id="rId64">
+      <w:hyperlink r:id="rId53">
         <w:r>
           <w:rPr>
             <w:rStyle w:val="Hyperlink"/>
@@ -10345,8 +10503,8 @@
         </w:r>
       </w:hyperlink>
     </w:p>
-    <w:bookmarkEnd w:id="65"/>
-    <w:bookmarkStart w:id="66" w:name="ref-johnson2023mimic"/>
+    <w:bookmarkEnd w:id="54"/>
+    <w:bookmarkStart w:id="55" w:name="ref-johnson2023mimic"/>
     <w:p>
       <w:pPr>
         <w:pStyle w:val="Bibliography"/>
@@ -10390,8 +10548,8 @@
         <w:t xml:space="preserve">. 2023;10:1.</w:t>
       </w:r>
     </w:p>
-    <w:bookmarkEnd w:id="66"/>
-    <w:bookmarkStart w:id="68" w:name="ref-PhysioNet2000"/>
+    <w:bookmarkEnd w:id="55"/>
+    <w:bookmarkStart w:id="57" w:name="ref-PhysioNet2000"/>
     <w:p>
       <w:pPr>
         <w:pStyle w:val="Bibliography"/>
@@ -10443,7 +10601,7 @@
       <w:r>
         <w:t xml:space="preserve"> </w:t>
       </w:r>
-      <w:hyperlink r:id="rId67">
+      <w:hyperlink r:id="rId56">
         <w:r>
           <w:rPr>
             <w:rStyle w:val="Hyperlink"/>
@@ -10452,15 +10610,15 @@
         </w:r>
       </w:hyperlink>
     </w:p>
-    <w:bookmarkEnd w:id="68"/>
-    <w:bookmarkEnd w:id="69"/>
+    <w:bookmarkEnd w:id="57"/>
+    <w:bookmarkEnd w:id="58"/>
     <w:p>
       <w:r>
         <w:br w:type="page"/>
       </w:r>
     </w:p>
-    <w:bookmarkEnd w:id="70"/>
-    <w:bookmarkStart w:id="71" w:name="figures"/>
+    <w:bookmarkEnd w:id="59"/>
+    <w:bookmarkStart w:id="60" w:name="figures"/>
     <w:p>
       <w:pPr>
         <w:pStyle w:val="Heading1"/>
@@ -10721,13 +10879,7 @@
         <w:t xml:space="preserve"> </w:t>
       </w:r>
       <w:r>
-        <w:t xml:space="preserve">dataset (</w:t>
-      </w:r>
-      <w:r>
-        <w:t xml:space="preserve"> </w:t>
-      </w:r>
-      <w:r>
-        <w:t xml:space="preserve">7,365,770 rows,</w:t>
+        <w:t xml:space="preserve">dataset (7,365,770 rows,</w:t>
       </w:r>
       <w:r>
         <w:t xml:space="preserve"> </w:t>
@@ -10751,7 +10903,7 @@
         <w:t xml:space="preserve"> </w:t>
       </w:r>
       <w:r>
-        <w:t xml:space="preserve">running RSQLite code for a in-memory database. R packages</w:t>
+        <w:t xml:space="preserve">running RSQLite code for an in-memory database. R packages</w:t>
       </w:r>
       <w:r>
         <w:t xml:space="preserve"> </w:t>
@@ -10880,7 +11032,7 @@
         <w:t xml:space="preserve"> </w:t>
       </w:r>
       <w:r>
-        <w:t xml:space="preserve">with 16.0 GB RAM.</w:t>
+        <w:t xml:space="preserve">with a Intel(R) Core(TM) i9-9880H CPU @ 2.30GHz and 16.0 GB RAM.</w:t>
       </w:r>
     </w:p>
     <w:p>
@@ -10913,7 +11065,8 @@
       </w:r>
       <w:r>
         <w:rPr>
-          <w:rStyle w:val="VerbatimChar"/>
+          <w:i/>
+          <w:iCs/>
         </w:rPr>
         <w:t xml:space="preserve">comorbidity</w:t>
       </w:r>
@@ -10925,7 +11078,8 @@
       </w:r>
       <w:r>
         <w:rPr>
-          <w:rStyle w:val="VerbatimChar"/>
+          <w:i/>
+          <w:iCs/>
         </w:rPr>
         <w:t xml:space="preserve">medicalcoder</w:t>
       </w:r>
@@ -10937,7 +11091,8 @@
       </w:r>
       <w:r>
         <w:rPr>
-          <w:rStyle w:val="VerbatimChar"/>
+          <w:i/>
+          <w:iCs/>
         </w:rPr>
         <w:t xml:space="preserve">pccc</w:t>
       </w:r>
@@ -10967,7 +11122,8 @@
       </w:r>
       <w:r>
         <w:rPr>
-          <w:rStyle w:val="VerbatimChar"/>
+          <w:i/>
+          <w:iCs/>
         </w:rPr>
         <w:t xml:space="preserve">medicalcoder</w:t>
       </w:r>
@@ -10994,7 +11150,8 @@
       </w:r>
       <w:r>
         <w:rPr>
-          <w:rStyle w:val="VerbatimChar"/>
+          <w:i/>
+          <w:iCs/>
         </w:rPr>
         <w:t xml:space="preserve">medicalcoder</w:t>
       </w:r>
@@ -11015,7 +11172,8 @@
       </w:r>
       <w:r>
         <w:rPr>
-          <w:rStyle w:val="VerbatimChar"/>
+          <w:i/>
+          <w:iCs/>
         </w:rPr>
         <w:t xml:space="preserve">comorbidity</w:t>
       </w:r>
@@ -11042,7 +11200,8 @@
       </w:r>
       <w:r>
         <w:rPr>
-          <w:rStyle w:val="VerbatimChar"/>
+          <w:i/>
+          <w:iCs/>
         </w:rPr>
         <w:t xml:space="preserve">pccc</w:t>
       </w:r>
@@ -11059,7 +11218,7 @@
         <w:t xml:space="preserve">about 152 seconds for current flagging.</w:t>
       </w:r>
     </w:p>
-    <w:bookmarkEnd w:id="71"/>
+    <w:bookmarkEnd w:id="60"/>
     <w:sectPr>
       <w:footnotePr>
         <w:numFmt w:val="lowerLetter"/>
@@ -11093,7 +11252,7 @@
       </w:r>
     </w:p>
   </w:footnote>
-  <w:footnote w:id="24">
+  <w:footnote w:id="13">
     <w:p>
       <w:pPr>
         <w:pStyle w:val="FootnoteText"/>
@@ -11112,7 +11271,7 @@
       </w:r>
     </w:p>
   </w:footnote>
-  <w:footnote w:id="25">
+  <w:footnote w:id="14">
     <w:p>
       <w:pPr>
         <w:pStyle w:val="FootnoteText"/>
@@ -11131,7 +11290,7 @@
       </w:r>
     </w:p>
   </w:footnote>
-  <w:footnote w:id="26">
+  <w:footnote w:id="15">
     <w:p>
       <w:pPr>
         <w:pStyle w:val="FootnoteText"/>
@@ -11171,7 +11330,7 @@
       </w:r>
     </w:p>
   </w:footnote>
-  <w:footnote w:id="27">
+  <w:footnote w:id="16">
     <w:p>
       <w:pPr>
         <w:pStyle w:val="FootnoteText"/>
@@ -11190,7 +11349,7 @@
       </w:r>
     </w:p>
   </w:footnote>
-  <w:footnote w:id="28">
+  <w:footnote w:id="17">
     <w:p>
       <w:pPr>
         <w:pStyle w:val="FootnoteText"/>
@@ -12299,12 +12458,13 @@
     <w:name w:val="tablecap"/>
     <w:basedOn w:val="BodyText"/>
     <w:qFormat/>
-    <w:rsid w:val="007548E3"/>
+    <w:rsid w:val="00FF7B91"/>
     <w:pPr>
       <w:spacing w:line="240" w:lineRule="auto"/>
     </w:pPr>
     <w:rPr>
       <w:i/>
+      <w:sz w:val="18"/>
     </w:rPr>
   </w:style>
   <w:style w:customStyle="1" w:styleId="SourceCode" w:type="paragraph">

</xml_diff>

<commit_message>
cuts to get under word count limit
</commit_message>
<xml_diff>
--- a/medicalcoder-manuscript.docx
+++ b/medicalcoder-manuscript.docx
@@ -263,7 +263,7 @@
         <w:t xml:space="preserve"> </w:t>
       </w:r>
       <w:r>
-        <w:t xml:space="preserve">1983 / 2000 (excluding tables)</w:t>
+        <w:t xml:space="preserve">1813 / 2000 (excluding tables)</w:t>
       </w:r>
     </w:p>
     <w:p>
@@ -301,7 +301,7 @@
         <w:t xml:space="preserve"> </w:t>
       </w:r>
       <w:r>
-        <w:t xml:space="preserve">2 / 3</w:t>
+        <w:t xml:space="preserve">3 / 3</w:t>
       </w:r>
     </w:p>
     <w:p>
@@ -1746,13 +1746,7 @@
         <w:t xml:space="preserve">icdv.var</w:t>
       </w:r>
       <w:r>
-        <w:t xml:space="preserve">). These pairs represent the same conceptual information at two</w:t>
-      </w:r>
-      <w:r>
-        <w:t xml:space="preserve"> </w:t>
-      </w:r>
-      <w:r>
-        <w:t xml:space="preserve">levels of granularity. Arguments without the</w:t>
+        <w:t xml:space="preserve">): arguments without the</w:t>
       </w:r>
       <w:r>
         <w:t xml:space="preserve"> </w:t>
@@ -1773,13 +1767,7 @@
         <w:t xml:space="preserve"> </w:t>
       </w:r>
       <w:r>
-        <w:t xml:space="preserve">invariants (e.g., all rows are ICD-10, or all rows are diagnoses), whereas</w:t>
-      </w:r>
-      <w:r>
-        <w:t xml:space="preserve"> </w:t>
-      </w:r>
-      <w:r>
-        <w:t xml:space="preserve">arguments with the</w:t>
+        <w:t xml:space="preserve">invariants, whereas</w:t>
       </w:r>
       <w:r>
         <w:t xml:space="preserve"> </w:t>
@@ -1794,13 +1782,25 @@
         <w:t xml:space="preserve"> </w:t>
       </w:r>
       <w:r>
-        <w:t xml:space="preserve">suffix reference columns in the input data that encode</w:t>
-      </w:r>
-      <w:r>
-        <w:t xml:space="preserve"> </w:t>
-      </w:r>
-      <w:r>
-        <w:t xml:space="preserve">row-level variation.</w:t>
+        <w:t xml:space="preserve">arguments reference columns encoding row-level</w:t>
+      </w:r>
+      <w:r>
+        <w:t xml:space="preserve"> </w:t>
+      </w:r>
+      <w:r>
+        <w:t xml:space="preserve">variation. This avoids creating constant-valued columns when dataset-level</w:t>
+      </w:r>
+      <w:r>
+        <w:t xml:space="preserve"> </w:t>
+      </w:r>
+      <w:r>
+        <w:t xml:space="preserve">properties are already known while still supporting heterogeneous datasets. When</w:t>
+      </w:r>
+      <w:r>
+        <w:t xml:space="preserve"> </w:t>
+      </w:r>
+      <w:r>
+        <w:t xml:space="preserve">both forms are supplied, the column-based form takes precedence with a warning.</w:t>
       </w:r>
     </w:p>
     <w:p>
@@ -1808,25 +1808,7 @@
         <w:pStyle w:val="BodyText"/>
       </w:pPr>
       <w:r>
-        <w:t xml:space="preserve">This design avoids requiring users to create constant-valued columns when</w:t>
-      </w:r>
-      <w:r>
-        <w:t xml:space="preserve"> </w:t>
-      </w:r>
-      <w:r>
-        <w:t xml:space="preserve">dataset-level properties are already known, while still supporting heterogeneous</w:t>
-      </w:r>
-      <w:r>
-        <w:t xml:space="preserve"> </w:t>
-      </w:r>
-      <w:r>
-        <w:t xml:space="preserve">datasets in which code attributes vary across rows. When both forms are</w:t>
-      </w:r>
-      <w:r>
-        <w:t xml:space="preserve"> </w:t>
-      </w:r>
-      <w:r>
-        <w:t xml:space="preserve">supplied, the column-based form (e.g.,</w:t>
+        <w:t xml:space="preserve">The</w:t>
       </w:r>
       <w:r>
         <w:t xml:space="preserve"> </w:t>
@@ -1835,16 +1817,91 @@
         <w:rPr>
           <w:rStyle w:val="VerbatimChar"/>
         </w:rPr>
-        <w:t xml:space="preserve">dx.var</w:t>
-      </w:r>
-      <w:r>
-        <w:t xml:space="preserve">) takes precedence and a warning</w:t>
-      </w:r>
-      <w:r>
-        <w:t xml:space="preserve"> </w:t>
-      </w:r>
-      <w:r>
-        <w:t xml:space="preserve">is issued to indicate the override.</w:t>
+        <w:t xml:space="preserve">id.vars</w:t>
+      </w:r>
+      <w:r>
+        <w:t xml:space="preserve"> </w:t>
+      </w:r>
+      <w:r>
+        <w:t xml:space="preserve">argument controls how comorbidities are summarized into</w:t>
+      </w:r>
+      <w:r>
+        <w:t xml:space="preserve"> </w:t>
+      </w:r>
+      <w:r>
+        <w:t xml:space="preserve">encounter-level flags. When flag.method =</w:t>
+      </w:r>
+      <w:r>
+        <w:t xml:space="preserve"> </w:t>
+      </w:r>
+      <w:r>
+        <w:t xml:space="preserve">“current”</w:t>
+      </w:r>
+      <w:r>
+        <w:t xml:space="preserve">,</w:t>
+      </w:r>
+      <w:r>
+        <w:t xml:space="preserve"> </w:t>
+      </w:r>
+      <w:r>
+        <w:rPr>
+          <w:rStyle w:val="VerbatimChar"/>
+        </w:rPr>
+        <w:t xml:space="preserve">id.vars</w:t>
+      </w:r>
+      <w:r>
+        <w:t xml:space="preserve"> </w:t>
+      </w:r>
+      <w:r>
+        <w:t xml:space="preserve">is optional; if</w:t>
+      </w:r>
+      <w:r>
+        <w:t xml:space="preserve"> </w:t>
+      </w:r>
+      <w:r>
+        <w:t xml:space="preserve">omitted, the entire dataset is treated as a single encounter. For longitudinal</w:t>
+      </w:r>
+      <w:r>
+        <w:t xml:space="preserve"> </w:t>
+      </w:r>
+      <w:r>
+        <w:t xml:space="preserve">flagging (</w:t>
+      </w:r>
+      <w:r>
+        <w:rPr>
+          <w:rStyle w:val="VerbatimChar"/>
+        </w:rPr>
+        <w:t xml:space="preserve">flag.method = "cumulative"</w:t>
+      </w:r>
+      <w:r>
+        <w:t xml:space="preserve">),</w:t>
+      </w:r>
+      <w:r>
+        <w:t xml:space="preserve"> </w:t>
+      </w:r>
+      <w:r>
+        <w:rPr>
+          <w:rStyle w:val="VerbatimChar"/>
+        </w:rPr>
+        <w:t xml:space="preserve">id.vars</w:t>
+      </w:r>
+      <w:r>
+        <w:t xml:space="preserve"> </w:t>
+      </w:r>
+      <w:r>
+        <w:t xml:space="preserve">must include at least two</w:t>
+      </w:r>
+      <w:r>
+        <w:t xml:space="preserve"> </w:t>
+      </w:r>
+      <w:r>
+        <w:t xml:space="preserve">variables: the leading variables define the patient and the final variable</w:t>
+      </w:r>
+      <w:r>
+        <w:t xml:space="preserve"> </w:t>
+      </w:r>
+      <w:r>
+        <w:t xml:space="preserve">defines within-patient order for carrying ICD codes forward across encounters.</w:t>
       </w:r>
     </w:p>
     <w:p>
@@ -1852,49 +1909,19 @@
         <w:pStyle w:val="BodyText"/>
       </w:pPr>
       <w:r>
-        <w:t xml:space="preserve">The</w:t>
-      </w:r>
-      <w:r>
-        <w:t xml:space="preserve"> </w:t>
-      </w:r>
-      <w:r>
-        <w:rPr>
-          <w:rStyle w:val="VerbatimChar"/>
-        </w:rPr>
-        <w:t xml:space="preserve">id.vars</w:t>
-      </w:r>
-      <w:r>
-        <w:t xml:space="preserve"> </w:t>
-      </w:r>
-      <w:r>
-        <w:t xml:space="preserve">argument controls how comorbidities are summarized into</w:t>
-      </w:r>
-      <w:r>
-        <w:t xml:space="preserve"> </w:t>
-      </w:r>
-      <w:r>
-        <w:t xml:space="preserve">encounter-level flags. When flag.method =</w:t>
-      </w:r>
-      <w:r>
-        <w:t xml:space="preserve"> </w:t>
-      </w:r>
-      <w:r>
-        <w:t xml:space="preserve">“current”</w:t>
-      </w:r>
-      <w:r>
-        <w:t xml:space="preserve">, id.vars is optional: if</w:t>
-      </w:r>
-      <w:r>
-        <w:t xml:space="preserve"> </w:t>
-      </w:r>
-      <w:r>
-        <w:t xml:space="preserve">omitted, the entire dataset is treated as a single encounter and a single row of</w:t>
-      </w:r>
-      <w:r>
-        <w:t xml:space="preserve"> </w:t>
-      </w:r>
-      <w:r>
-        <w:t xml:space="preserve">flags is returned.</w:t>
+        <w:t xml:space="preserve">The ordering variable may be a date/time (e.g., admission time) or a numeric</w:t>
+      </w:r>
+      <w:r>
+        <w:t xml:space="preserve"> </w:t>
+      </w:r>
+      <w:r>
+        <w:t xml:space="preserve">sequence (e.g., encounter number). In large datasets, using an integer sequence</w:t>
+      </w:r>
+      <w:r>
+        <w:t xml:space="preserve"> </w:t>
+      </w:r>
+      <w:r>
+        <w:t xml:space="preserve">often reduces overhead relative to sorting and joining on POSIXct timestamps.</w:t>
       </w:r>
     </w:p>
     <w:p>
@@ -1902,16 +1929,22 @@
         <w:pStyle w:val="BodyText"/>
       </w:pPr>
       <w:r>
-        <w:t xml:space="preserve">For longitudinal flagging (</w:t>
-      </w:r>
-      <w:r>
         <w:rPr>
           <w:rStyle w:val="VerbatimChar"/>
         </w:rPr>
-        <w:t xml:space="preserve">flag.method = "cumulative"</w:t>
-      </w:r>
-      <w:r>
-        <w:t xml:space="preserve">),</w:t>
+        <w:t xml:space="preserve">medicalcoder::comorbidities()</w:t>
+      </w:r>
+      <w:r>
+        <w:t xml:space="preserve"> </w:t>
+      </w:r>
+      <w:r>
+        <w:t xml:space="preserve">returns a data.frame with class consistent with</w:t>
+      </w:r>
+      <w:r>
+        <w:t xml:space="preserve"> </w:t>
+      </w:r>
+      <w:r>
+        <w:t xml:space="preserve">the input, containing the</w:t>
       </w:r>
       <w:r>
         <w:t xml:space="preserve"> </w:t>
@@ -1923,28 +1956,13 @@
         <w:t xml:space="preserve">id.vars</w:t>
       </w:r>
       <w:r>
-        <w:t xml:space="preserve"> </w:t>
-      </w:r>
-      <w:r>
-        <w:t xml:space="preserve">must include</w:t>
-      </w:r>
-      <w:r>
-        <w:t xml:space="preserve"> </w:t>
-      </w:r>
-      <w:r>
-        <w:t xml:space="preserve">at least two variables. The leading variables define the patient and</w:t>
-      </w:r>
-      <w:r>
-        <w:t xml:space="preserve"> </w:t>
-      </w:r>
-      <w:r>
-        <w:t xml:space="preserve">the final variable defines within-patient ordering. Specifically, the data are</w:t>
-      </w:r>
-      <w:r>
-        <w:t xml:space="preserve"> </w:t>
-      </w:r>
-      <w:r>
-        <w:t xml:space="preserve">sorted by</w:t>
+        <w:t xml:space="preserve">, one indicator column per comorbidity, and</w:t>
+      </w:r>
+      <w:r>
+        <w:t xml:space="preserve"> </w:t>
+      </w:r>
+      <w:r>
+        <w:t xml:space="preserve">summary columns</w:t>
       </w:r>
       <w:r>
         <w:t xml:space="preserve"> </w:t>
@@ -1953,134 +1971,25 @@
         <w:rPr>
           <w:rStyle w:val="VerbatimChar"/>
         </w:rPr>
-        <w:t xml:space="preserve">id.vars</w:t>
-      </w:r>
-      <w:r>
-        <w:t xml:space="preserve">, and relevant ICD codes reported on encounter i are carried</w:t>
-      </w:r>
-      <w:r>
-        <w:t xml:space="preserve"> </w:t>
-      </w:r>
-      <w:r>
-        <w:t xml:space="preserve">forward to encounters i+1, i+2, … within the same patient history.</w:t>
-      </w:r>
-    </w:p>
-    <w:p>
-      <w:pPr>
-        <w:pStyle w:val="BodyText"/>
-      </w:pPr>
-      <w:r>
-        <w:t xml:space="preserve">The ordering variable may be a date/time (e.g., admission time) or a numeric</w:t>
-      </w:r>
-      <w:r>
-        <w:t xml:space="preserve"> </w:t>
-      </w:r>
-      <w:r>
-        <w:t xml:space="preserve">sequence (e.g., encounter number). In large datasets, using an integer sequence</w:t>
-      </w:r>
-      <w:r>
-        <w:t xml:space="preserve"> </w:t>
-      </w:r>
-      <w:r>
-        <w:t xml:space="preserve">often reduces overhead relative to sorting and joining on POSIXct timestamps.</w:t>
-      </w:r>
-    </w:p>
-    <w:p>
-      <w:pPr>
-        <w:pStyle w:val="BodyText"/>
-      </w:pPr>
+        <w:t xml:space="preserve">num_cmrb</w:t>
+      </w:r>
+      <w:r>
+        <w:t xml:space="preserve"> </w:t>
+      </w:r>
+      <w:r>
+        <w:t xml:space="preserve">and</w:t>
+      </w:r>
+      <w:r>
+        <w:t xml:space="preserve"> </w:t>
+      </w:r>
       <w:r>
         <w:rPr>
           <w:rStyle w:val="VerbatimChar"/>
         </w:rPr>
-        <w:t xml:space="preserve">medicalcoder::comorbidities()</w:t>
-      </w:r>
-      <w:r>
-        <w:t xml:space="preserve"> </w:t>
-      </w:r>
-      <w:r>
-        <w:t xml:space="preserve">returns a data.frame with additional metadata</w:t>
-      </w:r>
-      <w:r>
-        <w:t xml:space="preserve"> </w:t>
-      </w:r>
-      <w:r>
-        <w:t xml:space="preserve">and class consistent with the input. The returned data frame contains the</w:t>
-      </w:r>
-      <w:r>
-        <w:t xml:space="preserve"> </w:t>
-      </w:r>
-      <w:r>
-        <w:rPr>
-          <w:rStyle w:val="VerbatimChar"/>
-        </w:rPr>
-        <w:t xml:space="preserve">id.vars</w:t>
-      </w:r>
-      <w:r>
-        <w:t xml:space="preserve"> </w:t>
-      </w:r>
-      <w:r>
-        <w:t xml:space="preserve">columns and an indicator column for each comorbidity. All returned</w:t>
-      </w:r>
-      <w:r>
-        <w:t xml:space="preserve"> </w:t>
-      </w:r>
-      <w:r>
-        <w:t xml:space="preserve">data.frames include columns</w:t>
-      </w:r>
-      <w:r>
-        <w:t xml:space="preserve"> </w:t>
-      </w:r>
-      <w:r>
-        <w:rPr>
-          <w:rStyle w:val="VerbatimChar"/>
-        </w:rPr>
-        <w:t xml:space="preserve">num_cmrb</w:t>
-      </w:r>
-      <w:r>
-        <w:t xml:space="preserve"> </w:t>
-      </w:r>
-      <w:r>
-        <w:t xml:space="preserve">for the number of comorbidities flagged</w:t>
-      </w:r>
-      <w:r>
-        <w:t xml:space="preserve"> </w:t>
-      </w:r>
-      <w:r>
-        <w:t xml:space="preserve">for the</w:t>
-      </w:r>
-      <w:r>
-        <w:t xml:space="preserve"> </w:t>
-      </w:r>
-      <w:r>
-        <w:rPr>
-          <w:rStyle w:val="VerbatimChar"/>
-        </w:rPr>
-        <w:t xml:space="preserve">id.vars</w:t>
-      </w:r>
-      <w:r>
-        <w:t xml:space="preserve"> </w:t>
-      </w:r>
-      <w:r>
-        <w:t xml:space="preserve">and</w:t>
-      </w:r>
-      <w:r>
-        <w:t xml:space="preserve"> </w:t>
-      </w:r>
-      <w:r>
-        <w:rPr>
-          <w:rStyle w:val="VerbatimChar"/>
-        </w:rPr>
         <w:t xml:space="preserve">cmrb_flag</w:t>
       </w:r>
       <w:r>
-        <w:t xml:space="preserve">, an indicator column for at least one</w:t>
-      </w:r>
-      <w:r>
-        <w:t xml:space="preserve"> </w:t>
-      </w:r>
-      <w:r>
-        <w:t xml:space="preserve">comorbidity.</w:t>
+        <w:t xml:space="preserve">.</w:t>
       </w:r>
       <w:r>
         <w:t xml:space="preserve"> </w:t>
@@ -2096,7 +2005,7 @@
         <w:t xml:space="preserve"> </w:t>
       </w:r>
       <w:r>
-        <w:t xml:space="preserve">provides a S3</w:t>
+        <w:t xml:space="preserve">also provides an S3</w:t>
       </w:r>
       <w:r>
         <w:t xml:space="preserve"> </w:t>
@@ -2111,13 +2020,7 @@
         <w:t xml:space="preserve"> </w:t>
       </w:r>
       <w:r>
-        <w:t xml:space="preserve">method for the returns to</w:t>
-      </w:r>
-      <w:r>
-        <w:t xml:space="preserve"> </w:t>
-      </w:r>
-      <w:r>
-        <w:t xml:space="preserve">generate tables of the counts and percentage of encounters flagged, Table 1.</w:t>
+        <w:t xml:space="preserve">method to generate count and percentage tables (Table 1).</w:t>
       </w:r>
     </w:p>
     <w:p>
@@ -8587,28 +8490,7 @@
         <w:pStyle w:val="BodyText"/>
       </w:pPr>
       <w:r>
-        <w:t xml:space="preserve">The supplement includes a detailed exploration of the flags produced by</w:t>
-      </w:r>
-      <w:r>
-        <w:t xml:space="preserve"> </w:t>
-      </w:r>
-      <w:r>
-        <w:rPr>
-          <w:rStyle w:val="VerbatimChar"/>
-        </w:rPr>
-        <w:t xml:space="preserve">medicalcoder::comorbidities()</w:t>
-      </w:r>
-      <w:r>
-        <w:t xml:space="preserve"> </w:t>
-      </w:r>
-      <w:r>
-        <w:t xml:space="preserve">versus the code from MIMIC-IV and the R</w:t>
-      </w:r>
-      <w:r>
-        <w:t xml:space="preserve"> </w:t>
-      </w:r>
-      <w:r>
-        <w:t xml:space="preserve">packages</w:t>
+        <w:t xml:space="preserve">The supplement details comparisons with MIMIC-IV code and the R packages</w:t>
       </w:r>
       <w:r>
         <w:t xml:space="preserve"> </w:t>
@@ -8649,13 +8531,13 @@
         <w:t xml:space="preserve">[11]</w:t>
       </w:r>
       <w:r>
-        <w:t xml:space="preserve">. The flagging of</w:t>
-      </w:r>
-      <w:r>
-        <w:t xml:space="preserve"> </w:t>
-      </w:r>
-      <w:r>
-        <w:t xml:space="preserve">Charlson comorbidities within the MIMIC-IV v3.1 dataset between</w:t>
+        <w:t xml:space="preserve">. Charlson flags matched</w:t>
+      </w:r>
+      <w:r>
+        <w:t xml:space="preserve"> </w:t>
+      </w:r>
+      <w:r>
+        <w:t xml:space="preserve">MIMIC-IV code, and Elixhauser flags matched</w:t>
       </w:r>
       <w:r>
         <w:t xml:space="preserve"> </w:t>
@@ -8665,13 +8547,10 @@
           <w:i/>
           <w:iCs/>
         </w:rPr>
-        <w:t xml:space="preserve">medicalcoder</w:t>
-      </w:r>
-      <w:r>
-        <w:t xml:space="preserve"> </w:t>
-      </w:r>
-      <w:r>
-        <w:t xml:space="preserve">and MIMIC-IV Code are the same. Between</w:t>
+        <w:t xml:space="preserve">comorbidity</w:t>
+      </w:r>
+      <w:r>
+        <w:t xml:space="preserve">. For Charlson,</w:t>
       </w:r>
       <w:r>
         <w:t xml:space="preserve"> </w:t>
@@ -8681,13 +8560,19 @@
           <w:i/>
           <w:iCs/>
         </w:rPr>
-        <w:t xml:space="preserve">medicalcoder</w:t>
-      </w:r>
-      <w:r>
-        <w:t xml:space="preserve"> </w:t>
-      </w:r>
-      <w:r>
-        <w:t xml:space="preserve">and</w:t>
+        <w:t xml:space="preserve">comorbidity</w:t>
+      </w:r>
+      <w:r>
+        <w:t xml:space="preserve"> </w:t>
+      </w:r>
+      <w:r>
+        <w:t xml:space="preserve">missed malignancies related to ICD-10-CM codes C4A.x; for PCCC</w:t>
+      </w:r>
+      <w:r>
+        <w:t xml:space="preserve"> </w:t>
+      </w:r>
+      <w:r>
+        <w:t xml:space="preserve">v2,</w:t>
       </w:r>
       <w:r>
         <w:t xml:space="preserve"> </w:t>
@@ -8697,92 +8582,13 @@
           <w:i/>
           <w:iCs/>
         </w:rPr>
-        <w:t xml:space="preserve">comorbidity</w:t>
-      </w:r>
-      <w:r>
-        <w:t xml:space="preserve"> </w:t>
-      </w:r>
-      <w:r>
-        <w:t xml:space="preserve">we</w:t>
-      </w:r>
-      <w:r>
-        <w:t xml:space="preserve"> </w:t>
-      </w:r>
-      <w:r>
-        <w:t xml:space="preserve">found the same for Elixhauser comorbidities. For Charlson comorbidities we</w:t>
-      </w:r>
-      <w:r>
-        <w:t xml:space="preserve"> </w:t>
-      </w:r>
-      <w:r>
-        <w:t xml:space="preserve">found that the</w:t>
-      </w:r>
-      <w:r>
-        <w:t xml:space="preserve"> </w:t>
-      </w:r>
-      <w:r>
-        <w:rPr>
-          <w:i/>
-          <w:iCs/>
-        </w:rPr>
-        <w:t xml:space="preserve">comorbidity</w:t>
-      </w:r>
-      <w:r>
-        <w:t xml:space="preserve"> </w:t>
-      </w:r>
-      <w:r>
-        <w:t xml:space="preserve">package failed to flag malignancies related to</w:t>
-      </w:r>
-      <w:r>
-        <w:t xml:space="preserve"> </w:t>
-      </w:r>
-      <w:r>
-        <w:t xml:space="preserve">ICD-10-CM codes C4A.x. PCCC v2 flagging between</w:t>
-      </w:r>
-      <w:r>
-        <w:t xml:space="preserve"> </w:t>
-      </w:r>
-      <w:r>
-        <w:rPr>
-          <w:i/>
-          <w:iCs/>
-        </w:rPr>
-        <w:t xml:space="preserve">medicalcoder</w:t>
-      </w:r>
-      <w:r>
-        <w:t xml:space="preserve"> </w:t>
-      </w:r>
-      <w:r>
-        <w:t xml:space="preserve">and</w:t>
-      </w:r>
-      <w:r>
-        <w:t xml:space="preserve"> </w:t>
-      </w:r>
-      <w:r>
-        <w:rPr>
-          <w:i/>
-          <w:iCs/>
-        </w:rPr>
         <w:t xml:space="preserve">pccc</w:t>
       </w:r>
       <w:r>
         <w:t xml:space="preserve"> </w:t>
       </w:r>
       <w:r>
-        <w:t xml:space="preserve">showed several technology-dependent and transplant errors in the mappings within</w:t>
-      </w:r>
-      <w:r>
-        <w:t xml:space="preserve"> </w:t>
-      </w:r>
-      <w:r>
-        <w:rPr>
-          <w:i/>
-          <w:iCs/>
-        </w:rPr>
-        <w:t xml:space="preserve">pccc</w:t>
-      </w:r>
-      <w:r>
-        <w:t xml:space="preserve">.</w:t>
+        <w:t xml:space="preserve">showed several technology-dependent and transplant mapping errors.</w:t>
       </w:r>
     </w:p>
     <w:p>
@@ -8848,12 +8654,6 @@
         <w:pStyle w:val="BodyText"/>
       </w:pPr>
       <w:r>
-        <w:t xml:space="preserve">In addition to the comorbidity interface,</w:t>
-      </w:r>
-      <w:r>
-        <w:t xml:space="preserve"> </w:t>
-      </w:r>
-      <w:r>
         <w:rPr>
           <w:i/>
           <w:iCs/>
@@ -8864,19 +8664,13 @@
         <w:t xml:space="preserve"> </w:t>
       </w:r>
       <w:r>
-        <w:t xml:space="preserve">provides several ICD</w:t>
-      </w:r>
-      <w:r>
-        <w:t xml:space="preserve"> </w:t>
-      </w:r>
-      <w:r>
-        <w:t xml:space="preserve">utility functions designed to support data preparation and validation workflows.</w:t>
-      </w:r>
-      <w:r>
-        <w:t xml:space="preserve"> </w:t>
-      </w:r>
-      <w:r>
-        <w:t xml:space="preserve">The function</w:t>
+        <w:t xml:space="preserve">also provides ICD utility functions for data preparation and</w:t>
+      </w:r>
+      <w:r>
+        <w:t xml:space="preserve"> </w:t>
+      </w:r>
+      <w:r>
+        <w:t xml:space="preserve">validation.</w:t>
       </w:r>
       <w:r>
         <w:t xml:space="preserve"> </w:t>
@@ -8891,19 +8685,13 @@
         <w:t xml:space="preserve"> </w:t>
       </w:r>
       <w:r>
-        <w:t xml:space="preserve">exposes the internal ICD database</w:t>
-      </w:r>
-      <w:r>
-        <w:t xml:space="preserve"> </w:t>
-      </w:r>
-      <w:r>
-        <w:t xml:space="preserve">and allows users to retrieve diagnostic or procedure codes by version, type, and</w:t>
-      </w:r>
-      <w:r>
-        <w:t xml:space="preserve"> </w:t>
-      </w:r>
-      <w:r>
-        <w:t xml:space="preserve">code range. The function</w:t>
+        <w:t xml:space="preserve">exposes the internal ICD database,</w:t>
+      </w:r>
+      <w:r>
+        <w:t xml:space="preserve"> </w:t>
+      </w:r>
+      <w:r>
+        <w:t xml:space="preserve">and</w:t>
       </w:r>
       <w:r>
         <w:t xml:space="preserve"> </w:t>
@@ -8918,37 +8706,13 @@
         <w:t xml:space="preserve"> </w:t>
       </w:r>
       <w:r>
-        <w:t xml:space="preserve">provides fast validation of</w:t>
-      </w:r>
-      <w:r>
-        <w:t xml:space="preserve"> </w:t>
-      </w:r>
-      <w:r>
-        <w:t xml:space="preserve">candidate ICD codes, supporting both full and compact representations and mixed</w:t>
-      </w:r>
-      <w:r>
-        <w:t xml:space="preserve"> </w:t>
-      </w:r>
-      <w:r>
-        <w:t xml:space="preserve">ICD-9/ICD-10 datasets. These utilities enable users to inspect and verify ICD</w:t>
-      </w:r>
-      <w:r>
-        <w:t xml:space="preserve"> </w:t>
-      </w:r>
-      <w:r>
-        <w:t xml:space="preserve">content prior to comorbidity classification and to construct reproducible code</w:t>
-      </w:r>
-      <w:r>
-        <w:t xml:space="preserve"> </w:t>
-      </w:r>
-      <w:r>
-        <w:t xml:space="preserve">filters directly from the same internal database used by the comorbidity</w:t>
-      </w:r>
-      <w:r>
-        <w:t xml:space="preserve"> </w:t>
-      </w:r>
-      <w:r>
-        <w:t xml:space="preserve">algorithms.</w:t>
+        <w:t xml:space="preserve">validates candidate codes across full and compact</w:t>
+      </w:r>
+      <w:r>
+        <w:t xml:space="preserve"> </w:t>
+      </w:r>
+      <w:r>
+        <w:t xml:space="preserve">representations and mixed ICD-9/ICD-10 datasets.</w:t>
       </w:r>
     </w:p>
     <w:bookmarkEnd w:id="19"/>
@@ -9274,69 +9038,7 @@
         <w:pStyle w:val="BodyText"/>
       </w:pPr>
       <w:r>
-        <w:t xml:space="preserve">Although the primary focus of</w:t>
-      </w:r>
-      <w:r>
-        <w:t xml:space="preserve"> </w:t>
-      </w:r>
-      <w:r>
-        <w:rPr>
-          <w:i/>
-          <w:iCs/>
-        </w:rPr>
-        <w:t xml:space="preserve">medicalcoder</w:t>
-      </w:r>
-      <w:r>
-        <w:t xml:space="preserve"> </w:t>
-      </w:r>
-      <w:r>
-        <w:t xml:space="preserve">is comorbidity classification, the</w:t>
-      </w:r>
-      <w:r>
-        <w:t xml:space="preserve"> </w:t>
-      </w:r>
-      <w:r>
-        <w:t xml:space="preserve">included ICD utility functions also address a common practical challenge in</w:t>
-      </w:r>
-      <w:r>
-        <w:t xml:space="preserve"> </w:t>
-      </w:r>
-      <w:r>
-        <w:t xml:space="preserve">working with administrative and electronic health record data: verifying and</w:t>
-      </w:r>
-      <w:r>
-        <w:t xml:space="preserve"> </w:t>
-      </w:r>
-      <w:r>
-        <w:t xml:space="preserve">manipulating large collections of ICD codes. By exposing the internal ICD</w:t>
-      </w:r>
-      <w:r>
-        <w:t xml:space="preserve"> </w:t>
-      </w:r>
-      <w:r>
-        <w:t xml:space="preserve">database through functions such as get_icd_codes() and providing validation via</w:t>
-      </w:r>
-      <w:r>
-        <w:t xml:space="preserve"> </w:t>
-      </w:r>
-      <w:r>
-        <w:t xml:space="preserve">is_icd(),</w:t>
-      </w:r>
-      <w:r>
-        <w:t xml:space="preserve"> </w:t>
-      </w:r>
-      <w:r>
-        <w:rPr>
-          <w:i/>
-          <w:iCs/>
-        </w:rPr>
-        <w:t xml:space="preserve">medicalcoder</w:t>
-      </w:r>
-      <w:r>
-        <w:t xml:space="preserve"> </w:t>
-      </w:r>
-      <w:r>
-        <w:t xml:space="preserve">allows analysts to perform exploratory and preprocessing</w:t>
+        <w:t xml:space="preserve">The included ICD utility functions also support exploratory and preprocessing</w:t>
       </w:r>
       <w:r>
         <w:t xml:space="preserve"> </w:t>
@@ -9348,19 +9050,19 @@
         <w:t xml:space="preserve"> </w:t>
       </w:r>
       <w:r>
-        <w:t xml:space="preserve">reduces reliance on ad hoc code lists and external reference tables, improving</w:t>
-      </w:r>
-      <w:r>
-        <w:t xml:space="preserve"> </w:t>
-      </w:r>
-      <w:r>
-        <w:t xml:space="preserve">transparency and reproducibility when defining cohorts or filtering diagnosis</w:t>
-      </w:r>
-      <w:r>
-        <w:t xml:space="preserve"> </w:t>
-      </w:r>
-      <w:r>
-        <w:t xml:space="preserve">and procedure codes in large clinical datasets.</w:t>
+        <w:t xml:space="preserve">reduces reliance on ad hoc code lists and external reference tables when</w:t>
+      </w:r>
+      <w:r>
+        <w:t xml:space="preserve"> </w:t>
+      </w:r>
+      <w:r>
+        <w:t xml:space="preserve">defining cohorts or filtering diagnosis and procedure codes in large clinical</w:t>
+      </w:r>
+      <w:r>
+        <w:t xml:space="preserve"> </w:t>
+      </w:r>
+      <w:r>
+        <w:t xml:space="preserve">datasets.</w:t>
       </w:r>
     </w:p>
     <w:p>
@@ -9681,25 +9383,25 @@
         <w:t xml:space="preserve"> </w:t>
       </w:r>
       <w:r>
-        <w:t xml:space="preserve">review and testing. SR, MR, and TDB all contributed to the conception, design,</w:t>
-      </w:r>
-      <w:r>
-        <w:t xml:space="preserve"> </w:t>
-      </w:r>
-      <w:r>
-        <w:t xml:space="preserve">and interpretation and provided important feedback. TDB provided funding. All</w:t>
-      </w:r>
-      <w:r>
-        <w:t xml:space="preserve"> </w:t>
-      </w:r>
-      <w:r>
-        <w:t xml:space="preserve">authors critically reviewed the manuscript for important intellectual content</w:t>
-      </w:r>
-      <w:r>
-        <w:t xml:space="preserve"> </w:t>
-      </w:r>
-      <w:r>
-        <w:t xml:space="preserve">and approved of the final version of the manuscript.</w:t>
+        <w:t xml:space="preserve">review and testing. JAF, SR, MR, and TDB all contributed to the conception,</w:t>
+      </w:r>
+      <w:r>
+        <w:t xml:space="preserve"> </w:t>
+      </w:r>
+      <w:r>
+        <w:t xml:space="preserve">design, and interpretation and provided important feedback. TDB provided</w:t>
+      </w:r>
+      <w:r>
+        <w:t xml:space="preserve"> </w:t>
+      </w:r>
+      <w:r>
+        <w:t xml:space="preserve">funding. All authors critically reviewed the manuscript for important</w:t>
+      </w:r>
+      <w:r>
+        <w:t xml:space="preserve"> </w:t>
+      </w:r>
+      <w:r>
+        <w:t xml:space="preserve">intellectual content and approved of the final version of the manuscript.</w:t>
       </w:r>
     </w:p>
     <w:p>
@@ -10997,19 +10699,13 @@
         <w:t xml:space="preserve"> </w:t>
       </w:r>
       <w:r>
-        <w:t xml:space="preserve">Number of subjects and encounters in the MIMIC-IV data set with</w:t>
-      </w:r>
-      <w:r>
-        <w:t xml:space="preserve"> </w:t>
-      </w:r>
-      <w:r>
-        <w:t xml:space="preserve">different risk profiles (more severe comorbidities and/or more comorbidities)</w:t>
-      </w:r>
-      <w:r>
-        <w:t xml:space="preserve"> </w:t>
-      </w:r>
-      <w:r>
-        <w:t xml:space="preserve">with</w:t>
+        <w:t xml:space="preserve">Percent of subjects and encounters in the MIMIC-IV data set with</w:t>
+      </w:r>
+      <w:r>
+        <w:t xml:space="preserve"> </w:t>
+      </w:r>
+      <w:r>
+        <w:t xml:space="preserve">different comorbidity profiles under</w:t>
       </w:r>
       <w:r>
         <w:t xml:space="preserve"> </w:t>
@@ -11036,25 +10732,25 @@
         <w:t xml:space="preserve">flag.method = "current"</w:t>
       </w:r>
       <w:r>
-        <w:t xml:space="preserve">. The</w:t>
-      </w:r>
-      <w:r>
-        <w:t xml:space="preserve"> </w:t>
-      </w:r>
-      <w:r>
-        <w:t xml:space="preserve">denomiator for Panel (A) is the number of subjects with at least two encounters</w:t>
-      </w:r>
-      <w:r>
-        <w:t xml:space="preserve"> </w:t>
-      </w:r>
-      <w:r>
-        <w:t xml:space="preserve">and at least one comorbidity flagged on encounter 2 (implicitly encounter 1 is</w:t>
-      </w:r>
-      <w:r>
-        <w:t xml:space="preserve"> </w:t>
-      </w:r>
-      <w:r>
-        <w:t xml:space="preserve">the same regardless of</w:t>
+        <w:t xml:space="preserve">. Panel (A) uses as its denominator subjects with at</w:t>
+      </w:r>
+      <w:r>
+        <w:t xml:space="preserve"> </w:t>
+      </w:r>
+      <w:r>
+        <w:t xml:space="preserve">least two encounters and at least one comorbidity flagged on encounter 2. Panel</w:t>
+      </w:r>
+      <w:r>
+        <w:t xml:space="preserve"> </w:t>
+      </w:r>
+      <w:r>
+        <w:t xml:space="preserve">(B) uses as its denominator non-initial encounters with at least one</w:t>
+      </w:r>
+      <w:r>
+        <w:t xml:space="preserve"> </w:t>
+      </w:r>
+      <w:r>
+        <w:t xml:space="preserve">comorbidity flagged under</w:t>
       </w:r>
       <w:r>
         <w:t xml:space="preserve"> </w:t>
@@ -11063,25 +10759,10 @@
         <w:rPr>
           <w:rStyle w:val="VerbatimChar"/>
         </w:rPr>
-        <w:t xml:space="preserve">flag.method</w:t>
-      </w:r>
-      <w:r>
-        <w:t xml:space="preserve">.) The denomiator for Panel (B) is the</w:t>
-      </w:r>
-      <w:r>
-        <w:t xml:space="preserve"> </w:t>
-      </w:r>
-      <w:r>
-        <w:t xml:space="preserve">number of non-initial encounters with at least one comorbidity flag when</w:t>
-      </w:r>
-      <w:r>
-        <w:t xml:space="preserve"> </w:t>
-      </w:r>
-      <w:r>
-        <w:rPr>
-          <w:rStyle w:val="VerbatimChar"/>
-        </w:rPr>
-        <w:t xml:space="preserve">flag.method = "cumulative".</w:t>
+        <w:t xml:space="preserve">flag.method = "cumulative"</w:t>
+      </w:r>
+      <w:r>
+        <w:t xml:space="preserve">.</w:t>
       </w:r>
     </w:p>
     <w:p>
@@ -11094,6 +10775,72 @@
           <w:bCs/>
         </w:rPr>
         <w:t xml:space="preserve">Figure 2 ALT TEXT:</w:t>
+      </w:r>
+      <w:r>
+        <w:t xml:space="preserve"> </w:t>
+      </w:r>
+      <w:r>
+        <w:t xml:space="preserve">Two-panel grouped bar chart comparing how cumulative longitudinal flagging</w:t>
+      </w:r>
+      <w:r>
+        <w:t xml:space="preserve"> </w:t>
+      </w:r>
+      <w:r>
+        <w:t xml:space="preserve">changes comorbidity results relative to encounter-level current flagging for</w:t>
+      </w:r>
+      <w:r>
+        <w:t xml:space="preserve"> </w:t>
+      </w:r>
+      <w:r>
+        <w:t xml:space="preserve">three algorithms: Charlson, Elixhauser, and PCCC v3.1. Panel A shows the</w:t>
+      </w:r>
+      <w:r>
+        <w:t xml:space="preserve"> </w:t>
+      </w:r>
+      <w:r>
+        <w:t xml:space="preserve">percentage of subjects and Panel B shows the percentage of encounters in four</w:t>
+      </w:r>
+      <w:r>
+        <w:t xml:space="preserve"> </w:t>
+      </w:r>
+      <w:r>
+        <w:t xml:space="preserve">categories: different risk profile, zero encounter-level comorbidities but at</w:t>
+      </w:r>
+      <w:r>
+        <w:t xml:space="preserve"> </w:t>
+      </w:r>
+      <w:r>
+        <w:t xml:space="preserve">least one longitudinal comorbidity, only differences in classification, and</w:t>
+      </w:r>
+      <w:r>
+        <w:t xml:space="preserve"> </w:t>
+      </w:r>
+      <w:r>
+        <w:t xml:space="preserve">differences in classification and/or additional comorbidities. Across both</w:t>
+      </w:r>
+      <w:r>
+        <w:t xml:space="preserve"> </w:t>
+      </w:r>
+      <w:r>
+        <w:t xml:space="preserve">panels, the largest percentages are for different risk profile and for</w:t>
+      </w:r>
+      <w:r>
+        <w:t xml:space="preserve"> </w:t>
+      </w:r>
+      <w:r>
+        <w:t xml:space="preserve">differences in classification and/or additional comorbidities, with Elixhauser</w:t>
+      </w:r>
+      <w:r>
+        <w:t xml:space="preserve"> </w:t>
+      </w:r>
+      <w:r>
+        <w:t xml:space="preserve">generally highest, PCCC v3.1 intermediate, and Charlson lowest; the other two</w:t>
+      </w:r>
+      <w:r>
+        <w:t xml:space="preserve"> </w:t>
+      </w:r>
+      <w:r>
+        <w:t xml:space="preserve">categories are much smaller.</w:t>
       </w:r>
     </w:p>
     <w:p>

</xml_diff>

<commit_message>
add references and add context about how common chronic conditions are
</commit_message>
<xml_diff>
--- a/medicalcoder-manuscript.docx
+++ b/medicalcoder-manuscript.docx
@@ -263,7 +263,7 @@
         <w:t xml:space="preserve"> </w:t>
       </w:r>
       <w:r>
-        <w:t xml:space="preserve">1828 / 2000 (excluding tables)</w:t>
+        <w:t xml:space="preserve">1880 / 2000 (excluding tables)</w:t>
       </w:r>
     </w:p>
     <w:p>
@@ -390,7 +390,7 @@
         <w:pStyle w:val="FirstParagraph"/>
       </w:pPr>
       <w:r>
-        <w:t xml:space="preserve">Word count: 150 / 150</w:t>
+        <w:t xml:space="preserve">Word count: 148 / 150</w:t>
       </w:r>
     </w:p>
     <w:p>
@@ -414,35 +414,25 @@
         <w:t xml:space="preserve"> </w:t>
       </w:r>
       <w:r>
-        <w:t xml:space="preserve">cohort characterization. However, existing software is fragmented, inconsistently</w:t>
-      </w:r>
-      <w:r>
-        <w:t xml:space="preserve"> </w:t>
-      </w:r>
-      <w:r>
-        <w:t xml:space="preserve">handles mixed ICD-9/10 data, and typically operates at the encounter level. We</w:t>
-      </w:r>
-      <w:r>
-        <w:t xml:space="preserve"> </w:t>
-      </w:r>
-      <w:r>
-        <w:t xml:space="preserve">developed</w:t>
-      </w:r>
-      <w:r>
-        <w:t xml:space="preserve"> </w:t>
-      </w:r>
-      <w:r>
-        <w:rPr>
-          <w:i/>
-          <w:iCs/>
-        </w:rPr>
-        <w:t xml:space="preserve">medicalcoder</w:t>
-      </w:r>
-      <w:r>
-        <w:t xml:space="preserve"> </w:t>
-      </w:r>
-      <w:r>
-        <w:t xml:space="preserve">to address these limitations.</w:t>
+        <w:t xml:space="preserve">cohort characterization. However, existing software inconsistently handles mixed</w:t>
+      </w:r>
+      <w:r>
+        <w:t xml:space="preserve"> </w:t>
+      </w:r>
+      <w:r>
+        <w:t xml:space="preserve">ICD-9/10 data, and operates at the encounter level, failing to reflect the</w:t>
+      </w:r>
+      <w:r>
+        <w:t xml:space="preserve"> </w:t>
+      </w:r>
+      <w:r>
+        <w:t xml:space="preserve">longitudinal nature of disease. We developed medicalcoder to address these</w:t>
+      </w:r>
+      <w:r>
+        <w:t xml:space="preserve"> </w:t>
+      </w:r>
+      <w:r>
+        <w:t xml:space="preserve">limitations.</w:t>
       </w:r>
     </w:p>
     <w:p>
@@ -476,25 +466,25 @@
         <w:t xml:space="preserve"> </w:t>
       </w:r>
       <w:r>
-        <w:t xml:space="preserve">interface for applying multiple variants of the Charlson, Elixhauser, and</w:t>
-      </w:r>
-      <w:r>
-        <w:t xml:space="preserve"> </w:t>
-      </w:r>
-      <w:r>
-        <w:t xml:space="preserve">Pediatric Complex Chronic Conditions algorithms. It supports full and compact</w:t>
-      </w:r>
-      <w:r>
-        <w:t xml:space="preserve"> </w:t>
-      </w:r>
-      <w:r>
-        <w:t xml:space="preserve">ICD codes, mixed ICD versions, present-on-admission and primary diagnosis</w:t>
-      </w:r>
-      <w:r>
-        <w:t xml:space="preserve"> </w:t>
-      </w:r>
-      <w:r>
-        <w:t xml:space="preserve">indicators, and both encounter-level and cumulative longitudinal flagging.</w:t>
+        <w:t xml:space="preserve">interface for applying variants of the Charlson, Elixhauser, and Pediatric</w:t>
+      </w:r>
+      <w:r>
+        <w:t xml:space="preserve"> </w:t>
+      </w:r>
+      <w:r>
+        <w:t xml:space="preserve">Complex Chronic Conditions algorithms. It supports full and compact ICD codes,</w:t>
+      </w:r>
+      <w:r>
+        <w:t xml:space="preserve"> </w:t>
+      </w:r>
+      <w:r>
+        <w:t xml:space="preserve">mixed ICD versions, present-on-admission and primary diagnosis indicators, and</w:t>
+      </w:r>
+      <w:r>
+        <w:t xml:space="preserve"> </w:t>
+      </w:r>
+      <w:r>
+        <w:t xml:space="preserve">encounter-level and cumulative longitudinal flagging.</w:t>
       </w:r>
     </w:p>
     <w:p>
@@ -528,31 +518,31 @@
         <w:t xml:space="preserve"> </w:t>
       </w:r>
       <w:r>
-        <w:t xml:space="preserve">package requires only R ≥ 3.5.0. No additional packages,</w:t>
-      </w:r>
-      <w:r>
-        <w:t xml:space="preserve"> </w:t>
-      </w:r>
-      <w:r>
-        <w:t xml:space="preserve">internet access, or external data downloads are required. Outputs are consistent</w:t>
-      </w:r>
-      <w:r>
-        <w:t xml:space="preserve"> </w:t>
-      </w:r>
-      <w:r>
-        <w:t xml:space="preserve">with published reference implementations. Longitudinal flagging captured comorbidities not</w:t>
-      </w:r>
-      <w:r>
-        <w:t xml:space="preserve"> </w:t>
-      </w:r>
-      <w:r>
-        <w:t xml:space="preserve">identified through naïve encounter-level aggregation for algorithms</w:t>
-      </w:r>
-      <w:r>
-        <w:t xml:space="preserve"> </w:t>
-      </w:r>
-      <w:r>
-        <w:t xml:space="preserve">incorporating present-on-admission or technology-dependent logic.</w:t>
+        <w:t xml:space="preserve">package requires only R ≥ 3.5.0; no additional packages,</w:t>
+      </w:r>
+      <w:r>
+        <w:t xml:space="preserve"> </w:t>
+      </w:r>
+      <w:r>
+        <w:t xml:space="preserve">internet access, or external data. Outputs are consistent with published</w:t>
+      </w:r>
+      <w:r>
+        <w:t xml:space="preserve"> </w:t>
+      </w:r>
+      <w:r>
+        <w:t xml:space="preserve">reference implementations. Longitudinal flagging captures comorbidities missed</w:t>
+      </w:r>
+      <w:r>
+        <w:t xml:space="preserve"> </w:t>
+      </w:r>
+      <w:r>
+        <w:t xml:space="preserve">by encounter-level aggregation while accounting for present-on-admission or</w:t>
+      </w:r>
+      <w:r>
+        <w:t xml:space="preserve"> </w:t>
+      </w:r>
+      <w:r>
+        <w:t xml:space="preserve">technology-dependent logic.</w:t>
       </w:r>
     </w:p>
     <w:p>
@@ -794,7 +784,7 @@
               <w:t xml:space="preserve"> </w:t>
             </w:r>
             <w:r>
-              <w:t xml:space="preserve">and reproducibility of studies using electronic health record or administrative</w:t>
+              <w:t xml:space="preserve">and reproducibility of studies using electronic health records or administrative</w:t>
             </w:r>
             <w:r>
               <w:t xml:space="preserve"> </w:t>
@@ -906,13 +896,43 @@
         <w:pStyle w:val="BodyText"/>
       </w:pPr>
       <w:r>
-        <w:t xml:space="preserve">Despite the importance of longitudinal data in modern medical research,</w:t>
-      </w:r>
-      <w:r>
-        <w:t xml:space="preserve"> </w:t>
-      </w:r>
-      <w:r>
-        <w:t xml:space="preserve">comorbidity software typically operates at the encounter level. While the AHRQ</w:t>
+        <w:t xml:space="preserve">Despite the importance of longitudinal data in modern medical</w:t>
+      </w:r>
+      <w:r>
+        <w:t xml:space="preserve"> </w:t>
+      </w:r>
+      <w:r>
+        <w:t xml:space="preserve">research</w:t>
+      </w:r>
+      <w:r>
+        <w:t xml:space="preserve">[15–17]</w:t>
+      </w:r>
+      <w:r>
+        <w:t xml:space="preserve">, comorbidity</w:t>
+      </w:r>
+      <w:r>
+        <w:t xml:space="preserve"> </w:t>
+      </w:r>
+      <w:r>
+        <w:t xml:space="preserve">software typically operates at the encounter</w:t>
+      </w:r>
+      <w:r>
+        <w:t xml:space="preserve"> </w:t>
+      </w:r>
+      <w:r>
+        <w:t xml:space="preserve">level</w:t>
+      </w:r>
+      <w:r>
+        <w:t xml:space="preserve">[5,10–14,18–21]</w:t>
+      </w:r>
+      <w:r>
+        <w:t xml:space="preserve">.</w:t>
+      </w:r>
+      <w:r>
+        <w:t xml:space="preserve"> </w:t>
+      </w:r>
+      <w:r>
+        <w:t xml:space="preserve">While the AHRQ</w:t>
       </w:r>
       <w:r>
         <w:t xml:space="preserve"> </w:t>
@@ -924,37 +944,75 @@
         <w:t xml:space="preserve"> </w:t>
       </w:r>
       <w:r>
-        <w:t xml:space="preserve">Elixhauser variants account for present-on-admission (POA)</w:t>
-      </w:r>
-      <w:r>
-        <w:t xml:space="preserve"> </w:t>
-      </w:r>
-      <w:r>
-        <w:t xml:space="preserve">indicators and exemptions, they do not propagate conditions across encounters</w:t>
-      </w:r>
-      <w:r>
-        <w:t xml:space="preserve"> </w:t>
-      </w:r>
-      <w:r>
-        <w:t xml:space="preserve">within a patient record. Conditions that arise during acute care and should not</w:t>
-      </w:r>
-      <w:r>
-        <w:t xml:space="preserve"> </w:t>
-      </w:r>
-      <w:r>
-        <w:t xml:space="preserve">be considered comorbidities for the present encounter are handled via POA</w:t>
-      </w:r>
-      <w:r>
-        <w:t xml:space="preserve"> </w:t>
-      </w:r>
-      <w:r>
-        <w:t xml:space="preserve">indicators. However, unless the relevant ICD codes are flagged as POA on</w:t>
-      </w:r>
-      <w:r>
-        <w:t xml:space="preserve"> </w:t>
-      </w:r>
-      <w:r>
-        <w:t xml:space="preserve">subsequent encounters, those comorbidities will not be correctly classified.</w:t>
+        <w:t xml:space="preserve">Elixhauser variants account for present-on-admission</w:t>
+      </w:r>
+      <w:r>
+        <w:t xml:space="preserve"> </w:t>
+      </w:r>
+      <w:r>
+        <w:t xml:space="preserve">(POA) indicators and exemptions, they do not propagate conditions across</w:t>
+      </w:r>
+      <w:r>
+        <w:t xml:space="preserve"> </w:t>
+      </w:r>
+      <w:r>
+        <w:t xml:space="preserve">encounters within a patient record. As a result, conditions that arise during</w:t>
+      </w:r>
+      <w:r>
+        <w:t xml:space="preserve"> </w:t>
+      </w:r>
+      <w:r>
+        <w:t xml:space="preserve">acute care and are appropriately excluded from the index encounter may be missed</w:t>
+      </w:r>
+      <w:r>
+        <w:t xml:space="preserve"> </w:t>
+      </w:r>
+      <w:r>
+        <w:t xml:space="preserve">in subsequent encounters unless the relevant ICD codes are explicitly</w:t>
+      </w:r>
+      <w:r>
+        <w:t xml:space="preserve"> </w:t>
+      </w:r>
+      <w:r>
+        <w:t xml:space="preserve">re-reported and flagged as POA.</w:t>
+      </w:r>
+    </w:p>
+    <w:p>
+      <w:pPr>
+        <w:pStyle w:val="BodyText"/>
+      </w:pPr>
+      <w:r>
+        <w:t xml:space="preserve">This limitation is particularly important given the high prevalence of chronic</w:t>
+      </w:r>
+      <w:r>
+        <w:t xml:space="preserve"> </w:t>
+      </w:r>
+      <w:r>
+        <w:t xml:space="preserve">disease in the United States, where 76.4% of adults report at least one chronic</w:t>
+      </w:r>
+      <w:r>
+        <w:t xml:space="preserve"> </w:t>
+      </w:r>
+      <w:r>
+        <w:t xml:space="preserve">condition and 59.5% report two or more</w:t>
+      </w:r>
+      <w:r>
+        <w:t xml:space="preserve">[22]</w:t>
+      </w:r>
+      <w:r>
+        <w:t xml:space="preserve">. Failing to account</w:t>
+      </w:r>
+      <w:r>
+        <w:t xml:space="preserve"> </w:t>
+      </w:r>
+      <w:r>
+        <w:t xml:space="preserve">for longitudinal patient history can therefore lead to systematic</w:t>
+      </w:r>
+      <w:r>
+        <w:t xml:space="preserve"> </w:t>
+      </w:r>
+      <w:r>
+        <w:t xml:space="preserve">under-ascertainment of comorbidities and misclassification of patient risk.</w:t>
       </w:r>
     </w:p>
     <w:p>
@@ -1116,7 +1174,7 @@
         <w:t xml:space="preserve"> </w:t>
       </w:r>
       <w:r>
-        <w:t xml:space="preserve">[15]</w:t>
+        <w:t xml:space="preserve">[23]</w:t>
       </w:r>
       <w:r>
         <w:t xml:space="preserve"> </w:t>
@@ -1128,7 +1186,7 @@
         <w:t xml:space="preserve"> </w:t>
       </w:r>
       <w:r>
-        <w:t xml:space="preserve">[16]</w:t>
+        <w:t xml:space="preserve">[24]</w:t>
       </w:r>
       <w:r>
         <w:t xml:space="preserve">) and for testing and</w:t>
@@ -1311,7 +1369,7 @@
         <w:t xml:space="preserve"> </w:t>
       </w:r>
       <w:r>
-        <w:t xml:space="preserve">[11,17]</w:t>
+        <w:t xml:space="preserve">[11,19]</w:t>
       </w:r>
       <w:r>
         <w:t xml:space="preserve">, and between</w:t>
@@ -1377,10 +1435,16 @@
         <w:t xml:space="preserve"> </w:t>
       </w:r>
       <w:r>
-        <w:t xml:space="preserve">and the SQL code provided by MIT-LCP/mimic-code/mimic-iv</w:t>
-      </w:r>
-      <w:r>
-        <w:t xml:space="preserve">[18]</w:t>
+        <w:t xml:space="preserve">and the SQL code provided by</w:t>
+      </w:r>
+      <w:r>
+        <w:t xml:space="preserve"> </w:t>
+      </w:r>
+      <w:r>
+        <w:t xml:space="preserve">MIT-LCP/mimic-code/mimic-iv</w:t>
+      </w:r>
+      <w:r>
+        <w:t xml:space="preserve">[20,21]</w:t>
       </w:r>
       <w:r>
         <w:t xml:space="preserve"> </w:t>
@@ -1406,7 +1470,7 @@
         <w:t xml:space="preserve"> </w:t>
       </w:r>
       <w:r>
-        <w:t xml:space="preserve">[19–21]</w:t>
+        <w:t xml:space="preserve">[25–27]</w:t>
       </w:r>
       <w:r>
         <w:t xml:space="preserve"> </w:t>
@@ -1466,19 +1530,28 @@
         <w:t xml:space="preserve"> </w:t>
       </w:r>
       <w:r>
-        <w:t xml:space="preserve">Computational Physiology (MIT_LCP) on</w:t>
-      </w:r>
-      <w:r>
-        <w:t xml:space="preserve"> </w:t>
-      </w:r>
-      <w:r>
-        <w:t xml:space="preserve">GitHub</w:t>
+        <w:t xml:space="preserve">Computational Physiology (MIT_LCP) on GitHub</w:t>
       </w:r>
       <w:r>
         <w:rPr>
           <w:rStyle w:val="FootnoteReference"/>
         </w:rPr>
         <w:footnoteReference w:id="16"/>
+      </w:r>
+      <w:r>
+        <w:t xml:space="preserve"> </w:t>
+      </w:r>
+      <w:r>
+        <w:t xml:space="preserve">and</w:t>
+      </w:r>
+      <w:r>
+        <w:t xml:space="preserve"> </w:t>
+      </w:r>
+      <w:r>
+        <w:t xml:space="preserve">Zenodo</w:t>
+      </w:r>
+      <w:r>
+        <w:t xml:space="preserve">[20,21]</w:t>
       </w:r>
       <w:r>
         <w:t xml:space="preserve">, and the R packages</w:t>
@@ -8752,7 +8825,7 @@
         <w:t xml:space="preserve"> </w:t>
       </w:r>
       <w:r>
-        <w:t xml:space="preserve">was initially developed to support implementation of Pediatric</w:t>
+        <w:t xml:space="preserve">was initially developed to support the implementation of Pediatric</w:t>
       </w:r>
       <w:r>
         <w:t xml:space="preserve"> </w:t>
@@ -9348,7 +9421,7 @@
         <w:t xml:space="preserve"> </w:t>
       </w:r>
       <w:r>
-        <w:t xml:space="preserve">(https://quarto.org/) and R version 4.5.2 (2025-10-31). All R code, materials,</w:t>
+        <w:t xml:space="preserve">(https://quarto.org/) and R version 4.5.3 (2026-03-11). All R code, materials,</w:t>
       </w:r>
       <w:r>
         <w:t xml:space="preserve"> </w:t>
@@ -9470,7 +9543,7 @@
     </w:p>
     <w:bookmarkEnd w:id="19"/>
     <w:bookmarkEnd w:id="20"/>
-    <w:bookmarkStart w:id="58" w:name="references"/>
+    <w:bookmarkStart w:id="65" w:name="references"/>
     <w:p>
       <w:pPr>
         <w:pStyle w:val="Heading1"/>
@@ -9479,7 +9552,7 @@
         <w:t xml:space="preserve">References</w:t>
       </w:r>
     </w:p>
-    <w:bookmarkStart w:id="57" w:name="refs"/>
+    <w:bookmarkStart w:id="64" w:name="refs"/>
     <w:bookmarkStart w:id="22" w:name="ref-quan2005"/>
     <w:p>
       <w:pPr>
@@ -9971,7 +10044,7 @@
       </w:hyperlink>
     </w:p>
     <w:bookmarkEnd w:id="37"/>
-    <w:bookmarkStart w:id="39" w:name="ref-r-pccc"/>
+    <w:bookmarkStart w:id="39" w:name="ref-dewitt2026pccc"/>
     <w:p>
       <w:pPr>
         <w:pStyle w:val="Bibliography"/>
@@ -10002,7 +10075,7 @@
         </w:r>
       </w:hyperlink>
       <w:r>
-        <w:t xml:space="preserve">. 2025.</w:t>
+        <w:t xml:space="preserve">. 2026.</w:t>
       </w:r>
     </w:p>
     <w:bookmarkEnd w:id="39"/>
@@ -10095,7 +10168,7 @@
       </w:r>
     </w:p>
     <w:bookmarkEnd w:id="44"/>
-    <w:bookmarkStart w:id="46" w:name="ref-r-data.table"/>
+    <w:bookmarkStart w:id="45" w:name="ref-hripcsak2013next"/>
     <w:p>
       <w:pPr>
         <w:pStyle w:val="Bibliography"/>
@@ -10110,7 +10183,7 @@
         <w:t xml:space="preserve">	</w:t>
       </w:r>
       <w:r>
-        <w:t xml:space="preserve">Barrett T, Dowle M, Srinivasan A,</w:t>
+        <w:t xml:space="preserve">Hripcsak G, Albers DJ. Next-generation phenotyping of electronic health records.</w:t>
       </w:r>
       <w:r>
         <w:t xml:space="preserve"> </w:t>
@@ -10120,27 +10193,14 @@
           <w:i/>
           <w:iCs/>
         </w:rPr>
-        <w:t xml:space="preserve">et al.</w:t>
-      </w:r>
-      <w:r>
-        <w:t xml:space="preserve"> </w:t>
-      </w:r>
-      <w:hyperlink r:id="rId45">
-        <w:r>
-          <w:rPr>
-            <w:rStyle w:val="Hyperlink"/>
-            <w:i/>
-            <w:iCs/>
-          </w:rPr>
-          <w:t xml:space="preserve">Data.table: Extension of ‘data.frame‘</w:t>
-        </w:r>
-      </w:hyperlink>
-      <w:r>
-        <w:t xml:space="preserve">. 2025.</w:t>
+        <w:t xml:space="preserve">Journal of the American Medical Informatics Association</w:t>
+      </w:r>
+      <w:r>
+        <w:t xml:space="preserve">. 2013;20:117–21.</w:t>
       </w:r>
     </w:p>
-    <w:bookmarkEnd w:id="46"/>
-    <w:bookmarkStart w:id="48" w:name="ref-r-dplyr"/>
+    <w:bookmarkEnd w:id="45"/>
+    <w:bookmarkStart w:id="46" w:name="ref-casey2016using"/>
     <w:p>
       <w:pPr>
         <w:pStyle w:val="Bibliography"/>
@@ -10155,7 +10215,7 @@
         <w:t xml:space="preserve">	</w:t>
       </w:r>
       <w:r>
-        <w:t xml:space="preserve">Wickham H, François R, Henry L,</w:t>
+        <w:t xml:space="preserve">Casey JA, Schwartz BS, Stewart WF,</w:t>
       </w:r>
       <w:r>
         <w:t xml:space="preserve"> </w:t>
@@ -10168,20 +10228,84 @@
         <w:t xml:space="preserve">et al.</w:t>
       </w:r>
       <w:r>
-        <w:t xml:space="preserve"> </w:t>
-      </w:r>
-      <w:hyperlink r:id="rId47">
-        <w:r>
-          <w:rPr>
-            <w:rStyle w:val="Hyperlink"/>
-            <w:i/>
-            <w:iCs/>
-          </w:rPr>
-          <w:t xml:space="preserve">Dplyr: A grammar of data manipulation</w:t>
-        </w:r>
-      </w:hyperlink>
-      <w:r>
-        <w:t xml:space="preserve">. 2023.</w:t>
+        <w:t xml:space="preserve"> Using electronic health records for population health research: A review of methods and applications.</w:t>
+      </w:r>
+      <w:r>
+        <w:t xml:space="preserve"> </w:t>
+      </w:r>
+      <w:r>
+        <w:rPr>
+          <w:i/>
+          <w:iCs/>
+        </w:rPr>
+        <w:t xml:space="preserve">Annual review of public health</w:t>
+      </w:r>
+      <w:r>
+        <w:t xml:space="preserve">. 2016;37:61–81.</w:t>
+      </w:r>
+    </w:p>
+    <w:bookmarkEnd w:id="46"/>
+    <w:bookmarkStart w:id="47" w:name="ref-jensen2014temporal"/>
+    <w:p>
+      <w:pPr>
+        <w:pStyle w:val="Bibliography"/>
+      </w:pPr>
+      <w:r>
+        <w:t xml:space="preserve">17</w:t>
+      </w:r>
+      <w:r>
+        <w:t xml:space="preserve"> </w:t>
+      </w:r>
+      <w:r>
+        <w:t xml:space="preserve">	</w:t>
+      </w:r>
+      <w:r>
+        <w:t xml:space="preserve">Jensen AB, Moseley PL, Oprea TI,</w:t>
+      </w:r>
+      <w:r>
+        <w:t xml:space="preserve"> </w:t>
+      </w:r>
+      <w:r>
+        <w:rPr>
+          <w:i/>
+          <w:iCs/>
+        </w:rPr>
+        <w:t xml:space="preserve">et al.</w:t>
+      </w:r>
+      <w:r>
+        <w:t xml:space="preserve"> Temporal disease trajectories condensed from population-wide registry data covering 6.2 million patients.</w:t>
+      </w:r>
+      <w:r>
+        <w:t xml:space="preserve"> </w:t>
+      </w:r>
+      <w:r>
+        <w:rPr>
+          <w:i/>
+          <w:iCs/>
+        </w:rPr>
+        <w:t xml:space="preserve">Nature communications</w:t>
+      </w:r>
+      <w:r>
+        <w:t xml:space="preserve">. 2014;5:4022.</w:t>
+      </w:r>
+    </w:p>
+    <w:bookmarkEnd w:id="47"/>
+    <w:bookmarkStart w:id="48" w:name="ref-ahrq2017"/>
+    <w:p>
+      <w:pPr>
+        <w:pStyle w:val="Bibliography"/>
+      </w:pPr>
+      <w:r>
+        <w:t xml:space="preserve">18</w:t>
+      </w:r>
+      <w:r>
+        <w:t xml:space="preserve"> </w:t>
+      </w:r>
+      <w:r>
+        <w:t xml:space="preserve">	</w:t>
+      </w:r>
+      <w:r>
+        <w:t xml:space="preserve">Healthcare Cost and Utilization Project (HCUP). Elixhauser comorbidity software for ICD-9-CM. 2017.</w:t>
       </w:r>
     </w:p>
     <w:bookmarkEnd w:id="48"/>
@@ -10191,7 +10315,7 @@
         <w:pStyle w:val="Bibliography"/>
       </w:pPr>
       <w:r>
-        <w:t xml:space="preserve">17</w:t>
+        <w:t xml:space="preserve">19</w:t>
       </w:r>
       <w:r>
         <w:t xml:space="preserve"> </w:t>
@@ -10247,7 +10371,7 @@
         <w:pStyle w:val="Bibliography"/>
       </w:pPr>
       <w:r>
-        <w:t xml:space="preserve">18</w:t>
+        <w:t xml:space="preserve">20</w:t>
       </w:r>
       <w:r>
         <w:t xml:space="preserve"> </w:t>
@@ -10286,13 +10410,13 @@
       </w:r>
     </w:p>
     <w:bookmarkEnd w:id="51"/>
-    <w:bookmarkStart w:id="53" w:name="ref-PhysioNet-mimiciv-3.1"/>
+    <w:bookmarkStart w:id="53" w:name="ref-johnson2022mimiccode"/>
     <w:p>
       <w:pPr>
         <w:pStyle w:val="Bibliography"/>
       </w:pPr>
       <w:r>
-        <w:t xml:space="preserve">19</w:t>
+        <w:t xml:space="preserve">21</w:t>
       </w:r>
       <w:r>
         <w:t xml:space="preserve"> </w:t>
@@ -10301,7 +10425,7 @@
         <w:t xml:space="preserve">	</w:t>
       </w:r>
       <w:r>
-        <w:t xml:space="preserve">Johnson A, Bulgarelli L, Pollard T,</w:t>
+        <w:t xml:space="preserve">Johnson AEW, Pollard TJ, Blundell J,</w:t>
       </w:r>
       <w:r>
         <w:t xml:space="preserve"> </w:t>
@@ -10316,11 +10440,35 @@
       <w:r>
         <w:t xml:space="preserve"> </w:t>
       </w:r>
-      <w:r>
-        <w:t xml:space="preserve">MIMIC-IV</w:t>
-      </w:r>
-      <w:r>
-        <w:t xml:space="preserve">.</w:t>
+      <w:hyperlink r:id="rId52">
+        <w:r>
+          <w:rPr>
+            <w:rStyle w:val="Hyperlink"/>
+          </w:rPr>
+          <w:t xml:space="preserve">MIT-LCP/mimic-code: MIMIC Code v2.2.1</w:t>
+        </w:r>
+      </w:hyperlink>
+      <w:r>
+        <w:t xml:space="preserve">. 2022.</w:t>
+      </w:r>
+    </w:p>
+    <w:bookmarkEnd w:id="53"/>
+    <w:bookmarkStart w:id="54" w:name="ref-watson2025trends"/>
+    <w:p>
+      <w:pPr>
+        <w:pStyle w:val="Bibliography"/>
+      </w:pPr>
+      <w:r>
+        <w:t xml:space="preserve">22</w:t>
+      </w:r>
+      <w:r>
+        <w:t xml:space="preserve"> </w:t>
+      </w:r>
+      <w:r>
+        <w:t xml:space="preserve">	</w:t>
+      </w:r>
+      <w:r>
+        <w:t xml:space="preserve">Watson KB, Wiltz JL, Nhim K,</w:t>
       </w:r>
       <w:r>
         <w:t xml:space="preserve"> </w:t>
@@ -10330,6 +10478,160 @@
           <w:i/>
           <w:iCs/>
         </w:rPr>
+        <w:t xml:space="preserve">et al.</w:t>
+      </w:r>
+      <w:r>
+        <w:t xml:space="preserve"> Trends in multiple chronic conditions among US adults, by life stage, behavioral risk factor surveillance system, 2013–2023.</w:t>
+      </w:r>
+      <w:r>
+        <w:t xml:space="preserve"> </w:t>
+      </w:r>
+      <w:r>
+        <w:rPr>
+          <w:i/>
+          <w:iCs/>
+        </w:rPr>
+        <w:t xml:space="preserve">Preventing chronic disease</w:t>
+      </w:r>
+      <w:r>
+        <w:t xml:space="preserve">. 2025;22:E15.</w:t>
+      </w:r>
+    </w:p>
+    <w:bookmarkEnd w:id="54"/>
+    <w:bookmarkStart w:id="56" w:name="ref-r-data.table"/>
+    <w:p>
+      <w:pPr>
+        <w:pStyle w:val="Bibliography"/>
+      </w:pPr>
+      <w:r>
+        <w:t xml:space="preserve">23</w:t>
+      </w:r>
+      <w:r>
+        <w:t xml:space="preserve"> </w:t>
+      </w:r>
+      <w:r>
+        <w:t xml:space="preserve">	</w:t>
+      </w:r>
+      <w:r>
+        <w:t xml:space="preserve">Barrett T, Dowle M, Srinivasan A,</w:t>
+      </w:r>
+      <w:r>
+        <w:t xml:space="preserve"> </w:t>
+      </w:r>
+      <w:r>
+        <w:rPr>
+          <w:i/>
+          <w:iCs/>
+        </w:rPr>
+        <w:t xml:space="preserve">et al.</w:t>
+      </w:r>
+      <w:r>
+        <w:t xml:space="preserve"> </w:t>
+      </w:r>
+      <w:hyperlink r:id="rId55">
+        <w:r>
+          <w:rPr>
+            <w:rStyle w:val="Hyperlink"/>
+            <w:i/>
+            <w:iCs/>
+          </w:rPr>
+          <w:t xml:space="preserve">Data.table: Extension of ‘data.frame‘</w:t>
+        </w:r>
+      </w:hyperlink>
+      <w:r>
+        <w:t xml:space="preserve">. 2025.</w:t>
+      </w:r>
+    </w:p>
+    <w:bookmarkEnd w:id="56"/>
+    <w:bookmarkStart w:id="58" w:name="ref-r-dplyr"/>
+    <w:p>
+      <w:pPr>
+        <w:pStyle w:val="Bibliography"/>
+      </w:pPr>
+      <w:r>
+        <w:t xml:space="preserve">24</w:t>
+      </w:r>
+      <w:r>
+        <w:t xml:space="preserve"> </w:t>
+      </w:r>
+      <w:r>
+        <w:t xml:space="preserve">	</w:t>
+      </w:r>
+      <w:r>
+        <w:t xml:space="preserve">Wickham H, François R, Henry L,</w:t>
+      </w:r>
+      <w:r>
+        <w:t xml:space="preserve"> </w:t>
+      </w:r>
+      <w:r>
+        <w:rPr>
+          <w:i/>
+          <w:iCs/>
+        </w:rPr>
+        <w:t xml:space="preserve">et al.</w:t>
+      </w:r>
+      <w:r>
+        <w:t xml:space="preserve"> </w:t>
+      </w:r>
+      <w:hyperlink r:id="rId57">
+        <w:r>
+          <w:rPr>
+            <w:rStyle w:val="Hyperlink"/>
+            <w:i/>
+            <w:iCs/>
+          </w:rPr>
+          <w:t xml:space="preserve">Dplyr: A grammar of data manipulation</w:t>
+        </w:r>
+      </w:hyperlink>
+      <w:r>
+        <w:t xml:space="preserve">. 2023.</w:t>
+      </w:r>
+    </w:p>
+    <w:bookmarkEnd w:id="58"/>
+    <w:bookmarkStart w:id="60" w:name="ref-PhysioNet-mimiciv-3.1"/>
+    <w:p>
+      <w:pPr>
+        <w:pStyle w:val="Bibliography"/>
+      </w:pPr>
+      <w:r>
+        <w:t xml:space="preserve">25</w:t>
+      </w:r>
+      <w:r>
+        <w:t xml:space="preserve"> </w:t>
+      </w:r>
+      <w:r>
+        <w:t xml:space="preserve">	</w:t>
+      </w:r>
+      <w:r>
+        <w:t xml:space="preserve">Johnson A, Bulgarelli L, Pollard T,</w:t>
+      </w:r>
+      <w:r>
+        <w:t xml:space="preserve"> </w:t>
+      </w:r>
+      <w:r>
+        <w:rPr>
+          <w:i/>
+          <w:iCs/>
+        </w:rPr>
+        <w:t xml:space="preserve">et al.</w:t>
+      </w:r>
+      <w:r>
+        <w:t xml:space="preserve"> </w:t>
+      </w:r>
+      <w:r>
+        <w:t xml:space="preserve">MIMIC-IV</w:t>
+      </w:r>
+      <w:r>
+        <w:t xml:space="preserve">.</w:t>
+      </w:r>
+      <w:r>
+        <w:t xml:space="preserve"> </w:t>
+      </w:r>
+      <w:r>
+        <w:rPr>
+          <w:i/>
+          <w:iCs/>
+        </w:rPr>
         <w:t xml:space="preserve">PhysioNet</w:t>
       </w:r>
       <w:r>
@@ -10338,7 +10640,7 @@
       <w:r>
         <w:t xml:space="preserve"> </w:t>
       </w:r>
-      <w:hyperlink r:id="rId52">
+      <w:hyperlink r:id="rId59">
         <w:r>
           <w:rPr>
             <w:rStyle w:val="Hyperlink"/>
@@ -10347,14 +10649,14 @@
         </w:r>
       </w:hyperlink>
     </w:p>
-    <w:bookmarkEnd w:id="53"/>
-    <w:bookmarkStart w:id="54" w:name="ref-johnson2023mimic"/>
+    <w:bookmarkEnd w:id="60"/>
+    <w:bookmarkStart w:id="61" w:name="ref-johnson2023mimic"/>
     <w:p>
       <w:pPr>
         <w:pStyle w:val="Bibliography"/>
       </w:pPr>
       <w:r>
-        <w:t xml:space="preserve">20</w:t>
+        <w:t xml:space="preserve">26</w:t>
       </w:r>
       <w:r>
         <w:t xml:space="preserve"> </w:t>
@@ -10392,14 +10694,14 @@
         <w:t xml:space="preserve">. 2023;10:1.</w:t>
       </w:r>
     </w:p>
-    <w:bookmarkEnd w:id="54"/>
-    <w:bookmarkStart w:id="56" w:name="ref-PhysioNet2000"/>
+    <w:bookmarkEnd w:id="61"/>
+    <w:bookmarkStart w:id="63" w:name="ref-PhysioNet2000"/>
     <w:p>
       <w:pPr>
         <w:pStyle w:val="Bibliography"/>
       </w:pPr>
       <w:r>
-        <w:t xml:space="preserve">21</w:t>
+        <w:t xml:space="preserve">27</w:t>
       </w:r>
       <w:r>
         <w:t xml:space="preserve"> </w:t>
@@ -10445,7 +10747,7 @@
       <w:r>
         <w:t xml:space="preserve"> </w:t>
       </w:r>
-      <w:hyperlink r:id="rId55">
+      <w:hyperlink r:id="rId62">
         <w:r>
           <w:rPr>
             <w:rStyle w:val="Hyperlink"/>
@@ -10454,15 +10756,15 @@
         </w:r>
       </w:hyperlink>
     </w:p>
-    <w:bookmarkEnd w:id="56"/>
-    <w:bookmarkEnd w:id="57"/>
+    <w:bookmarkEnd w:id="63"/>
+    <w:bookmarkEnd w:id="64"/>
     <w:p>
       <w:r>
         <w:br w:type="page"/>
       </w:r>
     </w:p>
-    <w:bookmarkEnd w:id="58"/>
-    <w:bookmarkStart w:id="59" w:name="figures"/>
+    <w:bookmarkEnd w:id="65"/>
+    <w:bookmarkStart w:id="66" w:name="figures"/>
     <w:p>
       <w:pPr>
         <w:pStyle w:val="Heading1"/>
@@ -11246,7 +11548,7 @@
         <w:t xml:space="preserve">flagging.</w:t>
       </w:r>
     </w:p>
-    <w:bookmarkEnd w:id="59"/>
+    <w:bookmarkEnd w:id="66"/>
     <w:sectPr>
       <w:footnotePr>
         <w:numFmt w:val="lowerLetter"/>

</xml_diff>

<commit_message>
update manuscript and supplement
</commit_message>
<xml_diff>
--- a/medicalcoder-manuscript.docx
+++ b/medicalcoder-manuscript.docx
@@ -263,7 +263,7 @@
         <w:t xml:space="preserve"> </w:t>
       </w:r>
       <w:r>
-        <w:t xml:space="preserve">1861 / 2000 (excluding tables)</w:t>
+        <w:t xml:space="preserve">1957 / 2000 (excluding tables)</w:t>
       </w:r>
     </w:p>
     <w:p>
@@ -349,7 +349,7 @@
         <w:t xml:space="preserve">medicalcoder</w:t>
       </w:r>
       <w:r>
-        <w:t xml:space="preserve">: R package for ICD codes and Comorbidities with longitudinal data</w:t>
+        <w:t xml:space="preserve">: R package for ICD codes and comorbidities with longitudinal data</w:t>
       </w:r>
     </w:p>
     <w:p>
@@ -731,7 +731,7 @@
               <w:t xml:space="preserve"> </w:t>
             </w:r>
             <w:r>
-              <w:t xml:space="preserve">a complete database of ICD-9 and ICD-10 codes and provides a single, easy-to-use</w:t>
+              <w:t xml:space="preserve">an internal database of ICD-9 and ICD-10 codes and provides a single, easy-to-use</w:t>
             </w:r>
             <w:r>
               <w:t xml:space="preserve"> </w:t>
@@ -782,7 +782,7 @@
               <w:t xml:space="preserve"> </w:t>
             </w:r>
             <w:r>
-              <w:t xml:space="preserve">has validated encounter-level outputs against reference implementations. It</w:t>
+              <w:t xml:space="preserve">produces encounter-level outputs consistent with reference implementations. It</w:t>
             </w:r>
             <w:r>
               <w:t xml:space="preserve"> </w:t>
@@ -906,7 +906,13 @@
         <w:pStyle w:val="BodyText"/>
       </w:pPr>
       <w:r>
-        <w:t xml:space="preserve">Prior R tools include the archived</w:t>
+        <w:t xml:space="preserve">Other R packages for working with ICD codes and comorbidities include the</w:t>
+      </w:r>
+      <w:r>
+        <w:t xml:space="preserve"> </w:t>
+      </w:r>
+      <w:r>
+        <w:t xml:space="preserve">archived</w:t>
       </w:r>
       <w:r>
         <w:t xml:space="preserve"> </w:t>
@@ -922,13 +928,13 @@
         <w:t xml:space="preserve"> </w:t>
       </w:r>
       <w:r>
-        <w:t xml:space="preserve">package, which provides ICD validation,</w:t>
-      </w:r>
-      <w:r>
-        <w:t xml:space="preserve"> </w:t>
-      </w:r>
-      <w:r>
-        <w:t xml:space="preserve">manipulation, and comorbidity mapping</w:t>
+        <w:t xml:space="preserve">package, which provides ICD validation, manipulation, and</w:t>
+      </w:r>
+      <w:r>
+        <w:t xml:space="preserve"> </w:t>
+      </w:r>
+      <w:r>
+        <w:t xml:space="preserve">comorbidity mapping</w:t>
       </w:r>
       <w:r>
         <w:t xml:space="preserve"> </w:t>
@@ -969,7 +975,13 @@
         <w:t xml:space="preserve"> </w:t>
       </w:r>
       <w:r>
-        <w:t xml:space="preserve">packages which implement specific algorithms</w:t>
+        <w:t xml:space="preserve">packages which</w:t>
+      </w:r>
+      <w:r>
+        <w:t xml:space="preserve"> </w:t>
+      </w:r>
+      <w:r>
+        <w:t xml:space="preserve">implement specific algorithms</w:t>
       </w:r>
       <w:r>
         <w:t xml:space="preserve"> </w:t>
@@ -986,7 +998,7 @@
         <w:pStyle w:val="BodyText"/>
       </w:pPr>
       <w:r>
-        <w:t xml:space="preserve">Despite the importance of longitudinal data in modern medical</w:t>
+        <w:t xml:space="preserve">Despite the importance of longitudinal data in medical</w:t>
       </w:r>
       <w:r>
         <w:t xml:space="preserve"> </w:t>
@@ -1058,13 +1070,13 @@
         <w:t xml:space="preserve"> </w:t>
       </w:r>
       <w:r>
-        <w:t xml:space="preserve">acute care and are appropriately excluded from the index encounter may be missed</w:t>
-      </w:r>
-      <w:r>
-        <w:t xml:space="preserve"> </w:t>
-      </w:r>
-      <w:r>
-        <w:t xml:space="preserve">in subsequent encounters unless the relevant ICD codes are explicitly</w:t>
+        <w:t xml:space="preserve">acute care and are excluded from the index encounter may be missed</w:t>
+      </w:r>
+      <w:r>
+        <w:t xml:space="preserve"> </w:t>
+      </w:r>
+      <w:r>
+        <w:t xml:space="preserve">in subsequent encounters unless the relevant ICD codes are</w:t>
       </w:r>
       <w:r>
         <w:t xml:space="preserve"> </w:t>
@@ -1119,27 +1131,7 @@
         <w:pStyle w:val="BodyText"/>
       </w:pPr>
       <w:r>
-        <w:t xml:space="preserve">There is a need for a tool that applies multiple comorbidity algorithms through</w:t>
-      </w:r>
-      <w:r>
-        <w:t xml:space="preserve"> </w:t>
-      </w:r>
-      <w:r>
-        <w:t xml:space="preserve">a unified API while accounting for algorithm-specific nuances, ICD versions and</w:t>
-      </w:r>
-      <w:r>
-        <w:t xml:space="preserve"> </w:t>
-      </w:r>
-      <w:r>
-        <w:t xml:space="preserve">types, is POA-aware, and handles longitudinal data.</w:t>
-      </w:r>
-    </w:p>
-    <w:p>
-      <w:pPr>
-        <w:pStyle w:val="BodyText"/>
-      </w:pPr>
-      <w:r>
-        <w:t xml:space="preserve">We developed the R package</w:t>
+        <w:t xml:space="preserve">We developed</w:t>
       </w:r>
       <w:r>
         <w:t xml:space="preserve"> </w:t>
@@ -1155,7 +1147,19 @@
         <w:t xml:space="preserve"> </w:t>
       </w:r>
       <w:r>
-        <w:t xml:space="preserve">to fill this need.</w:t>
+        <w:t xml:space="preserve">as a unified, POA-aware API supporting multiple</w:t>
+      </w:r>
+      <w:r>
+        <w:t xml:space="preserve"> </w:t>
+      </w:r>
+      <w:r>
+        <w:t xml:space="preserve">algorithms, algorithm-specific requirements, mixed ICD versions and types, and</w:t>
+      </w:r>
+      <w:r>
+        <w:t xml:space="preserve"> </w:t>
+      </w:r>
+      <w:r>
+        <w:t xml:space="preserve">longitudinal data.</w:t>
       </w:r>
     </w:p>
     <w:bookmarkEnd w:id="11"/>
@@ -1173,25 +1177,25 @@
         <w:pStyle w:val="FirstParagraph"/>
       </w:pPr>
       <w:r>
-        <w:t xml:space="preserve">Develop a fully self-contained R package that includes a comprehensive internal</w:t>
-      </w:r>
-      <w:r>
-        <w:t xml:space="preserve"> </w:t>
-      </w:r>
-      <w:r>
-        <w:t xml:space="preserve">ICD database capable of applying multiple comorbidity algorithms to clinical</w:t>
-      </w:r>
-      <w:r>
-        <w:t xml:space="preserve"> </w:t>
-      </w:r>
-      <w:r>
-        <w:t xml:space="preserve">datasets, and requires no external dependencies, internet access, or external</w:t>
-      </w:r>
-      <w:r>
-        <w:t xml:space="preserve"> </w:t>
-      </w:r>
-      <w:r>
-        <w:t xml:space="preserve">data resources. The package should support simultaneous ICD-9 and ICD-10 coding,</w:t>
+        <w:t xml:space="preserve">Develop a self-contained R package with an internal ICD database capable of</w:t>
+      </w:r>
+      <w:r>
+        <w:t xml:space="preserve"> </w:t>
+      </w:r>
+      <w:r>
+        <w:t xml:space="preserve">applying multiple comorbidity algorithms to clinical datasets without external</w:t>
+      </w:r>
+      <w:r>
+        <w:t xml:space="preserve"> </w:t>
+      </w:r>
+      <w:r>
+        <w:t xml:space="preserve">dependencies, internet access, or data resources. The package should support</w:t>
+      </w:r>
+      <w:r>
+        <w:t xml:space="preserve"> </w:t>
+      </w:r>
+      <w:r>
+        <w:t xml:space="preserve">simultaneous ICD-9 and ICD-10 coding,</w:t>
       </w:r>
       <w:r>
         <w:t xml:space="preserve"> </w:t>
@@ -1237,13 +1241,13 @@
         <w:t xml:space="preserve"> </w:t>
       </w:r>
       <w:r>
-        <w:t xml:space="preserve">was designed with restricted computing environments in mind. No</w:t>
-      </w:r>
-      <w:r>
-        <w:t xml:space="preserve"> </w:t>
-      </w:r>
-      <w:r>
-        <w:t xml:space="preserve">external namespaces are imported, and no external network access is required. R</w:t>
+        <w:t xml:space="preserve">was designed to run within restricted computing environments. No</w:t>
+      </w:r>
+      <w:r>
+        <w:t xml:space="preserve"> </w:t>
+      </w:r>
+      <w:r>
+        <w:t xml:space="preserve">namespaces are imported, and no network access is required. R</w:t>
       </w:r>
       <w:r>
         <w:t xml:space="preserve"> </w:t>
@@ -1273,7 +1277,7 @@
         <w:t xml:space="preserve"> </w:t>
       </w:r>
       <w:r>
-        <w:t xml:space="preserve">version 0.8.1.9002, the internal</w:t>
+        <w:t xml:space="preserve">version 0.9.0, the internal</w:t>
       </w:r>
       <w:r>
         <w:t xml:space="preserve"> </w:t>
@@ -1315,7 +1319,13 @@
         <w:t xml:space="preserve"> </w:t>
       </w:r>
       <w:r>
-        <w:t xml:space="preserve">modification) data from Socialstyrelsen.</w:t>
+        <w:t xml:space="preserve">modification) data from Socialstyrelsen. Future releases will incorporate</w:t>
+      </w:r>
+      <w:r>
+        <w:t xml:space="preserve"> </w:t>
+      </w:r>
+      <w:r>
+        <w:t xml:space="preserve">published updates to supported code sets and additional national modifications.</w:t>
       </w:r>
     </w:p>
     <w:p>
@@ -1461,7 +1471,7 @@
         <w:t xml:space="preserve"> </w:t>
       </w:r>
       <w:r>
-        <w:t xml:space="preserve">and 3.1. The bundled reference data and comorbidity mappings are versioned with</w:t>
+        <w:t xml:space="preserve">and 3.1. The reference data and comorbidity mappings are versioned within</w:t>
       </w:r>
       <w:r>
         <w:t xml:space="preserve"> </w:t>
@@ -1483,25 +1493,7 @@
         <w:t xml:space="preserve"> </w:t>
       </w:r>
       <w:r>
-        <w:t xml:space="preserve">release. Future releases will incorporate newly published</w:t>
-      </w:r>
-      <w:r>
-        <w:t xml:space="preserve"> </w:t>
-      </w:r>
-      <w:r>
-        <w:t xml:space="preserve">revisions of supported ICD code sets; planned extensions include additional</w:t>
-      </w:r>
-      <w:r>
-        <w:t xml:space="preserve"> </w:t>
-      </w:r>
-      <w:r>
-        <w:t xml:space="preserve">national modifications, such as ICD-10-GM (German Modification), and additional</w:t>
-      </w:r>
-      <w:r>
-        <w:t xml:space="preserve"> </w:t>
-      </w:r>
-      <w:r>
-        <w:t xml:space="preserve">published comorbidity algorithms.</w:t>
+        <w:t xml:space="preserve">release.</w:t>
       </w:r>
     </w:p>
     <w:p>
@@ -1525,37 +1517,31 @@
         <w:t xml:space="preserve"> </w:t>
       </w:r>
       <w:r>
-        <w:t xml:space="preserve">lookup tables derived from its internal ICD database. These lookup tables are</w:t>
-      </w:r>
-      <w:r>
-        <w:t xml:space="preserve"> </w:t>
-      </w:r>
-      <w:r>
-        <w:t xml:space="preserve">separate from the broader ICD reference database: selecting a comorbidity method</w:t>
-      </w:r>
-      <w:r>
-        <w:t xml:space="preserve"> </w:t>
-      </w:r>
-      <w:r>
-        <w:t xml:space="preserve">restricts matching to the ICD versions, diagnosis or procedure code types, and</w:t>
-      </w:r>
-      <w:r>
-        <w:t xml:space="preserve"> </w:t>
-      </w:r>
-      <w:r>
-        <w:t xml:space="preserve">condition mappings defined for that algorithm. Unlike implementations that rely</w:t>
-      </w:r>
-      <w:r>
-        <w:t xml:space="preserve"> </w:t>
-      </w:r>
-      <w:r>
-        <w:t xml:space="preserve">primarily on partial string matching or regular</w:t>
-      </w:r>
-      <w:r>
-        <w:t xml:space="preserve"> </w:t>
-      </w:r>
-      <w:r>
-        <w:t xml:space="preserve">expressions</w:t>
+        <w:t xml:space="preserve">lookup tables derived from, but distinct from, its broader internal ICD</w:t>
+      </w:r>
+      <w:r>
+        <w:t xml:space="preserve"> </w:t>
+      </w:r>
+      <w:r>
+        <w:t xml:space="preserve">database. Each table defines the ICD versions (9 or 10), code types (diagnosis</w:t>
+      </w:r>
+      <w:r>
+        <w:t xml:space="preserve"> </w:t>
+      </w:r>
+      <w:r>
+        <w:t xml:space="preserve">or procedure), full and compact code forms, and condition mappings supported by</w:t>
+      </w:r>
+      <w:r>
+        <w:t xml:space="preserve"> </w:t>
+      </w:r>
+      <w:r>
+        <w:t xml:space="preserve">the selected algorithm. Unlike implementations based primarily on partial string</w:t>
+      </w:r>
+      <w:r>
+        <w:t xml:space="preserve"> </w:t>
+      </w:r>
+      <w:r>
+        <w:t xml:space="preserve">matching or regular expressions</w:t>
       </w:r>
       <w:r>
         <w:t xml:space="preserve"> </w:t>
@@ -1580,7 +1566,43 @@
         <w:t xml:space="preserve"> </w:t>
       </w:r>
       <w:r>
-        <w:t xml:space="preserve">maps input codes to known ICD codes by database-style joins.</w:t>
+        <w:t xml:space="preserve">defaults</w:t>
+      </w:r>
+      <w:r>
+        <w:t xml:space="preserve"> </w:t>
+      </w:r>
+      <w:r>
+        <w:t xml:space="preserve">to matching input against precomputed valid ICD codes through database-style</w:t>
+      </w:r>
+      <w:r>
+        <w:t xml:space="preserve"> </w:t>
+      </w:r>
+      <w:r>
+        <w:t xml:space="preserve">joins. For supported methods, users may select method-specific regular-expression mappings. Dataset-</w:t>
+      </w:r>
+      <w:r>
+        <w:t xml:space="preserve"> </w:t>
+      </w:r>
+      <w:r>
+        <w:t xml:space="preserve">or row-level metadata can identify ICD version and code type, allowing mixed</w:t>
+      </w:r>
+      <w:r>
+        <w:t xml:space="preserve"> </w:t>
+      </w:r>
+      <w:r>
+        <w:t xml:space="preserve">ICD-9 and ICD-10 diagnosis and procedure codes within a dataset or encounter.</w:t>
+      </w:r>
+      <w:r>
+        <w:t xml:space="preserve"> </w:t>
+      </w:r>
+      <w:r>
+        <w:t xml:space="preserve">Matches are reduced to unique encounter-condition combinations before binary</w:t>
+      </w:r>
+      <w:r>
+        <w:t xml:space="preserve"> </w:t>
+      </w:r>
+      <w:r>
+        <w:t xml:space="preserve">indicators are assigned.</w:t>
       </w:r>
     </w:p>
     <w:p>
@@ -1588,91 +1610,19 @@
         <w:pStyle w:val="BodyText"/>
       </w:pPr>
       <w:r>
-        <w:t xml:space="preserve">Each lookup table records ICD version (</w:t>
-      </w:r>
-      <w:r>
-        <w:rPr>
-          <w:rStyle w:val="VerbatimChar"/>
-        </w:rPr>
-        <w:t xml:space="preserve">icdv</w:t>
-      </w:r>
-      <w:r>
-        <w:t xml:space="preserve">; 9 or 10), code type (</w:t>
-      </w:r>
-      <w:r>
-        <w:rPr>
-          <w:rStyle w:val="VerbatimChar"/>
-        </w:rPr>
-        <w:t xml:space="preserve">dx</w:t>
-      </w:r>
-      <w:r>
-        <w:t xml:space="preserve">; 1 for</w:t>
-      </w:r>
-      <w:r>
-        <w:t xml:space="preserve"> </w:t>
-      </w:r>
-      <w:r>
-        <w:t xml:space="preserve">diagnosis and 0 for procedure), full ICD code form (</w:t>
-      </w:r>
-      <w:r>
-        <w:rPr>
-          <w:rStyle w:val="VerbatimChar"/>
-        </w:rPr>
-        <w:t xml:space="preserve">full_code</w:t>
-      </w:r>
-      <w:r>
-        <w:t xml:space="preserve">; e.g., C18.9),</w:t>
-      </w:r>
-      <w:r>
-        <w:t xml:space="preserve"> </w:t>
-      </w:r>
-      <w:r>
-        <w:t xml:space="preserve">compact ICD code form (</w:t>
-      </w:r>
-      <w:r>
-        <w:rPr>
-          <w:rStyle w:val="VerbatimChar"/>
-        </w:rPr>
-        <w:t xml:space="preserve">code</w:t>
-      </w:r>
-      <w:r>
-        <w:t xml:space="preserve">; e.g., C189), and the corresponding comorbidity</w:t>
-      </w:r>
-      <w:r>
-        <w:t xml:space="preserve"> </w:t>
-      </w:r>
-      <w:r>
-        <w:t xml:space="preserve">condition. Depending on user-supplied metadata, matching can use dataset-level</w:t>
-      </w:r>
-      <w:r>
-        <w:t xml:space="preserve"> </w:t>
-      </w:r>
-      <w:r>
-        <w:t xml:space="preserve">or row-level ICD version and diagnosis/procedure indicators, allowing ICD-9 and</w:t>
-      </w:r>
-      <w:r>
-        <w:t xml:space="preserve"> </w:t>
-      </w:r>
-      <w:r>
-        <w:t xml:space="preserve">ICD-10 codes, and diagnosis and procedure codes, to be evaluated within the same</w:t>
-      </w:r>
-      <w:r>
-        <w:t xml:space="preserve"> </w:t>
-      </w:r>
-      <w:r>
-        <w:t xml:space="preserve">dataset or encounter. Matches are collapsed to unique encounter-condition</w:t>
-      </w:r>
-      <w:r>
-        <w:t xml:space="preserve"> </w:t>
-      </w:r>
-      <w:r>
-        <w:t xml:space="preserve">combinations before binary indicators are calculated, so repeated codes or</w:t>
-      </w:r>
-      <w:r>
-        <w:t xml:space="preserve"> </w:t>
-      </w:r>
-      <w:r>
-        <w:t xml:space="preserve">multiple codes mapping to the same condition do not inflate condition counts.</w:t>
+        <w:t xml:space="preserve">Because code text alone cannot reliably distinguish jurisdictional variants such</w:t>
+      </w:r>
+      <w:r>
+        <w:t xml:space="preserve"> </w:t>
+      </w:r>
+      <w:r>
+        <w:t xml:space="preserve">as WHO ICD-10 and ICD-10-CM, users must select a method appropriate to their</w:t>
+      </w:r>
+      <w:r>
+        <w:t xml:space="preserve"> </w:t>
+      </w:r>
+      <w:r>
+        <w:t xml:space="preserve">source coding system and provide accurate code-system metadata.</w:t>
       </w:r>
     </w:p>
     <w:p>
@@ -1680,19 +1630,92 @@
         <w:pStyle w:val="BodyText"/>
       </w:pPr>
       <w:r>
-        <w:t xml:space="preserve">Because code text alone cannot reliably distinguish jurisdictional variants such</w:t>
-      </w:r>
-      <w:r>
-        <w:t xml:space="preserve"> </w:t>
-      </w:r>
-      <w:r>
-        <w:t xml:space="preserve">as WHO ICD-10 and ICD-10-CM, users must select a method appropriate to their</w:t>
-      </w:r>
-      <w:r>
-        <w:t xml:space="preserve"> </w:t>
-      </w:r>
-      <w:r>
-        <w:t xml:space="preserve">source coding system and provide accurate code-system metadata.</w:t>
+        <w:t xml:space="preserve">A comprehensive test suite runs through GitHub Actions and the Comprehensive R</w:t>
+      </w:r>
+      <w:r>
+        <w:t xml:space="preserve"> </w:t>
+      </w:r>
+      <w:r>
+        <w:t xml:space="preserve">Archive Network (CRAN), with additional compatibility testing across supported R</w:t>
+      </w:r>
+      <w:r>
+        <w:t xml:space="preserve"> </w:t>
+      </w:r>
+      <w:r>
+        <w:t xml:space="preserve">versions. Encounter-level outputs are compared with published R, SAS, and SQL</w:t>
+      </w:r>
+      <w:r>
+        <w:t xml:space="preserve"> </w:t>
+      </w:r>
+      <w:r>
+        <w:t xml:space="preserve">implementations: PCCC v2.0 with pccc</w:t>
+      </w:r>
+      <w:r>
+        <w:t xml:space="preserve"> </w:t>
+      </w:r>
+      <w:r>
+        <w:t xml:space="preserve">[13]</w:t>
+      </w:r>
+      <w:r>
+        <w:t xml:space="preserve">, AHRQ Elixhauser variants</w:t>
+      </w:r>
+      <w:r>
+        <w:t xml:space="preserve"> </w:t>
+      </w:r>
+      <w:r>
+        <w:t xml:space="preserve">with the published AHRQ SAS programs</w:t>
+      </w:r>
+      <w:r>
+        <w:t xml:space="preserve"> </w:t>
+      </w:r>
+      <w:r>
+        <w:t xml:space="preserve">[5]</w:t>
+      </w:r>
+      <w:r>
+        <w:t xml:space="preserve">, and Charlson variants with</w:t>
+      </w:r>
+      <w:r>
+        <w:t xml:space="preserve"> </w:t>
+      </w:r>
+      <w:r>
+        <w:rPr>
+          <w:i/>
+          <w:iCs/>
+        </w:rPr>
+        <w:t xml:space="preserve">comorbidity</w:t>
+      </w:r>
+      <w:r>
+        <w:t xml:space="preserve"> </w:t>
+      </w:r>
+      <w:r>
+        <w:t xml:space="preserve">[12]</w:t>
+      </w:r>
+      <w:r>
+        <w:t xml:space="preserve"> </w:t>
+      </w:r>
+      <w:r>
+        <w:t xml:space="preserve">and MIMIC-IV Code</w:t>
+      </w:r>
+      <w:r>
+        <w:t xml:space="preserve"> </w:t>
+      </w:r>
+      <w:r>
+        <w:t xml:space="preserve">[24]</w:t>
+      </w:r>
+      <w:r>
+        <w:t xml:space="preserve">.</w:t>
+      </w:r>
+      <w:r>
+        <w:t xml:space="preserve"> </w:t>
+      </w:r>
+      <w:r>
+        <w:t xml:space="preserve">Testing workflows and comparisons are provided in the package repository and</w:t>
+      </w:r>
+      <w:r>
+        <w:t xml:space="preserve"> </w:t>
+      </w:r>
+      <w:r>
+        <w:t xml:space="preserve">Supplement.</w:t>
       </w:r>
     </w:p>
     <w:p>
@@ -1700,78 +1723,7 @@
         <w:pStyle w:val="BodyText"/>
       </w:pPr>
       <w:r>
-        <w:t xml:space="preserve">A comprehensive test suite runs through GitHub Actions and CRAN, with additional</w:t>
-      </w:r>
-      <w:r>
-        <w:t xml:space="preserve"> </w:t>
-      </w:r>
-      <w:r>
-        <w:t xml:space="preserve">compatibility testing across supported R versions. Encounter-level outputs are</w:t>
-      </w:r>
-      <w:r>
-        <w:t xml:space="preserve"> </w:t>
-      </w:r>
-      <w:r>
-        <w:t xml:space="preserve">compared with published R, SAS, and SQL implementations: PCCC v2.0 with pccc</w:t>
-      </w:r>
-      <w:r>
-        <w:t xml:space="preserve"> </w:t>
-      </w:r>
-      <w:r>
-        <w:t xml:space="preserve">[13]</w:t>
-      </w:r>
-      <w:r>
-        <w:t xml:space="preserve">, AHRQ Elixhauser variants with the published AHRQ SAS programs</w:t>
-      </w:r>
-      <w:r>
-        <w:t xml:space="preserve"> </w:t>
-      </w:r>
-      <w:r>
-        <w:t xml:space="preserve">[5]</w:t>
-      </w:r>
-      <w:r>
-        <w:t xml:space="preserve">, and Charlson variants with comorbidity</w:t>
-      </w:r>
-      <w:r>
-        <w:t xml:space="preserve"> </w:t>
-      </w:r>
-      <w:r>
-        <w:t xml:space="preserve">[12]</w:t>
-      </w:r>
-      <w:r>
-        <w:t xml:space="preserve"> </w:t>
-      </w:r>
-      <w:r>
-        <w:t xml:space="preserve">and</w:t>
-      </w:r>
-      <w:r>
-        <w:t xml:space="preserve"> </w:t>
-      </w:r>
-      <w:r>
-        <w:t xml:space="preserve">MIMIC-IV Code</w:t>
-      </w:r>
-      <w:r>
-        <w:t xml:space="preserve"> </w:t>
-      </w:r>
-      <w:r>
-        <w:t xml:space="preserve">[24]</w:t>
-      </w:r>
-      <w:r>
-        <w:t xml:space="preserve">. Reproducible testing workflows and</w:t>
-      </w:r>
-      <w:r>
-        <w:t xml:space="preserve"> </w:t>
-      </w:r>
-      <w:r>
-        <w:t xml:space="preserve">detailed comparisons are provided in the package repository and Supplement.</w:t>
-      </w:r>
-    </w:p>
-    <w:p>
-      <w:pPr>
-        <w:pStyle w:val="BodyText"/>
-      </w:pPr>
-      <w:r>
-        <w:t xml:space="preserve">We use MIMIC-IV v3.1</w:t>
+        <w:t xml:space="preserve">We use the MIMIC-IV v3.1 dataset</w:t>
       </w:r>
       <w:r>
         <w:t xml:space="preserve"> </w:t>
@@ -1783,19 +1735,13 @@
         <w:t xml:space="preserve"> </w:t>
       </w:r>
       <w:r>
-        <w:t xml:space="preserve">for examples, validation, and benchmarking, not clinical inference. This caveat</w:t>
-      </w:r>
-      <w:r>
-        <w:t xml:space="preserve"> </w:t>
-      </w:r>
-      <w:r>
-        <w:t xml:space="preserve">is important because pediatric methods are demonstrated using adult data. We</w:t>
-      </w:r>
-      <w:r>
-        <w:t xml:space="preserve"> </w:t>
-      </w:r>
-      <w:r>
-        <w:t xml:space="preserve">compare</w:t>
+        <w:t xml:space="preserve">for examples, validation, and benchmarking, not clinical inference. Pediatric</w:t>
+      </w:r>
+      <w:r>
+        <w:t xml:space="preserve"> </w:t>
+      </w:r>
+      <w:r>
+        <w:t xml:space="preserve">comorbidity algorithms are demonstrated using adult data. We compare</w:t>
       </w:r>
       <w:r>
         <w:t xml:space="preserve"> </w:t>
@@ -1930,7 +1876,7 @@
         <w:t xml:space="preserve"> </w:t>
       </w:r>
       <w:r>
-        <w:t xml:space="preserve">encounters contain both ICD-9 and ICD-10 codes.</w:t>
+        <w:t xml:space="preserve">encounters contain both versions.</w:t>
       </w:r>
     </w:p>
     <w:p>
@@ -1938,61 +1884,46 @@
         <w:pStyle w:val="BodyText"/>
       </w:pPr>
       <w:r>
-        <w:t xml:space="preserve">A single function,</w:t>
-      </w:r>
-      <w:r>
-        <w:t xml:space="preserve"> </w:t>
-      </w:r>
-      <w:r>
         <w:rPr>
           <w:rStyle w:val="VerbatimChar"/>
         </w:rPr>
         <w:t xml:space="preserve">medicalcoder::comorbidities()</w:t>
       </w:r>
       <w:r>
-        <w:t xml:space="preserve">, applies any of</w:t>
-      </w:r>
-      <w:r>
-        <w:t xml:space="preserve"> </w:t>
-      </w:r>
-      <w:r>
-        <w:t xml:space="preserve">21 implemented comorbidity</w:t>
-      </w:r>
-      <w:r>
-        <w:t xml:space="preserve"> </w:t>
-      </w:r>
-      <w:r>
-        <w:t xml:space="preserve">algorithms. The input data are expected</w:t>
-      </w:r>
-      <w:r>
-        <w:t xml:space="preserve"> </w:t>
-      </w:r>
-      <w:r>
-        <w:t xml:space="preserve">to be in long format, one ICD code per row, with optional columns for</w:t>
-      </w:r>
-      <w:r>
-        <w:t xml:space="preserve"> </w:t>
-      </w:r>
-      <w:r>
-        <w:t xml:space="preserve">identification variables (e.g., patient and encounter ids), ICD version, ICD type, POA</w:t>
-      </w:r>
-      <w:r>
-        <w:t xml:space="preserve"> </w:t>
-      </w:r>
-      <w:r>
-        <w:t xml:space="preserve">indicator, and primary diagnosis indicator (Figure 1). The ICD codes can be full, compact,</w:t>
-      </w:r>
-      <w:r>
-        <w:t xml:space="preserve"> </w:t>
-      </w:r>
-      <w:r>
-        <w:t xml:space="preserve">or a combination thereof. A single patient/encounter record may contain ICD-9,</w:t>
-      </w:r>
-      <w:r>
-        <w:t xml:space="preserve"> </w:t>
-      </w:r>
-      <w:r>
-        <w:t xml:space="preserve">ICD-10, or both.</w:t>
+        <w:t xml:space="preserve"> </w:t>
+      </w:r>
+      <w:r>
+        <w:t xml:space="preserve">can apply</w:t>
+      </w:r>
+      <w:r>
+        <w:t xml:space="preserve"> </w:t>
+      </w:r>
+      <w:r>
+        <w:t xml:space="preserve">21 comorbidity</w:t>
+      </w:r>
+      <w:r>
+        <w:t xml:space="preserve"> </w:t>
+      </w:r>
+      <w:r>
+        <w:t xml:space="preserve">algorithms to long-format, one ICD code per row, data. Optional columns identify</w:t>
+      </w:r>
+      <w:r>
+        <w:t xml:space="preserve"> </w:t>
+      </w:r>
+      <w:r>
+        <w:t xml:space="preserve">patients and/or encounters, ICD version and type, POA, and primary diagnosis</w:t>
+      </w:r>
+      <w:r>
+        <w:t xml:space="preserve"> </w:t>
+      </w:r>
+      <w:r>
+        <w:t xml:space="preserve">(Figure 1). A single patient record may contain mixed ICD code versions and</w:t>
+      </w:r>
+      <w:r>
+        <w:t xml:space="preserve"> </w:t>
+      </w:r>
+      <w:r>
+        <w:t xml:space="preserve">types in full or compact forms.</w:t>
       </w:r>
     </w:p>
     <w:p>
@@ -2000,7 +1931,7 @@
         <w:pStyle w:val="BodyText"/>
       </w:pPr>
       <w:r>
-        <w:t xml:space="preserve">Figure 1 shows several arguments provided in paired forms (e.g.,</w:t>
+        <w:t xml:space="preserve">Paired arguments (e.g.,</w:t>
       </w:r>
       <w:r>
         <w:t xml:space="preserve"> </w:t>
@@ -2027,7 +1958,19 @@
         <w:t xml:space="preserve">dx.var</w:t>
       </w:r>
       <w:r>
-        <w:t xml:space="preserve">,</w:t>
+        <w:t xml:space="preserve">) specify dataset-level values or row-level</w:t>
+      </w:r>
+      <w:r>
+        <w:t xml:space="preserve"> </w:t>
+      </w:r>
+      <w:r>
+        <w:t xml:space="preserve">columns, respectively, avoiding constant-valued columns while supporting</w:t>
+      </w:r>
+      <w:r>
+        <w:t xml:space="preserve"> </w:t>
+      </w:r>
+      <w:r>
+        <w:t xml:space="preserve">row-level variation. If both are supplied, the</w:t>
       </w:r>
       <w:r>
         <w:t xml:space="preserve"> </w:t>
@@ -2036,100 +1979,19 @@
         <w:rPr>
           <w:rStyle w:val="VerbatimChar"/>
         </w:rPr>
-        <w:t xml:space="preserve">icdv</w:t>
-      </w:r>
-      <w:r>
-        <w:t xml:space="preserve"> </w:t>
-      </w:r>
-      <w:r>
-        <w:t xml:space="preserve">and</w:t>
-      </w:r>
-      <w:r>
-        <w:t xml:space="preserve"> </w:t>
-      </w:r>
-      <w:r>
-        <w:rPr>
-          <w:rStyle w:val="VerbatimChar"/>
-        </w:rPr>
-        <w:t xml:space="preserve">icdv.var</w:t>
-      </w:r>
-      <w:r>
-        <w:t xml:space="preserve">): arguments without the</w:t>
-      </w:r>
-      <w:r>
-        <w:t xml:space="preserve"> </w:t>
-      </w:r>
-      <w:r>
-        <w:rPr>
-          <w:rStyle w:val="VerbatimChar"/>
-        </w:rPr>
         <w:t xml:space="preserve">.var</w:t>
       </w:r>
       <w:r>
         <w:t xml:space="preserve"> </w:t>
       </w:r>
       <w:r>
-        <w:t xml:space="preserve">suffix specify dataset-level</w:t>
-      </w:r>
-      <w:r>
-        <w:t xml:space="preserve"> </w:t>
-      </w:r>
-      <w:r>
-        <w:t xml:space="preserve">invariants, whereas</w:t>
-      </w:r>
-      <w:r>
-        <w:t xml:space="preserve"> </w:t>
-      </w:r>
-      <w:r>
-        <w:rPr>
-          <w:rStyle w:val="VerbatimChar"/>
-        </w:rPr>
-        <w:t xml:space="preserve">.var</w:t>
-      </w:r>
-      <w:r>
-        <w:t xml:space="preserve"> </w:t>
-      </w:r>
-      <w:r>
-        <w:t xml:space="preserve">arguments reference columns encoding row-level</w:t>
-      </w:r>
-      <w:r>
-        <w:t xml:space="preserve"> </w:t>
-      </w:r>
-      <w:r>
-        <w:t xml:space="preserve">variation. This avoids creating constant-valued columns when dataset-level</w:t>
-      </w:r>
-      <w:r>
-        <w:t xml:space="preserve"> </w:t>
-      </w:r>
-      <w:r>
-        <w:t xml:space="preserve">properties are already known while still supporting heterogeneous datasets. When</w:t>
-      </w:r>
-      <w:r>
-        <w:t xml:space="preserve"> </w:t>
-      </w:r>
-      <w:r>
-        <w:t xml:space="preserve">both forms are supplied, the</w:t>
-      </w:r>
-      <w:r>
-        <w:t xml:space="preserve"> </w:t>
-      </w:r>
-      <w:r>
-        <w:rPr>
-          <w:rStyle w:val="VerbatimChar"/>
-        </w:rPr>
-        <w:t xml:space="preserve">.var</w:t>
-      </w:r>
-      <w:r>
-        <w:t xml:space="preserve"> </w:t>
-      </w:r>
-      <w:r>
-        <w:t xml:space="preserve">form takes precedence and a warning is</w:t>
-      </w:r>
-      <w:r>
-        <w:t xml:space="preserve"> </w:t>
-      </w:r>
-      <w:r>
-        <w:t xml:space="preserve">issued.</w:t>
+        <w:t xml:space="preserve">argument takes precedence</w:t>
+      </w:r>
+      <w:r>
+        <w:t xml:space="preserve"> </w:t>
+      </w:r>
+      <w:r>
+        <w:t xml:space="preserve">and a warning is issued.</w:t>
       </w:r>
     </w:p>
     <w:p>
@@ -2137,12 +1999,6 @@
         <w:pStyle w:val="BodyText"/>
       </w:pPr>
       <w:r>
-        <w:t xml:space="preserve">The</w:t>
-      </w:r>
-      <w:r>
-        <w:t xml:space="preserve"> </w:t>
-      </w:r>
-      <w:r>
         <w:rPr>
           <w:rStyle w:val="VerbatimChar"/>
         </w:rPr>
@@ -2152,19 +2008,40 @@
         <w:t xml:space="preserve"> </w:t>
       </w:r>
       <w:r>
-        <w:t xml:space="preserve">argument controls how comorbidities are summarized into</w:t>
-      </w:r>
-      <w:r>
-        <w:t xml:space="preserve"> </w:t>
-      </w:r>
-      <w:r>
-        <w:t xml:space="preserve">encounter-level flags. When flag.method =</w:t>
-      </w:r>
-      <w:r>
-        <w:t xml:space="preserve"> </w:t>
-      </w:r>
-      <w:r>
-        <w:t xml:space="preserve">“current”</w:t>
+        <w:t xml:space="preserve">defines encounter-level summaries:</w:t>
+      </w:r>
+      <w:r>
+        <w:t xml:space="preserve"> </w:t>
+      </w:r>
+      <w:r>
+        <w:t xml:space="preserve">with</w:t>
+      </w:r>
+      <w:r>
+        <w:t xml:space="preserve"> </w:t>
+      </w:r>
+      <w:r>
+        <w:rPr>
+          <w:rStyle w:val="VerbatimChar"/>
+        </w:rPr>
+        <w:t xml:space="preserve">flag.method = "current"</w:t>
+      </w:r>
+      <w:r>
+        <w:t xml:space="preserve">, omission treats the dataset as one encounter;</w:t>
+      </w:r>
+      <w:r>
+        <w:t xml:space="preserve"> </w:t>
+      </w:r>
+      <w:r>
+        <w:t xml:space="preserve">with</w:t>
+      </w:r>
+      <w:r>
+        <w:t xml:space="preserve"> </w:t>
+      </w:r>
+      <w:r>
+        <w:rPr>
+          <w:rStyle w:val="VerbatimChar"/>
+        </w:rPr>
+        <w:t xml:space="preserve">flag.method = "cumulative"</w:t>
       </w:r>
       <w:r>
         <w:t xml:space="preserve">,</w:t>
@@ -2182,67 +2059,19 @@
         <w:t xml:space="preserve"> </w:t>
       </w:r>
       <w:r>
-        <w:t xml:space="preserve">is optional; if</w:t>
-      </w:r>
-      <w:r>
-        <w:t xml:space="preserve"> </w:t>
-      </w:r>
-      <w:r>
-        <w:t xml:space="preserve">omitted, the entire dataset is treated as a single encounter. For longitudinal</w:t>
-      </w:r>
-      <w:r>
-        <w:t xml:space="preserve"> </w:t>
-      </w:r>
-      <w:r>
-        <w:t xml:space="preserve">flagging (</w:t>
-      </w:r>
-      <w:r>
-        <w:rPr>
-          <w:rStyle w:val="VerbatimChar"/>
-        </w:rPr>
-        <w:t xml:space="preserve">flag.method = "cumulative"</w:t>
-      </w:r>
-      <w:r>
-        <w:t xml:space="preserve">),</w:t>
-      </w:r>
-      <w:r>
-        <w:t xml:space="preserve"> </w:t>
-      </w:r>
-      <w:r>
-        <w:rPr>
-          <w:rStyle w:val="VerbatimChar"/>
-        </w:rPr>
-        <w:t xml:space="preserve">id.vars</w:t>
-      </w:r>
-      <w:r>
-        <w:t xml:space="preserve"> </w:t>
-      </w:r>
-      <w:r>
         <w:t xml:space="preserve">must include at least two</w:t>
       </w:r>
       <w:r>
         <w:t xml:space="preserve"> </w:t>
       </w:r>
       <w:r>
-        <w:t xml:space="preserve">variables: the leading variables define the patient and the final variable</w:t>
-      </w:r>
-      <w:r>
-        <w:t xml:space="preserve"> </w:t>
-      </w:r>
-      <w:r>
-        <w:t xml:space="preserve">defines within-patient order for carrying ICD codes forward across encounters.</w:t>
-      </w:r>
-      <w:r>
-        <w:t xml:space="preserve"> </w:t>
-      </w:r>
-      <w:r>
-        <w:t xml:space="preserve">Additional details on the function arguments are provided in Section 5.1 of the</w:t>
-      </w:r>
-      <w:r>
-        <w:t xml:space="preserve"> </w:t>
-      </w:r>
-      <w:r>
-        <w:t xml:space="preserve">Supplement.</w:t>
+        <w:t xml:space="preserve">variables defining the patient and within-patient encounter order (Supplement</w:t>
+      </w:r>
+      <w:r>
+        <w:t xml:space="preserve"> </w:t>
+      </w:r>
+      <w:r>
+        <w:t xml:space="preserve">Section 5.1).</w:t>
       </w:r>
     </w:p>
     <w:p>
@@ -2250,42 +2079,22 @@
         <w:pStyle w:val="BodyText"/>
       </w:pPr>
       <w:r>
-        <w:t xml:space="preserve">The ordering variable may be a date/time (e.g., admission time) or a numeric</w:t>
-      </w:r>
-      <w:r>
-        <w:t xml:space="preserve"> </w:t>
-      </w:r>
-      <w:r>
-        <w:t xml:space="preserve">sequence (e.g., encounter number). In large datasets, using an integer sequence</w:t>
-      </w:r>
-      <w:r>
-        <w:t xml:space="preserve"> </w:t>
-      </w:r>
-      <w:r>
-        <w:t xml:space="preserve">often reduces overhead relative to sorting and joining on POSIXct timestamps.</w:t>
-      </w:r>
-    </w:p>
-    <w:p>
-      <w:pPr>
-        <w:pStyle w:val="BodyText"/>
-      </w:pPr>
+        <w:t xml:space="preserve">Output preserves the input</w:t>
+      </w:r>
+      <w:r>
+        <w:t xml:space="preserve"> </w:t>
+      </w:r>
       <w:r>
         <w:rPr>
           <w:rStyle w:val="VerbatimChar"/>
         </w:rPr>
-        <w:t xml:space="preserve">medicalcoder::comorbidities()</w:t>
-      </w:r>
-      <w:r>
-        <w:t xml:space="preserve"> </w:t>
-      </w:r>
-      <w:r>
-        <w:t xml:space="preserve">returns an object of the same class as the input</w:t>
-      </w:r>
-      <w:r>
-        <w:t xml:space="preserve"> </w:t>
-      </w:r>
-      <w:r>
-        <w:t xml:space="preserve">data.frame, containing the</w:t>
+        <w:t xml:space="preserve">data.frame</w:t>
+      </w:r>
+      <w:r>
+        <w:t xml:space="preserve"> </w:t>
+      </w:r>
+      <w:r>
+        <w:t xml:space="preserve">class and includes</w:t>
       </w:r>
       <w:r>
         <w:t xml:space="preserve"> </w:t>
@@ -2330,23 +2139,7 @@
         <w:t xml:space="preserve">cmrb_flag</w:t>
       </w:r>
       <w:r>
-        <w:t xml:space="preserve">.</w:t>
-      </w:r>
-      <w:r>
-        <w:t xml:space="preserve"> </w:t>
-      </w:r>
-      <w:r>
-        <w:rPr>
-          <w:i/>
-          <w:iCs/>
-        </w:rPr>
-        <w:t xml:space="preserve">medicalcoder</w:t>
-      </w:r>
-      <w:r>
-        <w:t xml:space="preserve"> </w:t>
-      </w:r>
-      <w:r>
-        <w:t xml:space="preserve">also provides an S3</w:t>
+        <w:t xml:space="preserve">. An S3</w:t>
       </w:r>
       <w:r>
         <w:t xml:space="preserve"> </w:t>
@@ -2361,7 +2154,7 @@
         <w:t xml:space="preserve"> </w:t>
       </w:r>
       <w:r>
-        <w:t xml:space="preserve">method to generate count and percentage tables (Table 1).</w:t>
+        <w:t xml:space="preserve">method generates count and percentage tables (Table 1).</w:t>
       </w:r>
     </w:p>
     <w:p>
@@ -4581,13 +4374,13 @@
         <w:t xml:space="preserve"> </w:t>
       </w:r>
       <w:r>
-        <w:t xml:space="preserve">required marked POA, on each encounter; naïve accumulation may miss condition</w:t>
-      </w:r>
-      <w:r>
-        <w:t xml:space="preserve"> </w:t>
-      </w:r>
-      <w:r>
-        <w:t xml:space="preserve">history or severity.</w:t>
+        <w:t xml:space="preserve">required, marked POA at each encounter. Omissions may under-ascertain conditions</w:t>
+      </w:r>
+      <w:r>
+        <w:t xml:space="preserve"> </w:t>
+      </w:r>
+      <w:r>
+        <w:t xml:space="preserve">or severity.</w:t>
       </w:r>
     </w:p>
     <w:p>
@@ -4595,67 +4388,61 @@
         <w:pStyle w:val="BodyText"/>
       </w:pPr>
       <w:r>
-        <w:t xml:space="preserve">Figure 2 summarizes how cumulative flagging changes comorbidity profiles</w:t>
-      </w:r>
-      <w:r>
-        <w:t xml:space="preserve"> </w:t>
-      </w:r>
-      <w:r>
-        <w:t xml:space="preserve">relative to encounter-level flagging. The plotted measures are descriptive and</w:t>
-      </w:r>
-      <w:r>
-        <w:t xml:space="preserve"> </w:t>
-      </w:r>
-      <w:r>
-        <w:t xml:space="preserve">not mutually exclusive. Any differences in condition classification or</w:t>
-      </w:r>
-      <w:r>
-        <w:t xml:space="preserve"> </w:t>
-      </w:r>
-      <w:r>
-        <w:t xml:space="preserve">comorbidity count are reported as</w:t>
-      </w:r>
-      <w:r>
-        <w:t xml:space="preserve"> </w:t>
-      </w:r>
-      <w:r>
-        <w:t xml:space="preserve">“different risk profile.”</w:t>
-      </w:r>
-      <w:r>
-        <w:t xml:space="preserve"> </w:t>
-      </w:r>
-      <w:r>
-        <w:t xml:space="preserve">The remaining measures</w:t>
-      </w:r>
-      <w:r>
-        <w:t xml:space="preserve"> </w:t>
-      </w:r>
-      <w:r>
-        <w:t xml:space="preserve">describe scenarios comprising that difference. Subject-level percentages use</w:t>
-      </w:r>
-      <w:r>
-        <w:t xml:space="preserve"> </w:t>
-      </w:r>
-      <w:r>
-        <w:t xml:space="preserve">subjects with at least two encounters and at least one non-initial encounter</w:t>
-      </w:r>
-      <w:r>
-        <w:t xml:space="preserve"> </w:t>
-      </w:r>
-      <w:r>
-        <w:t xml:space="preserve">with a cumulative comorbidity flag as the denominator. Encounter-level</w:t>
-      </w:r>
-      <w:r>
-        <w:t xml:space="preserve"> </w:t>
-      </w:r>
-      <w:r>
-        <w:t xml:space="preserve">percentages use non-initial encounters with at least one cumulative comorbidity</w:t>
-      </w:r>
-      <w:r>
-        <w:t xml:space="preserve"> </w:t>
-      </w:r>
-      <w:r>
-        <w:t xml:space="preserve">flag as the denominator.</w:t>
+        <w:t xml:space="preserve">Figure 2 compares cumulative and current profiles using descriptive,</w:t>
+      </w:r>
+      <w:r>
+        <w:t xml:space="preserve"> </w:t>
+      </w:r>
+      <w:r>
+        <w:t xml:space="preserve">nonexclusive measures.</w:t>
+      </w:r>
+      <w:r>
+        <w:t xml:space="preserve"> </w:t>
+      </w:r>
+      <w:r>
+        <w:t xml:space="preserve">“Different risk profile”</w:t>
+      </w:r>
+      <w:r>
+        <w:t xml:space="preserve"> </w:t>
+      </w:r>
+      <w:r>
+        <w:t xml:space="preserve">denotes any difference in</w:t>
+      </w:r>
+      <w:r>
+        <w:t xml:space="preserve"> </w:t>
+      </w:r>
+      <w:r>
+        <w:t xml:space="preserve">condition classification or count. Denominators are subjects with at least two</w:t>
+      </w:r>
+      <w:r>
+        <w:t xml:space="preserve"> </w:t>
+      </w:r>
+      <w:r>
+        <w:t xml:space="preserve">encounters and a cumulative flag after the index encounter, and non-index</w:t>
+      </w:r>
+      <w:r>
+        <w:t xml:space="preserve"> </w:t>
+      </w:r>
+      <w:r>
+        <w:t xml:space="preserve">encounters with at least one cumulative flag. Among 92,536 eligible</w:t>
+      </w:r>
+      <w:r>
+        <w:t xml:space="preserve"> </w:t>
+      </w:r>
+      <w:r>
+        <w:t xml:space="preserve">Elixhauser subjects, 68,085 (73.6%) had a different profile on at least</w:t>
+      </w:r>
+      <w:r>
+        <w:t xml:space="preserve"> </w:t>
+      </w:r>
+      <w:r>
+        <w:t xml:space="preserve">one encounter, and 10,553 (11.4%) had no current but at least one</w:t>
+      </w:r>
+      <w:r>
+        <w:t xml:space="preserve"> </w:t>
+      </w:r>
+      <w:r>
+        <w:t xml:space="preserve">cumulative comorbidity.</w:t>
       </w:r>
     </w:p>
     <w:p>
@@ -4663,105 +4450,7 @@
         <w:pStyle w:val="BodyText"/>
       </w:pPr>
       <w:r>
-        <w:t xml:space="preserve">For example, 92,536 subjects with at least two encounters and at</w:t>
-      </w:r>
-      <w:r>
-        <w:t xml:space="preserve"> </w:t>
-      </w:r>
-      <w:r>
-        <w:t xml:space="preserve">least one Elixhauser comorbidity flagged on the non-index encounter</w:t>
-      </w:r>
-      <w:r>
-        <w:t xml:space="preserve"> </w:t>
-      </w:r>
-      <w:r>
-        <w:rPr>
-          <w:rStyle w:val="VerbatimChar"/>
-        </w:rPr>
-        <w:t xml:space="preserve">flag.method = "cumulative"</w:t>
-      </w:r>
-      <w:r>
-        <w:t xml:space="preserve">, 68,085 (73.6%) subjects have at least one encounter with a</w:t>
-      </w:r>
-      <w:r>
-        <w:t xml:space="preserve"> </w:t>
-      </w:r>
-      <w:r>
-        <w:t xml:space="preserve">different risk profile (different classification of comorbidities and/or count</w:t>
-      </w:r>
-      <w:r>
-        <w:t xml:space="preserve"> </w:t>
-      </w:r>
-      <w:r>
-        <w:t xml:space="preserve">of comorbidities) under</w:t>
-      </w:r>
-      <w:r>
-        <w:t xml:space="preserve"> </w:t>
-      </w:r>
-      <w:r>
-        <w:rPr>
-          <w:rStyle w:val="VerbatimChar"/>
-        </w:rPr>
-        <w:t xml:space="preserve">flag.method = "cumulative"</w:t>
-      </w:r>
-      <w:r>
-        <w:t xml:space="preserve"> </w:t>
-      </w:r>
-      <w:r>
-        <w:t xml:space="preserve">compared to</w:t>
-      </w:r>
-      <w:r>
-        <w:t xml:space="preserve"> </w:t>
-      </w:r>
-      <w:r>
-        <w:rPr>
-          <w:rStyle w:val="VerbatimChar"/>
-        </w:rPr>
-        <w:t xml:space="preserve">flag.method = "current"</w:t>
-      </w:r>
-      <w:r>
-        <w:t xml:space="preserve">. 10,553 (11.4%) subjects had at least one encounter with zero</w:t>
-      </w:r>
-      <w:r>
-        <w:t xml:space="preserve"> </w:t>
-      </w:r>
-      <w:r>
-        <w:t xml:space="preserve">comorbidities per</w:t>
-      </w:r>
-      <w:r>
-        <w:t xml:space="preserve"> </w:t>
-      </w:r>
-      <w:r>
-        <w:rPr>
-          <w:rStyle w:val="VerbatimChar"/>
-        </w:rPr>
-        <w:t xml:space="preserve">flag.method = "current"</w:t>
-      </w:r>
-      <w:r>
-        <w:t xml:space="preserve"> </w:t>
-      </w:r>
-      <w:r>
-        <w:t xml:space="preserve">and at least one comorbidity with</w:t>
-      </w:r>
-      <w:r>
-        <w:t xml:space="preserve"> </w:t>
-      </w:r>
-      <w:r>
-        <w:rPr>
-          <w:rStyle w:val="VerbatimChar"/>
-        </w:rPr>
-        <w:t xml:space="preserve">flag.method = 'cumulative'</w:t>
-      </w:r>
-      <w:r>
-        <w:t xml:space="preserve">.</w:t>
-      </w:r>
-    </w:p>
-    <w:p>
-      <w:pPr>
-        <w:pStyle w:val="BodyText"/>
-      </w:pPr>
-      <w:r>
-        <w:t xml:space="preserve">The PCCC v3 and AHRQ Elixhauser algorithms, 2022-2026, are more complex. PCCC</w:t>
+        <w:t xml:space="preserve">PCCC v3 and the 2022-2026 AHRQ Elixhauser algorithms require additional logic. PCCC</w:t>
       </w:r>
       <w:r>
         <w:t xml:space="preserve"> </w:t>
@@ -4785,34 +4474,7 @@
         <w:t xml:space="preserve"> </w:t>
       </w:r>
       <w:r>
-        <w:t xml:space="preserve">present or the ICD code is POA-exempt (Supplement Section 8.4).</w:t>
-      </w:r>
-      <w:r>
-        <w:t xml:space="preserve"> </w:t>
-      </w:r>
-      <w:r>
-        <w:t xml:space="preserve">Using</w:t>
-      </w:r>
-      <w:r>
-        <w:t xml:space="preserve"> </w:t>
-      </w:r>
-      <w:r>
-        <w:rPr>
-          <w:rStyle w:val="VerbatimChar"/>
-        </w:rPr>
-        <w:t xml:space="preserve">flag.method = "cumulative"</w:t>
-      </w:r>
-      <w:r>
-        <w:t xml:space="preserve"> </w:t>
-      </w:r>
-      <w:r>
-        <w:t xml:space="preserve">ensures the algorithm’s longitudinal logic is</w:t>
-      </w:r>
-      <w:r>
-        <w:t xml:space="preserve"> </w:t>
-      </w:r>
-      <w:r>
-        <w:t xml:space="preserve">applied consistently.</w:t>
+        <w:t xml:space="preserve">present, or the ICD code is POA-exempt (Supplement Section 8.4).</w:t>
       </w:r>
     </w:p>
     <w:p>
@@ -8973,13 +8635,13 @@
         <w:pStyle w:val="BodyText"/>
       </w:pPr>
       <w:r>
-        <w:t xml:space="preserve">The comparators all use some form of partial string matching in</w:t>
-      </w:r>
-      <w:r>
-        <w:t xml:space="preserve"> </w:t>
-      </w:r>
-      <w:r>
-        <w:t xml:space="preserve">their implementations for mapping ICD codes to conditions.</w:t>
+        <w:t xml:space="preserve">The comparators all use some form of partial string matching for mapping ICD</w:t>
+      </w:r>
+      <w:r>
+        <w:t xml:space="preserve"> </w:t>
+      </w:r>
+      <w:r>
+        <w:t xml:space="preserve">codes to conditions.</w:t>
       </w:r>
       <w:r>
         <w:t xml:space="preserve"> </w:t>
@@ -8995,31 +8657,31 @@
         <w:t xml:space="preserve"> </w:t>
       </w:r>
       <w:r>
-        <w:t xml:space="preserve">uses a set of precomputed valid ICD codes to map between input</w:t>
-      </w:r>
-      <w:r>
-        <w:t xml:space="preserve"> </w:t>
-      </w:r>
-      <w:r>
-        <w:t xml:space="preserve">data and conditions using database-style joins. As a result, comparator</w:t>
-      </w:r>
-      <w:r>
-        <w:t xml:space="preserve"> </w:t>
-      </w:r>
-      <w:r>
-        <w:t xml:space="preserve">implementations that rely on prefix or regular-expression matching can return</w:t>
-      </w:r>
-      <w:r>
-        <w:t xml:space="preserve"> </w:t>
-      </w:r>
-      <w:r>
-        <w:t xml:space="preserve">false-positive flags when an invalid input string starts with a valid ICD code</w:t>
-      </w:r>
-      <w:r>
-        <w:t xml:space="preserve"> </w:t>
-      </w:r>
-      <w:r>
-        <w:t xml:space="preserve">substring. For example, the ICD-10 code C189 maps to</w:t>
+        <w:t xml:space="preserve">uses a set of precomputed valid ICD codes to</w:t>
+      </w:r>
+      <w:r>
+        <w:t xml:space="preserve"> </w:t>
+      </w:r>
+      <w:r>
+        <w:t xml:space="preserve">map between input data and conditions using database-style joins. As a result,</w:t>
+      </w:r>
+      <w:r>
+        <w:t xml:space="preserve"> </w:t>
+      </w:r>
+      <w:r>
+        <w:t xml:space="preserve">comparator implementations that rely on prefix or regular-expression matching</w:t>
+      </w:r>
+      <w:r>
+        <w:t xml:space="preserve"> </w:t>
+      </w:r>
+      <w:r>
+        <w:t xml:space="preserve">can return false-positive flags when an invalid input string starts with a valid</w:t>
+      </w:r>
+      <w:r>
+        <w:t xml:space="preserve"> </w:t>
+      </w:r>
+      <w:r>
+        <w:t xml:space="preserve">ICD code substring. For example, the ICD-10 code C189 maps to</w:t>
       </w:r>
       <w:r>
         <w:t xml:space="preserve"> </w:t>
@@ -9031,13 +8693,7 @@
         <w:t xml:space="preserve"> </w:t>
       </w:r>
       <w:r>
-        <w:t xml:space="preserve">under</w:t>
-      </w:r>
-      <w:r>
-        <w:t xml:space="preserve"> </w:t>
-      </w:r>
-      <w:r>
-        <w:t xml:space="preserve">Charlson;</w:t>
+        <w:t xml:space="preserve">under Charlson;</w:t>
       </w:r>
       <w:r>
         <w:t xml:space="preserve"> </w:t>
@@ -9053,13 +8709,13 @@
         <w:t xml:space="preserve"> </w:t>
       </w:r>
       <w:r>
-        <w:t xml:space="preserve">maps C189NOTACODE to that condition because the string</w:t>
-      </w:r>
-      <w:r>
-        <w:t xml:space="preserve"> </w:t>
-      </w:r>
-      <w:r>
-        <w:t xml:space="preserve">starts with C18.</w:t>
+        <w:t xml:space="preserve">maps C189NOTACODE to that condition because the</w:t>
+      </w:r>
+      <w:r>
+        <w:t xml:space="preserve"> </w:t>
+      </w:r>
+      <w:r>
+        <w:t xml:space="preserve">string starts with C18.</w:t>
       </w:r>
       <w:r>
         <w:t xml:space="preserve"> </w:t>
@@ -9072,10 +8728,13 @@
         <w:t xml:space="preserve">medicalcoder</w:t>
       </w:r>
       <w:r>
-        <w:t xml:space="preserve"> </w:t>
-      </w:r>
-      <w:r>
-        <w:t xml:space="preserve">does not map the invalid string to a condition.</w:t>
+        <w:t xml:space="preserve">, by default, does not map the invalid</w:t>
+      </w:r>
+      <w:r>
+        <w:t xml:space="preserve"> </w:t>
+      </w:r>
+      <w:r>
+        <w:t xml:space="preserve">string to a condition.</w:t>
       </w:r>
     </w:p>
     <w:p>
@@ -9083,19 +8742,19 @@
         <w:pStyle w:val="BodyText"/>
       </w:pPr>
       <w:r>
-        <w:t xml:space="preserve">The use of precomputed ICD-to-condition maps not only reduce false-positives</w:t>
-      </w:r>
-      <w:r>
-        <w:t xml:space="preserve"> </w:t>
-      </w:r>
-      <w:r>
-        <w:t xml:space="preserve">compared to partial string matching, the computational expense is reduced.</w:t>
-      </w:r>
-      <w:r>
-        <w:t xml:space="preserve"> </w:t>
-      </w:r>
-      <w:r>
-        <w:t xml:space="preserve">Benchmarking in the supplement and Figure 3 also shows that</w:t>
+        <w:t xml:space="preserve">Precomputed ICD-to-condition maps reduce false-positive flags compared with</w:t>
+      </w:r>
+      <w:r>
+        <w:t xml:space="preserve"> </w:t>
+      </w:r>
+      <w:r>
+        <w:t xml:space="preserve">partial string matching and reduce computational expense. Benchmarking in the</w:t>
+      </w:r>
+      <w:r>
+        <w:t xml:space="preserve"> </w:t>
+      </w:r>
+      <w:r>
+        <w:t xml:space="preserve">supplement and Figure 3 shows that</w:t>
       </w:r>
       <w:r>
         <w:t xml:space="preserve"> </w:t>
@@ -9111,7 +8770,13 @@
         <w:t xml:space="preserve"> </w:t>
       </w:r>
       <w:r>
-        <w:t xml:space="preserve">requires less time to compute comorbidity flags in the MIMIC-IV examples.</w:t>
+        <w:t xml:space="preserve">requires less time to compute</w:t>
+      </w:r>
+      <w:r>
+        <w:t xml:space="preserve"> </w:t>
+      </w:r>
+      <w:r>
+        <w:t xml:space="preserve">comorbidity flags in the MIMIC-IV examples.</w:t>
       </w:r>
     </w:p>
     <w:p>
@@ -9129,7 +8794,7 @@
         <w:t xml:space="preserve"> </w:t>
       </w:r>
       <w:r>
-        <w:t xml:space="preserve">also provides ICD utility functions for data preparation and</w:t>
+        <w:t xml:space="preserve">provides ICD utility functions for data preparation and</w:t>
       </w:r>
       <w:r>
         <w:t xml:space="preserve"> </w:t>
@@ -9205,13 +8870,7 @@
         <w:t xml:space="preserve"> </w:t>
       </w:r>
       <w:r>
-        <w:t xml:space="preserve">was developed to implement Pediatric Complex Chronic Conditions</w:t>
-      </w:r>
-      <w:r>
-        <w:t xml:space="preserve"> </w:t>
-      </w:r>
-      <w:r>
-        <w:t xml:space="preserve">(PCCC)</w:t>
+        <w:t xml:space="preserve">originated as a PCCC implementation</w:t>
       </w:r>
       <w:r>
         <w:t xml:space="preserve"> </w:t>
@@ -9220,31 +8879,55 @@
         <w:t xml:space="preserve">[3,4]</w:t>
       </w:r>
       <w:r>
-        <w:t xml:space="preserve">. This work showed that</w:t>
-      </w:r>
-      <w:r>
-        <w:t xml:space="preserve"> </w:t>
-      </w:r>
-      <w:r>
-        <w:t xml:space="preserve">accurate, reproducible PCCC classification required a comprehensive,</w:t>
-      </w:r>
-      <w:r>
-        <w:t xml:space="preserve"> </w:t>
-      </w:r>
-      <w:r>
-        <w:t xml:space="preserve">version-aware ICD database, which became a core component of the package. A</w:t>
-      </w:r>
-      <w:r>
-        <w:t xml:space="preserve"> </w:t>
-      </w:r>
-      <w:r>
-        <w:t xml:space="preserve">general framework supporting multiple PCCC versions also enabled extension to</w:t>
-      </w:r>
-      <w:r>
-        <w:t xml:space="preserve"> </w:t>
-      </w:r>
-      <w:r>
-        <w:t xml:space="preserve">other comorbidity algorithms, including Charlson and Elixhauser.</w:t>
+        <w:t xml:space="preserve">,</w:t>
+      </w:r>
+      <w:r>
+        <w:t xml:space="preserve"> </w:t>
+      </w:r>
+      <w:r>
+        <w:t xml:space="preserve">for which reproducible classification required a version-aware ICD database that</w:t>
+      </w:r>
+      <w:r>
+        <w:t xml:space="preserve"> </w:t>
+      </w:r>
+      <w:r>
+        <w:t xml:space="preserve">subsequently supported Charlson and Elixhauser algorithms. The package imports</w:t>
+      </w:r>
+      <w:r>
+        <w:t xml:space="preserve"> </w:t>
+      </w:r>
+      <w:r>
+        <w:t xml:space="preserve">no namespaces and can be installed wherever R ≥ 3.5.0 is available,</w:t>
+      </w:r>
+      <w:r>
+        <w:t xml:space="preserve"> </w:t>
+      </w:r>
+      <w:r>
+        <w:t xml:space="preserve">including restricted environments. Pinning the package version locks its ICD</w:t>
+      </w:r>
+      <w:r>
+        <w:t xml:space="preserve"> </w:t>
+      </w:r>
+      <w:r>
+        <w:t xml:space="preserve">database and comorbidity mappings, supporting reproducibility. “Dependency-free”</w:t>
+      </w:r>
+      <w:r>
+        <w:t xml:space="preserve"> </w:t>
+      </w:r>
+      <w:r>
+        <w:t xml:space="preserve">applies to installation and runtime; tests, documentation, benchmarks, and</w:t>
+      </w:r>
+      <w:r>
+        <w:t xml:space="preserve"> </w:t>
+      </w:r>
+      <w:r>
+        <w:t xml:space="preserve">manuscript workflows require the external tools and data described here and in</w:t>
+      </w:r>
+      <w:r>
+        <w:t xml:space="preserve"> </w:t>
+      </w:r>
+      <w:r>
+        <w:t xml:space="preserve">the Supplement.</w:t>
       </w:r>
     </w:p>
     <w:p>
@@ -9252,18 +8935,6 @@
         <w:pStyle w:val="BodyText"/>
       </w:pPr>
       <w:r>
-        <w:t xml:space="preserve">Self-contained deployment in restricted computing environments was a primary</w:t>
-      </w:r>
-      <w:r>
-        <w:t xml:space="preserve"> </w:t>
-      </w:r>
-      <w:r>
-        <w:t xml:space="preserve">design requirement. Because</w:t>
-      </w:r>
-      <w:r>
-        <w:t xml:space="preserve"> </w:t>
-      </w:r>
-      <w:r>
         <w:rPr>
           <w:i/>
           <w:iCs/>
@@ -9274,31 +8945,71 @@
         <w:t xml:space="preserve"> </w:t>
       </w:r>
       <w:r>
-        <w:t xml:space="preserve">depends only on base R, it can be</w:t>
-      </w:r>
-      <w:r>
-        <w:t xml:space="preserve"> </w:t>
-      </w:r>
-      <w:r>
-        <w:t xml:space="preserve">installed wherever R ≥ 3.5.0 is available, including systems with limited</w:t>
-      </w:r>
-      <w:r>
-        <w:t xml:space="preserve"> </w:t>
-      </w:r>
-      <w:r>
-        <w:t xml:space="preserve">internet access or tightly controlled software. Eliminating namespace</w:t>
-      </w:r>
-      <w:r>
-        <w:t xml:space="preserve"> </w:t>
-      </w:r>
-      <w:r>
-        <w:t xml:space="preserve">dependencies also avoids version conflicts that can compromise reproducibility</w:t>
-      </w:r>
-      <w:r>
-        <w:t xml:space="preserve"> </w:t>
-      </w:r>
-      <w:r>
-        <w:t xml:space="preserve">in clinical research.</w:t>
+        <w:t xml:space="preserve">addresses a methodological gap in existing comorbidity software:</w:t>
+      </w:r>
+      <w:r>
+        <w:t xml:space="preserve"> </w:t>
+      </w:r>
+      <w:r>
+        <w:t xml:space="preserve">the lack of support for longitudinal comorbidity assessment. Most</w:t>
+      </w:r>
+      <w:r>
+        <w:t xml:space="preserve"> </w:t>
+      </w:r>
+      <w:r>
+        <w:t xml:space="preserve">implementations operate strictly at the encounter level, implicitly assuming</w:t>
+      </w:r>
+      <w:r>
+        <w:t xml:space="preserve"> </w:t>
+      </w:r>
+      <w:r>
+        <w:t xml:space="preserve">that comorbid conditions are either repeatedly coded or clinically irrelevant</w:t>
+      </w:r>
+      <w:r>
+        <w:t xml:space="preserve"> </w:t>
+      </w:r>
+      <w:r>
+        <w:t xml:space="preserve">once absent from the current record. As demonstrated in Table 2, this assumption</w:t>
+      </w:r>
+      <w:r>
+        <w:t xml:space="preserve"> </w:t>
+      </w:r>
+      <w:r>
+        <w:t xml:space="preserve">can lead to systematic under-ascertainment of comorbidities, particularly for</w:t>
+      </w:r>
+      <w:r>
+        <w:t xml:space="preserve"> </w:t>
+      </w:r>
+      <w:r>
+        <w:t xml:space="preserve">chronic conditions, or conditions governed by POA rules or technology-dependent</w:t>
+      </w:r>
+      <w:r>
+        <w:t xml:space="preserve"> </w:t>
+      </w:r>
+      <w:r>
+        <w:t xml:space="preserve">classification criteria. By tracking condition history across encounters,</w:t>
+      </w:r>
+      <w:r>
+        <w:t xml:space="preserve"> </w:t>
+      </w:r>
+      <w:r>
+        <w:rPr>
+          <w:i/>
+          <w:iCs/>
+        </w:rPr>
+        <w:t xml:space="preserve">medicalcoder</w:t>
+      </w:r>
+      <w:r>
+        <w:t xml:space="preserve"> </w:t>
+      </w:r>
+      <w:r>
+        <w:t xml:space="preserve">supports comorbidity classification based on prior observed</w:t>
+      </w:r>
+      <w:r>
+        <w:t xml:space="preserve"> </w:t>
+      </w:r>
+      <w:r>
+        <w:t xml:space="preserve">diagnoses under an explicit carry-forward assumption.</w:t>
       </w:r>
     </w:p>
     <w:p>
@@ -9306,7 +9017,52 @@
         <w:pStyle w:val="BodyText"/>
       </w:pPr>
       <w:r>
-        <w:t xml:space="preserve">Beyond deployment considerations,</w:t>
+        <w:t xml:space="preserve">The utility of cumulative flags depends on whether every ICD code mapped to a</w:t>
+      </w:r>
+      <w:r>
+        <w:t xml:space="preserve"> </w:t>
+      </w:r>
+      <w:r>
+        <w:t xml:space="preserve">condition represents persistent disease. For example, carry-forward</w:t>
+      </w:r>
+      <w:r>
+        <w:t xml:space="preserve"> </w:t>
+      </w:r>
+      <w:r>
+        <w:t xml:space="preserve">of uncomplicated diabetes is defensible for the Quan et al. Charlson and</w:t>
+      </w:r>
+      <w:r>
+        <w:t xml:space="preserve"> </w:t>
+      </w:r>
+      <w:r>
+        <w:t xml:space="preserve">Elixhauser mappings</w:t>
+      </w:r>
+      <w:r>
+        <w:t xml:space="preserve"> </w:t>
+      </w:r>
+      <w:r>
+        <w:t xml:space="preserve">[1]</w:t>
+      </w:r>
+      <w:r>
+        <w:t xml:space="preserve">, which identify non-gestational diabetes. In the</w:t>
+      </w:r>
+      <w:r>
+        <w:t xml:space="preserve"> </w:t>
+      </w:r>
+      <w:r>
+        <w:t xml:space="preserve">AHRQ fiscal year 2022 and beyond mappings, however, uncomplicated diabetes also</w:t>
+      </w:r>
+      <w:r>
+        <w:t xml:space="preserve"> </w:t>
+      </w:r>
+      <w:r>
+        <w:t xml:space="preserve">includes ICD-10 codes under the O24 category for gestational diabetes, a</w:t>
+      </w:r>
+      <w:r>
+        <w:t xml:space="preserve"> </w:t>
+      </w:r>
+      <w:r>
+        <w:t xml:space="preserve">pregnancy-related and potentially transient condition. Because</w:t>
       </w:r>
       <w:r>
         <w:t xml:space="preserve"> </w:t>
@@ -9322,77 +9078,25 @@
         <w:t xml:space="preserve"> </w:t>
       </w:r>
       <w:r>
-        <w:t xml:space="preserve">addresses a methodological gap</w:t>
-      </w:r>
-      <w:r>
-        <w:t xml:space="preserve"> </w:t>
-      </w:r>
-      <w:r>
-        <w:t xml:space="preserve">in existing comorbidity software: the lack of support for longitudinal</w:t>
-      </w:r>
-      <w:r>
-        <w:t xml:space="preserve"> </w:t>
-      </w:r>
-      <w:r>
-        <w:t xml:space="preserve">comorbidity assessment. Most implementations operate strictly at the encounter</w:t>
-      </w:r>
-      <w:r>
-        <w:t xml:space="preserve"> </w:t>
-      </w:r>
-      <w:r>
-        <w:t xml:space="preserve">level, implicitly assuming that comorbid conditions are either repeatedly coded</w:t>
-      </w:r>
-      <w:r>
-        <w:t xml:space="preserve"> </w:t>
-      </w:r>
-      <w:r>
-        <w:t xml:space="preserve">or clinically irrelevant once absent from the current record. As demonstrated in</w:t>
-      </w:r>
-      <w:r>
-        <w:t xml:space="preserve"> </w:t>
-      </w:r>
-      <w:r>
-        <w:t xml:space="preserve">Table 2, this assumption can lead to systematic under-ascertainment of</w:t>
-      </w:r>
-      <w:r>
-        <w:t xml:space="preserve"> </w:t>
-      </w:r>
-      <w:r>
-        <w:t xml:space="preserve">comorbidities, particularly for chronic conditions, or conditions governed by</w:t>
-      </w:r>
-      <w:r>
-        <w:t xml:space="preserve"> </w:t>
-      </w:r>
-      <w:r>
-        <w:t xml:space="preserve">POA rules or technology-dependent classification criteria. By tracking condition</w:t>
-      </w:r>
-      <w:r>
-        <w:t xml:space="preserve"> </w:t>
-      </w:r>
-      <w:r>
-        <w:t xml:space="preserve">history across encounters,</w:t>
-      </w:r>
-      <w:r>
-        <w:t xml:space="preserve"> </w:t>
-      </w:r>
-      <w:r>
-        <w:rPr>
-          <w:i/>
-          <w:iCs/>
-        </w:rPr>
-        <w:t xml:space="preserve">medicalcoder</w:t>
-      </w:r>
-      <w:r>
-        <w:t xml:space="preserve"> </w:t>
-      </w:r>
-      <w:r>
-        <w:t xml:space="preserve">supports comorbidity classification</w:t>
-      </w:r>
-      <w:r>
-        <w:t xml:space="preserve"> </w:t>
-      </w:r>
-      <w:r>
-        <w:t xml:space="preserve">based on prior observed diagnoses under an explicit carry-forward assumption.</w:t>
+        <w:t xml:space="preserve">carries forward the comorbidity flag rather than the originating ICD code,</w:t>
+      </w:r>
+      <w:r>
+        <w:t xml:space="preserve"> </w:t>
+      </w:r>
+      <w:r>
+        <w:t xml:space="preserve">subsequent output cannot distinguish gestational from non-gestational diabetes.</w:t>
+      </w:r>
+      <w:r>
+        <w:t xml:space="preserve"> </w:t>
+      </w:r>
+      <w:r>
+        <w:t xml:space="preserve">Thus, cumulative uncomplicated-diabetes flags may be reasonable with Quan-style</w:t>
+      </w:r>
+      <w:r>
+        <w:t xml:space="preserve"> </w:t>
+      </w:r>
+      <w:r>
+        <w:t xml:space="preserve">mappings but require additional qualification with AHRQ-style mappings.</w:t>
       </w:r>
     </w:p>
     <w:p>
@@ -9400,86 +9104,91 @@
         <w:pStyle w:val="BodyText"/>
       </w:pPr>
       <w:r>
-        <w:t xml:space="preserve">The utility of cumulative flags depends on whether every ICD code mapped to a</w:t>
-      </w:r>
-      <w:r>
-        <w:t xml:space="preserve"> </w:t>
-      </w:r>
-      <w:r>
-        <w:t xml:space="preserve">condition represents persistent disease. For example, indefinite carry-forward</w:t>
-      </w:r>
-      <w:r>
-        <w:t xml:space="preserve"> </w:t>
-      </w:r>
-      <w:r>
-        <w:t xml:space="preserve">of uncomplicated diabetes is defensible for the Quan et al. Charlson and</w:t>
-      </w:r>
-      <w:r>
-        <w:t xml:space="preserve"> </w:t>
-      </w:r>
-      <w:r>
-        <w:t xml:space="preserve">Elixhauser mappings</w:t>
-      </w:r>
-      <w:r>
-        <w:t xml:space="preserve"> </w:t>
-      </w:r>
-      <w:r>
-        <w:t xml:space="preserve">[1]</w:t>
-      </w:r>
-      <w:r>
-        <w:t xml:space="preserve">, which identify non-gestational diabetes. In the</w:t>
-      </w:r>
-      <w:r>
-        <w:t xml:space="preserve"> </w:t>
-      </w:r>
-      <w:r>
-        <w:t xml:space="preserve">AHRQ fiscal year 2022 and beyond mappings, however, uncomplicated diabetes also</w:t>
-      </w:r>
-      <w:r>
-        <w:t xml:space="preserve"> </w:t>
-      </w:r>
-      <w:r>
-        <w:t xml:space="preserve">includes ICD-10 codes under the O24 category for gestational diabetes, a</w:t>
-      </w:r>
-      <w:r>
-        <w:t xml:space="preserve"> </w:t>
-      </w:r>
-      <w:r>
-        <w:t xml:space="preserve">pregnancy-related and potentially transient condition. Because</w:t>
-      </w:r>
-      <w:r>
-        <w:t xml:space="preserve"> </w:t>
-      </w:r>
-      <w:r>
-        <w:rPr>
-          <w:i/>
-          <w:iCs/>
-        </w:rPr>
-        <w:t xml:space="preserve">medicalcoder</w:t>
-      </w:r>
-      <w:r>
-        <w:t xml:space="preserve"> </w:t>
-      </w:r>
-      <w:r>
-        <w:t xml:space="preserve">carries forward the comorbidity flag rather than the originating ICD code,</w:t>
-      </w:r>
-      <w:r>
-        <w:t xml:space="preserve"> </w:t>
-      </w:r>
-      <w:r>
-        <w:t xml:space="preserve">subsequent output cannot distinguish gestational from non-gestational diabetes.</w:t>
-      </w:r>
-      <w:r>
-        <w:t xml:space="preserve"> </w:t>
-      </w:r>
-      <w:r>
-        <w:t xml:space="preserve">Thus, cumulative uncomplicated-diabetes flags may be reasonable with Quan-style</w:t>
-      </w:r>
-      <w:r>
-        <w:t xml:space="preserve"> </w:t>
-      </w:r>
-      <w:r>
-        <w:t xml:space="preserve">mappings, but require additional qualification with AHRQ-style mappings.</w:t>
+        <w:t xml:space="preserve">Malignancy illustrates a related limitation. Suppose C18.2</w:t>
+      </w:r>
+      <w:r>
+        <w:t xml:space="preserve"> </w:t>
+      </w:r>
+      <w:r>
+        <w:t xml:space="preserve">“malignant neoplasm</w:t>
+      </w:r>
+      <w:r>
+        <w:t xml:space="preserve"> </w:t>
+      </w:r>
+      <w:r>
+        <w:t xml:space="preserve">of the colon”</w:t>
+      </w:r>
+      <w:r>
+        <w:t xml:space="preserve"> </w:t>
+      </w:r>
+      <w:r>
+        <w:t xml:space="preserve">is reported. Upon resolution of the neoplasm, the C18.2 code</w:t>
+      </w:r>
+      <w:r>
+        <w:t xml:space="preserve"> </w:t>
+      </w:r>
+      <w:r>
+        <w:t xml:space="preserve">should no longer be reported and the ICD-10 code Z85.038,</w:t>
+      </w:r>
+      <w:r>
+        <w:t xml:space="preserve"> </w:t>
+      </w:r>
+      <w:r>
+        <w:t xml:space="preserve">“personal history of</w:t>
+      </w:r>
+      <w:r>
+        <w:t xml:space="preserve"> </w:t>
+      </w:r>
+      <w:r>
+        <w:t xml:space="preserve">malignant neoplasm of the large intestine”</w:t>
+      </w:r>
+      <w:r>
+        <w:t xml:space="preserve"> </w:t>
+      </w:r>
+      <w:r>
+        <w:t xml:space="preserve">should be reported. The cumulative</w:t>
+      </w:r>
+      <w:r>
+        <w:t xml:space="preserve"> </w:t>
+      </w:r>
+      <w:r>
+        <w:t xml:space="preserve">flag remains positive on and after the encounter with the initial C18.2 report</w:t>
+      </w:r>
+      <w:r>
+        <w:t xml:space="preserve"> </w:t>
+      </w:r>
+      <w:r>
+        <w:t xml:space="preserve">and therefore represents current or previously observed malignancy rather than</w:t>
+      </w:r>
+      <w:r>
+        <w:t xml:space="preserve"> </w:t>
+      </w:r>
+      <w:r>
+        <w:t xml:space="preserve">current malignancy alone. However, because Z85.038 is not included in any of the</w:t>
+      </w:r>
+      <w:r>
+        <w:t xml:space="preserve"> </w:t>
+      </w:r>
+      <w:r>
+        <w:t xml:space="preserve">comorbidity mappings, a history-only encounter preceding any mapped</w:t>
+      </w:r>
+      <w:r>
+        <w:t xml:space="preserve"> </w:t>
+      </w:r>
+      <w:r>
+        <w:t xml:space="preserve">active-malignancy code remains unflagged. Cumulative malignancy flags should</w:t>
+      </w:r>
+      <w:r>
+        <w:t xml:space="preserve"> </w:t>
+      </w:r>
+      <w:r>
+        <w:t xml:space="preserve">therefore be interpreted as indicating current or previously observed</w:t>
+      </w:r>
+      <w:r>
+        <w:t xml:space="preserve"> </w:t>
+      </w:r>
+      <w:r>
+        <w:t xml:space="preserve">malignancy, not a comprehensive current-or-history phenotype.</w:t>
       </w:r>
     </w:p>
     <w:p>
@@ -9487,91 +9196,25 @@
         <w:pStyle w:val="BodyText"/>
       </w:pPr>
       <w:r>
-        <w:t xml:space="preserve">Malignancy illustrates a related limitation. Suppose C18.2</w:t>
-      </w:r>
-      <w:r>
-        <w:t xml:space="preserve"> </w:t>
-      </w:r>
-      <w:r>
-        <w:t xml:space="preserve">“malignant neoplasm</w:t>
-      </w:r>
-      <w:r>
-        <w:t xml:space="preserve"> </w:t>
-      </w:r>
-      <w:r>
-        <w:t xml:space="preserve">of the colon”</w:t>
-      </w:r>
-      <w:r>
-        <w:t xml:space="preserve"> </w:t>
-      </w:r>
-      <w:r>
-        <w:t xml:space="preserve">is reported. Upon resolution of the neoplasm, the C18.2 code</w:t>
-      </w:r>
-      <w:r>
-        <w:t xml:space="preserve"> </w:t>
-      </w:r>
-      <w:r>
-        <w:t xml:space="preserve">should no longer be reported and the ICD-10 code Z85.038,</w:t>
-      </w:r>
-      <w:r>
-        <w:t xml:space="preserve"> </w:t>
-      </w:r>
-      <w:r>
-        <w:t xml:space="preserve">“personal history of</w:t>
-      </w:r>
-      <w:r>
-        <w:t xml:space="preserve"> </w:t>
-      </w:r>
-      <w:r>
-        <w:t xml:space="preserve">malignant neoplasm of the large intestine”</w:t>
-      </w:r>
-      <w:r>
-        <w:t xml:space="preserve"> </w:t>
-      </w:r>
-      <w:r>
-        <w:t xml:space="preserve">should be reported. The cumulative</w:t>
-      </w:r>
-      <w:r>
-        <w:t xml:space="preserve"> </w:t>
-      </w:r>
-      <w:r>
-        <w:t xml:space="preserve">flag remains positive on and after the encounter with the initial C18.2 report</w:t>
-      </w:r>
-      <w:r>
-        <w:t xml:space="preserve"> </w:t>
-      </w:r>
-      <w:r>
-        <w:t xml:space="preserve">and therefore represents current or previously observed malignancy rather than</w:t>
-      </w:r>
-      <w:r>
-        <w:t xml:space="preserve"> </w:t>
-      </w:r>
-      <w:r>
-        <w:t xml:space="preserve">current malignancy alone. However, because Z85.038 is not included in any of the</w:t>
-      </w:r>
-      <w:r>
-        <w:t xml:space="preserve"> </w:t>
-      </w:r>
-      <w:r>
-        <w:t xml:space="preserve">comorbidity mappings, a history-only encounter preceding any mapped</w:t>
-      </w:r>
-      <w:r>
-        <w:t xml:space="preserve"> </w:t>
-      </w:r>
-      <w:r>
-        <w:t xml:space="preserve">active-malignancy code remains unflagged. Cumulative malignancy flags should</w:t>
-      </w:r>
-      <w:r>
-        <w:t xml:space="preserve"> </w:t>
-      </w:r>
-      <w:r>
-        <w:t xml:space="preserve">therefore be interpreted as indicating current or previously observed</w:t>
-      </w:r>
-      <w:r>
-        <w:t xml:space="preserve"> </w:t>
-      </w:r>
-      <w:r>
-        <w:t xml:space="preserve">malignancy, not a comprehensive current-or-history phenotype.</w:t>
+        <w:t xml:space="preserve">The magnitude and interpretation of cumulative flagging may differ in pediatric,</w:t>
+      </w:r>
+      <w:r>
+        <w:t xml:space="preserve"> </w:t>
+      </w:r>
+      <w:r>
+        <w:t xml:space="preserve">outpatient, claims, non-ICU, and non-U.S. datasets compared to the results shown</w:t>
+      </w:r>
+      <w:r>
+        <w:t xml:space="preserve"> </w:t>
+      </w:r>
+      <w:r>
+        <w:t xml:space="preserve">using the MIMIC-IV v3.1 dataset because coding density, encounter spacing, POA</w:t>
+      </w:r>
+      <w:r>
+        <w:t xml:space="preserve"> </w:t>
+      </w:r>
+      <w:r>
+        <w:t xml:space="preserve">availability, and condition persistence vary across settings.</w:t>
       </w:r>
     </w:p>
     <w:p>
@@ -9579,25 +9222,53 @@
         <w:pStyle w:val="BodyText"/>
       </w:pPr>
       <w:r>
-        <w:t xml:space="preserve">The magnitude and interpretation of cumulative flagging may differ in pediatric,</w:t>
-      </w:r>
-      <w:r>
-        <w:t xml:space="preserve"> </w:t>
-      </w:r>
-      <w:r>
-        <w:t xml:space="preserve">outpatient, claims, non-ICU, and non-U.S. datasets compared to the results shown</w:t>
-      </w:r>
-      <w:r>
-        <w:t xml:space="preserve"> </w:t>
-      </w:r>
-      <w:r>
-        <w:t xml:space="preserve">using the MIMIC-IV v3.1 dataset due to coding density, encounter spacing, POA</w:t>
-      </w:r>
-      <w:r>
-        <w:t xml:space="preserve"> </w:t>
-      </w:r>
-      <w:r>
-        <w:t xml:space="preserve">availability, and condition persistence differ across settings.</w:t>
+        <w:t xml:space="preserve">The unified interface provided by</w:t>
+      </w:r>
+      <w:r>
+        <w:t xml:space="preserve"> </w:t>
+      </w:r>
+      <w:r>
+        <w:rPr>
+          <w:i/>
+          <w:iCs/>
+        </w:rPr>
+        <w:t xml:space="preserve">medicalcoder</w:t>
+      </w:r>
+      <w:r>
+        <w:t xml:space="preserve"> </w:t>
+      </w:r>
+      <w:r>
+        <w:t xml:space="preserve">further reduces analytic</w:t>
+      </w:r>
+      <w:r>
+        <w:t xml:space="preserve"> </w:t>
+      </w:r>
+      <w:r>
+        <w:t xml:space="preserve">complexity. Mixed ICD-9 and ICD-10 datasets, full and compact codes, diagnostic</w:t>
+      </w:r>
+      <w:r>
+        <w:t xml:space="preserve"> </w:t>
+      </w:r>
+      <w:r>
+        <w:t xml:space="preserve">and procedure codes, and algorithm-specific nuances are handled within a single</w:t>
+      </w:r>
+      <w:r>
+        <w:t xml:space="preserve"> </w:t>
+      </w:r>
+      <w:r>
+        <w:t xml:space="preserve">function call. This contrasts with existing workflows that require dataset</w:t>
+      </w:r>
+      <w:r>
+        <w:t xml:space="preserve"> </w:t>
+      </w:r>
+      <w:r>
+        <w:t xml:space="preserve">partitioning, multiple method calls, and post hoc reconciliation, each of which</w:t>
+      </w:r>
+      <w:r>
+        <w:t xml:space="preserve"> </w:t>
+      </w:r>
+      <w:r>
+        <w:t xml:space="preserve">can introduce error and irreproducibility.</w:t>
       </w:r>
     </w:p>
     <w:p>
@@ -9605,53 +9276,31 @@
         <w:pStyle w:val="BodyText"/>
       </w:pPr>
       <w:r>
-        <w:t xml:space="preserve">The unified interface provided by</w:t>
-      </w:r>
-      <w:r>
-        <w:t xml:space="preserve"> </w:t>
-      </w:r>
-      <w:r>
-        <w:rPr>
-          <w:i/>
-          <w:iCs/>
-        </w:rPr>
-        <w:t xml:space="preserve">medicalcoder</w:t>
-      </w:r>
-      <w:r>
-        <w:t xml:space="preserve"> </w:t>
-      </w:r>
-      <w:r>
-        <w:t xml:space="preserve">further reduces analytic</w:t>
-      </w:r>
-      <w:r>
-        <w:t xml:space="preserve"> </w:t>
-      </w:r>
-      <w:r>
-        <w:t xml:space="preserve">complexity. Mixed ICD-9 and ICD-10 datasets, full and compact codes, diagnostic</w:t>
-      </w:r>
-      <w:r>
-        <w:t xml:space="preserve"> </w:t>
-      </w:r>
-      <w:r>
-        <w:t xml:space="preserve">and procedure codes, and algorithm-specific nuances are handled within a single</w:t>
-      </w:r>
-      <w:r>
-        <w:t xml:space="preserve"> </w:t>
-      </w:r>
-      <w:r>
-        <w:t xml:space="preserve">function call. This contrasts with existing workflows that require dataset</w:t>
-      </w:r>
-      <w:r>
-        <w:t xml:space="preserve"> </w:t>
-      </w:r>
-      <w:r>
-        <w:t xml:space="preserve">partitioning, multiple method calls, and post hoc reconciliation, each of which</w:t>
-      </w:r>
-      <w:r>
-        <w:t xml:space="preserve"> </w:t>
-      </w:r>
-      <w:r>
-        <w:t xml:space="preserve">introduces opportunities for error and irreproducibility.</w:t>
+        <w:t xml:space="preserve">The included ICD utility functions also support exploratory and preprocessing</w:t>
+      </w:r>
+      <w:r>
+        <w:t xml:space="preserve"> </w:t>
+      </w:r>
+      <w:r>
+        <w:t xml:space="preserve">tasks using the same reference data employed by the comorbidity algorithms. This</w:t>
+      </w:r>
+      <w:r>
+        <w:t xml:space="preserve"> </w:t>
+      </w:r>
+      <w:r>
+        <w:t xml:space="preserve">reduces reliance on ad hoc code lists and external reference tables when</w:t>
+      </w:r>
+      <w:r>
+        <w:t xml:space="preserve"> </w:t>
+      </w:r>
+      <w:r>
+        <w:t xml:space="preserve">defining cohorts or filtering diagnosis and procedure codes in large clinical</w:t>
+      </w:r>
+      <w:r>
+        <w:t xml:space="preserve"> </w:t>
+      </w:r>
+      <w:r>
+        <w:t xml:space="preserve">datasets.</w:t>
       </w:r>
     </w:p>
     <w:p>
@@ -9659,31 +9308,35 @@
         <w:pStyle w:val="BodyText"/>
       </w:pPr>
       <w:r>
-        <w:t xml:space="preserve">The included ICD utility functions also support exploratory and preprocessing</w:t>
-      </w:r>
-      <w:r>
-        <w:t xml:space="preserve"> </w:t>
-      </w:r>
-      <w:r>
-        <w:t xml:space="preserve">tasks using the same reference data employed by the comorbidity algorithms. This</w:t>
-      </w:r>
-      <w:r>
-        <w:t xml:space="preserve"> </w:t>
-      </w:r>
-      <w:r>
-        <w:t xml:space="preserve">reduces reliance on ad hoc code lists and external reference tables when</w:t>
-      </w:r>
-      <w:r>
-        <w:t xml:space="preserve"> </w:t>
-      </w:r>
-      <w:r>
-        <w:t xml:space="preserve">defining cohorts or filtering diagnosis and procedure codes in large clinical</w:t>
-      </w:r>
-      <w:r>
-        <w:t xml:space="preserve"> </w:t>
-      </w:r>
-      <w:r>
-        <w:t xml:space="preserve">datasets.</w:t>
+        <w:t xml:space="preserve">Testing against published SAS, SQL, and R reference implementations</w:t>
+      </w:r>
+      <w:r>
+        <w:t xml:space="preserve"> </w:t>
+      </w:r>
+      <w:r>
+        <w:t xml:space="preserve">demonstrates that</w:t>
+      </w:r>
+      <w:r>
+        <w:t xml:space="preserve"> </w:t>
+      </w:r>
+      <w:r>
+        <w:rPr>
+          <w:i/>
+          <w:iCs/>
+        </w:rPr>
+        <w:t xml:space="preserve">medicalcoder</w:t>
+      </w:r>
+      <w:r>
+        <w:t xml:space="preserve"> </w:t>
+      </w:r>
+      <w:r>
+        <w:t xml:space="preserve">produces results consistent with established</w:t>
+      </w:r>
+      <w:r>
+        <w:t xml:space="preserve"> </w:t>
+      </w:r>
+      <w:r>
+        <w:t xml:space="preserve">encounter-level algorithms while offering additional flexibility.</w:t>
       </w:r>
     </w:p>
     <w:p>
@@ -9691,13 +9344,19 @@
         <w:pStyle w:val="BodyText"/>
       </w:pPr>
       <w:r>
-        <w:t xml:space="preserve">Extensive testing against published SAS, SQL, and R reference implementations</w:t>
-      </w:r>
-      <w:r>
-        <w:t xml:space="preserve"> </w:t>
-      </w:r>
-      <w:r>
-        <w:t xml:space="preserve">demonstrates that</w:t>
+        <w:t xml:space="preserve">To our knowledge, no available R package jointly supports multiple</w:t>
+      </w:r>
+      <w:r>
+        <w:t xml:space="preserve"> </w:t>
+      </w:r>
+      <w:r>
+        <w:t xml:space="preserve">comorbidity algorithms, mixed ICD versions, present-on-admission logic, and</w:t>
+      </w:r>
+      <w:r>
+        <w:t xml:space="preserve"> </w:t>
+      </w:r>
+      <w:r>
+        <w:t xml:space="preserve">cumulative longitudinal flagging within a single, reproducible framework.</w:t>
       </w:r>
       <w:r>
         <w:t xml:space="preserve"> </w:t>
@@ -9713,67 +9372,13 @@
         <w:t xml:space="preserve"> </w:t>
       </w:r>
       <w:r>
-        <w:t xml:space="preserve">produces results consistent with established</w:t>
-      </w:r>
-      <w:r>
-        <w:t xml:space="preserve"> </w:t>
-      </w:r>
-      <w:r>
-        <w:t xml:space="preserve">encounter-level algorithms while offering additional flexibility. Automated</w:t>
-      </w:r>
-      <w:r>
-        <w:t xml:space="preserve"> </w:t>
-      </w:r>
-      <w:r>
-        <w:t xml:space="preserve">testing of internal and user-facing functions supports consistent package</w:t>
-      </w:r>
-      <w:r>
-        <w:t xml:space="preserve"> </w:t>
-      </w:r>
-      <w:r>
-        <w:t xml:space="preserve">behavior across R versions.</w:t>
-      </w:r>
-    </w:p>
-    <w:p>
-      <w:pPr>
-        <w:pStyle w:val="BodyText"/>
-      </w:pPr>
-      <w:r>
-        <w:t xml:space="preserve">To our knowledge, no currently available R package jointly supports multiple</w:t>
-      </w:r>
-      <w:r>
-        <w:t xml:space="preserve"> </w:t>
-      </w:r>
-      <w:r>
-        <w:t xml:space="preserve">comorbidity algorithms, mixed ICD versions, present-on-admission logic, and</w:t>
-      </w:r>
-      <w:r>
-        <w:t xml:space="preserve"> </w:t>
-      </w:r>
-      <w:r>
-        <w:t xml:space="preserve">cumulative longitudinal flagging within a single, reproducible framework.</w:t>
-      </w:r>
-      <w:r>
-        <w:t xml:space="preserve"> </w:t>
-      </w:r>
-      <w:r>
-        <w:rPr>
-          <w:i/>
-          <w:iCs/>
-        </w:rPr>
-        <w:t xml:space="preserve">medicalcoder</w:t>
-      </w:r>
-      <w:r>
-        <w:t xml:space="preserve"> </w:t>
-      </w:r>
-      <w:r>
         <w:t xml:space="preserve">has these capabilities and enables researchers to consistently</w:t>
       </w:r>
       <w:r>
         <w:t xml:space="preserve"> </w:t>
       </w:r>
       <w:r>
-        <w:t xml:space="preserve">characterize patient complexity and to systematically evaluate how different</w:t>
+        <w:t xml:space="preserve">characterize patient complexity and evaluate how different</w:t>
       </w:r>
       <w:r>
         <w:t xml:space="preserve"> </w:t>
@@ -9806,31 +9411,25 @@
         <w:t xml:space="preserve"> </w:t>
       </w:r>
       <w:r>
-        <w:t xml:space="preserve">is a fully self-contained R package with a detailed and robust</w:t>
-      </w:r>
-      <w:r>
-        <w:t xml:space="preserve"> </w:t>
-      </w:r>
-      <w:r>
-        <w:t xml:space="preserve">internal ICD database that can efficiently apply many comorbidity algorithms to</w:t>
-      </w:r>
-      <w:r>
-        <w:t xml:space="preserve"> </w:t>
-      </w:r>
-      <w:r>
-        <w:t xml:space="preserve">a dataset while accounting for ICD-version, ICD-type, POA, primary diagnosis,</w:t>
-      </w:r>
-      <w:r>
-        <w:t xml:space="preserve"> </w:t>
-      </w:r>
-      <w:r>
-        <w:t xml:space="preserve">and full and compact ICD codes. Flagging codes can be done for individual</w:t>
-      </w:r>
-      <w:r>
-        <w:t xml:space="preserve"> </w:t>
-      </w:r>
-      <w:r>
-        <w:t xml:space="preserve">patient encounters, or longitudinally within a patient record.</w:t>
+        <w:t xml:space="preserve">is a self-contained R package with an internal ICD database that</w:t>
+      </w:r>
+      <w:r>
+        <w:t xml:space="preserve"> </w:t>
+      </w:r>
+      <w:r>
+        <w:t xml:space="preserve">can apply many comorbidity algorithms while accounting for ICD-version,</w:t>
+      </w:r>
+      <w:r>
+        <w:t xml:space="preserve"> </w:t>
+      </w:r>
+      <w:r>
+        <w:t xml:space="preserve">ICD-type, POA, primary diagnosis, and full and compact ICD codes. Codes can be</w:t>
+      </w:r>
+      <w:r>
+        <w:t xml:space="preserve"> </w:t>
+      </w:r>
+      <w:r>
+        <w:t xml:space="preserve">flagged for individual encounters or longitudinally within a patient record.</w:t>
       </w:r>
     </w:p>
     <w:p>
@@ -9915,29 +9514,13 @@
         <w:pStyle w:val="BodyText"/>
       </w:pPr>
       <w:r>
-        <w:t xml:space="preserve">For reproducibility, analyses should report and, when possible, pin the</w:t>
-      </w:r>
-      <w:r>
-        <w:t xml:space="preserve"> </w:t>
-      </w:r>
-      <w:r>
-        <w:rPr>
-          <w:i/>
-          <w:iCs/>
-        </w:rPr>
-        <w:t xml:space="preserve">medicalcoder</w:t>
-      </w:r>
-      <w:r>
-        <w:t xml:space="preserve"> </w:t>
-      </w:r>
-      <w:r>
-        <w:t xml:space="preserve">package version because the internal ICD database and</w:t>
-      </w:r>
-      <w:r>
-        <w:t xml:space="preserve"> </w:t>
-      </w:r>
-      <w:r>
-        <w:t xml:space="preserve">comorbidity mappings are versioned with the package.</w:t>
+        <w:t xml:space="preserve">The MIMIC-IV v3.1 data is available from PhysioNet at</w:t>
+      </w:r>
+      <w:r>
+        <w:t xml:space="preserve"> </w:t>
+      </w:r>
+      <w:r>
+        <w:t xml:space="preserve">https://physionet.org/content/mimiciv/3.1/.</w:t>
       </w:r>
     </w:p>
     <w:p>
@@ -9945,69 +9528,13 @@
         <w:pStyle w:val="BodyText"/>
       </w:pPr>
       <w:r>
-        <w:t xml:space="preserve">The dependency-free claim refers to installation and routine use of the core</w:t>
-      </w:r>
-      <w:r>
-        <w:t xml:space="preserve"> </w:t>
-      </w:r>
-      <w:r>
-        <w:rPr>
-          <w:i/>
-          <w:iCs/>
-        </w:rPr>
-        <w:t xml:space="preserve">medicalcoder</w:t>
-      </w:r>
-      <w:r>
-        <w:t xml:space="preserve"> </w:t>
-      </w:r>
-      <w:r>
-        <w:t xml:space="preserve">package; Package tests, documentation, benchmarking, and</w:t>
-      </w:r>
-      <w:r>
-        <w:t xml:space="preserve"> </w:t>
-      </w:r>
-      <w:r>
-        <w:t xml:space="preserve">manuscript-generation workflows use suggested R packages, MIMIC-IV data,</w:t>
-      </w:r>
-      <w:r>
-        <w:t xml:space="preserve"> </w:t>
-      </w:r>
-      <w:r>
-        <w:t xml:space="preserve">Quarto/Pandoc, and external comparator implementations as described herein and</w:t>
-      </w:r>
-      <w:r>
-        <w:t xml:space="preserve"> </w:t>
-      </w:r>
-      <w:r>
-        <w:t xml:space="preserve">in the supplement.</w:t>
-      </w:r>
-    </w:p>
-    <w:p>
-      <w:pPr>
-        <w:pStyle w:val="BodyText"/>
-      </w:pPr>
-      <w:r>
-        <w:t xml:space="preserve">The MIMIC-IV v3.1 data is available from PhysioNet at</w:t>
-      </w:r>
-      <w:r>
-        <w:t xml:space="preserve"> </w:t>
-      </w:r>
-      <w:r>
-        <w:t xml:space="preserve">https://physionet.org/content/mimiciv/3.1/.</w:t>
-      </w:r>
-    </w:p>
-    <w:p>
-      <w:pPr>
-        <w:pStyle w:val="BodyText"/>
-      </w:pPr>
-      <w:r>
         <w:t xml:space="preserve">This manuscript was written using Quarto version</w:t>
       </w:r>
       <w:r>
         <w:t xml:space="preserve"> </w:t>
       </w:r>
       <w:r>
-        <w:t xml:space="preserve">1.9.37</w:t>
+        <w:t xml:space="preserve">1.9.38</w:t>
       </w:r>
       <w:r>
         <w:t xml:space="preserve"> </w:t>
@@ -11871,58 +11398,73 @@
         <w:t xml:space="preserve"> </w:t>
       </w:r>
       <w:r>
-        <w:t xml:space="preserve">classification or count between cumulative and current flagging. The remaining</w:t>
-      </w:r>
-      <w:r>
-        <w:t xml:space="preserve"> </w:t>
-      </w:r>
-      <w:r>
-        <w:t xml:space="preserve">bars described selected components of that aggregate including encounters with</w:t>
-      </w:r>
-      <w:r>
-        <w:t xml:space="preserve"> </w:t>
-      </w:r>
-      <w:r>
-        <w:t xml:space="preserve">no encounter-level comorbidity but at least one cumulative comorbidity,</w:t>
-      </w:r>
-      <w:r>
-        <w:t xml:space="preserve"> </w:t>
-      </w:r>
-      <w:r>
-        <w:t xml:space="preserve">classification/severity differences with the same comorbidity count, and</w:t>
-      </w:r>
-      <w:r>
-        <w:t xml:space="preserve"> </w:t>
-      </w:r>
-      <w:r>
-        <w:t xml:space="preserve">differences involving additional comorbidities. Panel (A) uses subjects with at</w:t>
-      </w:r>
-      <w:r>
-        <w:t xml:space="preserve"> </w:t>
-      </w:r>
-      <w:r>
-        <w:t xml:space="preserve">least two encounters and at least one comorbidity flagged on encounter 2 as the</w:t>
-      </w:r>
-      <w:r>
-        <w:t xml:space="preserve"> </w:t>
-      </w:r>
-      <w:r>
-        <w:t xml:space="preserve">denominator. Panel (B) uses non-initial encounters with at least one comorbidity</w:t>
-      </w:r>
-      <w:r>
-        <w:t xml:space="preserve"> </w:t>
-      </w:r>
-      <w:r>
-        <w:t xml:space="preserve">flagged under</w:t>
-      </w:r>
-      <w:r>
-        <w:t xml:space="preserve"> </w:t>
-      </w:r>
-      <w:r>
-        <w:rPr>
-          <w:rStyle w:val="VerbatimChar"/>
-        </w:rPr>
-        <w:t xml:space="preserve">flag.method = "cumulative"</w:t>
+        <w:t xml:space="preserve">classification or count between cumulative and current flagging.</w:t>
+      </w:r>
+      <w:r>
+        <w:t xml:space="preserve"> </w:t>
+      </w:r>
+      <w:r>
+        <w:t xml:space="preserve">The remaining bars describe selected components of that aggregate, including</w:t>
+      </w:r>
+      <w:r>
+        <w:t xml:space="preserve"> </w:t>
+      </w:r>
+      <w:r>
+        <w:t xml:space="preserve">encounters with no encounter-level comorbidity but at least one cumulative</w:t>
+      </w:r>
+      <w:r>
+        <w:t xml:space="preserve"> </w:t>
+      </w:r>
+      <w:r>
+        <w:t xml:space="preserve">comorbidity, classification or severity differences with the same comorbidity</w:t>
+      </w:r>
+      <w:r>
+        <w:t xml:space="preserve"> </w:t>
+      </w:r>
+      <w:r>
+        <w:t xml:space="preserve">count, and differences involving additional comorbidities. Panel A uses subjects</w:t>
+      </w:r>
+      <w:r>
+        <w:t xml:space="preserve"> </w:t>
+      </w:r>
+      <w:r>
+        <w:t xml:space="preserve">with at least two encounters and at least one non-initial encounter with a</w:t>
+      </w:r>
+      <w:r>
+        <w:t xml:space="preserve"> </w:t>
+      </w:r>
+      <w:r>
+        <w:t xml:space="preserve">comorbidity flagged under flag.method =</w:t>
+      </w:r>
+      <w:r>
+        <w:t xml:space="preserve"> </w:t>
+      </w:r>
+      <w:r>
+        <w:t xml:space="preserve">“cumulative”</w:t>
+      </w:r>
+      <w:r>
+        <w:t xml:space="preserve"> </w:t>
+      </w:r>
+      <w:r>
+        <w:t xml:space="preserve">as the denominator. Panel B</w:t>
+      </w:r>
+      <w:r>
+        <w:t xml:space="preserve"> </w:t>
+      </w:r>
+      <w:r>
+        <w:t xml:space="preserve">uses non-initial encounters with at least one comorbidity flagged under</w:t>
+      </w:r>
+      <w:r>
+        <w:t xml:space="preserve"> </w:t>
+      </w:r>
+      <w:r>
+        <w:t xml:space="preserve">flag.method =</w:t>
+      </w:r>
+      <w:r>
+        <w:t xml:space="preserve"> </w:t>
+      </w:r>
+      <w:r>
+        <w:t xml:space="preserve">“cumulative”</w:t>
       </w:r>
       <w:r>
         <w:t xml:space="preserve"> </w:t>
@@ -12183,7 +11725,7 @@
         <w:t xml:space="preserve"> </w:t>
       </w:r>
       <w:r>
-        <w:t xml:space="preserve">illustrating the limited comorbidities method provided by the utility. The</w:t>
+        <w:t xml:space="preserve">because each comparator supports fewer methods. The</w:t>
       </w:r>
       <w:r>
         <w:t xml:space="preserve"> </w:t>
@@ -12195,7 +11737,7 @@
         <w:t xml:space="preserve"> </w:t>
       </w:r>
       <w:r>
-        <w:t xml:space="preserve">macOS Tahoe 26.5.1 with a Apple M5 Pro and 48.0 GB RAM.</w:t>
+        <w:t xml:space="preserve">macOS Tahoe 26.5.2 with an Apple M5 Pro and 48.0 GB RAM.</w:t>
       </w:r>
     </w:p>
     <w:p>
@@ -12332,7 +11874,7 @@
         <w:t xml:space="preserve"> </w:t>
       </w:r>
       <w:r>
-        <w:t xml:space="preserve">3.8 seconds across all four algorithms and flag methods.</w:t>
+        <w:t xml:space="preserve">3.5 seconds across all four algorithms and flag methods.</w:t>
       </w:r>
       <w:r>
         <w:t xml:space="preserve"> </w:t>
@@ -12354,13 +11896,13 @@
         <w:t xml:space="preserve"> </w:t>
       </w:r>
       <w:r>
-        <w:t xml:space="preserve">26.7 seconds for Elixhauser. The MIMIC-IV code panel shows a</w:t>
-      </w:r>
-      <w:r>
-        <w:t xml:space="preserve"> </w:t>
-      </w:r>
-      <w:r>
-        <w:t xml:space="preserve">single Charlson result at about 34.7 seconds. The</w:t>
+        <w:t xml:space="preserve">27 seconds for Elixhauser. The MIMIC-IV code panel shows a</w:t>
+      </w:r>
+      <w:r>
+        <w:t xml:space="preserve"> </w:t>
+      </w:r>
+      <w:r>
+        <w:t xml:space="preserve">single Charlson result at about 30.8 seconds. The</w:t>
       </w:r>
       <w:r>
         <w:t xml:space="preserve"> </w:t>
@@ -12382,7 +11924,7 @@
         <w:t xml:space="preserve"> </w:t>
       </w:r>
       <w:r>
-        <w:t xml:space="preserve">shows only PCCC version 2.0, with about 72 seconds for current</w:t>
+        <w:t xml:space="preserve">shows only PCCC version 2.0, with about 71.6 seconds for current</w:t>
       </w:r>
       <w:r>
         <w:t xml:space="preserve"> </w:t>
@@ -12394,7 +11936,7 @@
         <w:t xml:space="preserve"> </w:t>
       </w:r>
       <w:r>
-        <w:t xml:space="preserve">R version 4.6.1 (2026-06-24) on macOS Tahoe 26.5.1 with a Apple M5 Pro and</w:t>
+        <w:t xml:space="preserve">R version 4.6.1 (2026-06-24) on macOS Tahoe 26.5.2 with an Apple M5 Pro and</w:t>
       </w:r>
       <w:r>
         <w:t xml:space="preserve"> </w:t>

</xml_diff>

<commit_message>
update funding statement: no external funding
</commit_message>
<xml_diff>
--- a/medicalcoder-manuscript.docx
+++ b/medicalcoder-manuscript.docx
@@ -9466,47 +9466,13 @@
           <w:bCs/>
           <w:u w:val="single"/>
         </w:rPr>
-        <w:t xml:space="preserve">Data Availability Statement:</w:t>
-      </w:r>
-      <w:r>
-        <w:t xml:space="preserve"> </w:t>
-      </w:r>
-      <w:r>
-        <w:t xml:space="preserve">The</w:t>
-      </w:r>
-      <w:r>
-        <w:t xml:space="preserve"> </w:t>
-      </w:r>
-      <w:r>
-        <w:rPr>
-          <w:i/>
-          <w:iCs/>
-        </w:rPr>
-        <w:t xml:space="preserve">medicalcoder</w:t>
-      </w:r>
-      <w:r>
-        <w:t xml:space="preserve"> </w:t>
-      </w:r>
-      <w:r>
-        <w:t xml:space="preserve">R package is available from the Comprehensive R Archive Network</w:t>
-      </w:r>
-      <w:r>
-        <w:t xml:space="preserve"> </w:t>
-      </w:r>
-      <w:r>
-        <w:t xml:space="preserve">(CRAN) at https://cran.r-project.org/package=medicalcoder. Developmental</w:t>
-      </w:r>
-      <w:r>
-        <w:t xml:space="preserve"> </w:t>
-      </w:r>
-      <w:r>
-        <w:t xml:space="preserve">versions, additional testing suites, benchmarking, and examples are on GitHub at</w:t>
-      </w:r>
-      <w:r>
-        <w:t xml:space="preserve"> </w:t>
-      </w:r>
-      <w:r>
-        <w:t xml:space="preserve">https://github.com/dewittpe/medicalcoder/.</w:t>
+        <w:t xml:space="preserve">Funding:</w:t>
+      </w:r>
+      <w:r>
+        <w:t xml:space="preserve"> </w:t>
+      </w:r>
+      <w:r>
+        <w:t xml:space="preserve">None.</w:t>
       </w:r>
     </w:p>
     <w:p>
@@ -9514,13 +9480,52 @@
         <w:pStyle w:val="BodyText"/>
       </w:pPr>
       <w:r>
-        <w:t xml:space="preserve">The MIMIC-IV v3.1 data is available from PhysioNet at</w:t>
-      </w:r>
-      <w:r>
-        <w:t xml:space="preserve"> </w:t>
-      </w:r>
-      <w:r>
-        <w:t xml:space="preserve">https://physionet.org/content/mimiciv/3.1/.</w:t>
+        <w:rPr>
+          <w:b/>
+          <w:bCs/>
+          <w:u w:val="single"/>
+        </w:rPr>
+        <w:t xml:space="preserve">Data Availability Statement:</w:t>
+      </w:r>
+      <w:r>
+        <w:t xml:space="preserve"> </w:t>
+      </w:r>
+      <w:r>
+        <w:t xml:space="preserve">The</w:t>
+      </w:r>
+      <w:r>
+        <w:t xml:space="preserve"> </w:t>
+      </w:r>
+      <w:r>
+        <w:rPr>
+          <w:i/>
+          <w:iCs/>
+        </w:rPr>
+        <w:t xml:space="preserve">medicalcoder</w:t>
+      </w:r>
+      <w:r>
+        <w:t xml:space="preserve"> </w:t>
+      </w:r>
+      <w:r>
+        <w:t xml:space="preserve">R package is available from the Comprehensive R Archive Network</w:t>
+      </w:r>
+      <w:r>
+        <w:t xml:space="preserve"> </w:t>
+      </w:r>
+      <w:r>
+        <w:t xml:space="preserve">(CRAN) at https://cran.r-project.org/package=medicalcoder. Developmental</w:t>
+      </w:r>
+      <w:r>
+        <w:t xml:space="preserve"> </w:t>
+      </w:r>
+      <w:r>
+        <w:t xml:space="preserve">versions, additional testing suites, benchmarking, and examples are on GitHub at</w:t>
+      </w:r>
+      <w:r>
+        <w:t xml:space="preserve"> </w:t>
+      </w:r>
+      <w:r>
+        <w:t xml:space="preserve">https://github.com/dewittpe/medicalcoder/.</w:t>
       </w:r>
     </w:p>
     <w:p>
@@ -9528,31 +9533,13 @@
         <w:pStyle w:val="BodyText"/>
       </w:pPr>
       <w:r>
-        <w:t xml:space="preserve">This manuscript was written using Quarto version</w:t>
-      </w:r>
-      <w:r>
-        <w:t xml:space="preserve"> </w:t>
-      </w:r>
-      <w:r>
-        <w:t xml:space="preserve">1.9.38</w:t>
-      </w:r>
-      <w:r>
-        <w:t xml:space="preserve"> </w:t>
-      </w:r>
-      <w:r>
-        <w:t xml:space="preserve">(https://quarto.org/) and R version 4.6.1 (2026-06-24).</w:t>
-      </w:r>
-      <w:r>
-        <w:t xml:space="preserve"> </w:t>
-      </w:r>
-      <w:r>
-        <w:t xml:space="preserve">All R code, materials, and dependencies can be found at</w:t>
-      </w:r>
-      <w:r>
-        <w:t xml:space="preserve"> </w:t>
-      </w:r>
-      <w:r>
-        <w:t xml:space="preserve">https://github.com/dewittpe/medicalcoder-jamia-open/.</w:t>
+        <w:t xml:space="preserve">The MIMIC-IV v3.1 data is available from PhysioNet at</w:t>
+      </w:r>
+      <w:r>
+        <w:t xml:space="preserve"> </w:t>
+      </w:r>
+      <w:r>
+        <w:t xml:space="preserve">https://physionet.org/content/mimiciv/3.1/.</w:t>
       </w:r>
     </w:p>
     <w:p>
@@ -9560,6 +9547,38 @@
         <w:pStyle w:val="BodyText"/>
       </w:pPr>
       <w:r>
+        <w:t xml:space="preserve">This manuscript was written using Quarto version</w:t>
+      </w:r>
+      <w:r>
+        <w:t xml:space="preserve"> </w:t>
+      </w:r>
+      <w:r>
+        <w:t xml:space="preserve">1.9.38</w:t>
+      </w:r>
+      <w:r>
+        <w:t xml:space="preserve"> </w:t>
+      </w:r>
+      <w:r>
+        <w:t xml:space="preserve">(https://quarto.org/) and R version 4.6.1 (2026-06-24).</w:t>
+      </w:r>
+      <w:r>
+        <w:t xml:space="preserve"> </w:t>
+      </w:r>
+      <w:r>
+        <w:t xml:space="preserve">All R code, materials, and dependencies can be found at</w:t>
+      </w:r>
+      <w:r>
+        <w:t xml:space="preserve"> </w:t>
+      </w:r>
+      <w:r>
+        <w:t xml:space="preserve">https://github.com/dewittpe/medicalcoder-jamia-open/.</w:t>
+      </w:r>
+    </w:p>
+    <w:p>
+      <w:pPr>
+        <w:pStyle w:val="BodyText"/>
+      </w:pPr>
+      <w:r>
         <w:rPr>
           <w:b/>
           <w:bCs/>
@@ -9599,13 +9618,13 @@
         <w:t xml:space="preserve"> </w:t>
       </w:r>
       <w:r>
-        <w:t xml:space="preserve">design, and interpretation and provided important feedback. TDB provided</w:t>
-      </w:r>
-      <w:r>
-        <w:t xml:space="preserve"> </w:t>
-      </w:r>
-      <w:r>
-        <w:t xml:space="preserve">funding. All authors critically reviewed the manuscript for important</w:t>
+        <w:t xml:space="preserve">design, and interpretation and provided important feedback.</w:t>
+      </w:r>
+      <w:r>
+        <w:t xml:space="preserve"> </w:t>
+      </w:r>
+      <w:r>
+        <w:t xml:space="preserve">All authors critically reviewed the manuscript for important</w:t>
       </w:r>
       <w:r>
         <w:t xml:space="preserve"> </w:t>

</xml_diff>